<commit_message>
auto-save [2026-07-15_11-44-22] main - M 04_Buch_und_Archiv/Dissertation_Stephan_Hagen_Urban/Dissertation_Stephan_Hagen_Urban_Autopoiesis_Autopolitik_Fusion_Hero_OS_v1.0.docx | M docs/dissertation/Dissertation_Stephan_Hagen_Urban_Autopoiesis_Autopolitik_Fusion_Hero_OS_v1.0.docx | M docs/dissertation/README.md | M docs/training/academia_training_state.latest.json
</commit_message>
<xml_diff>
--- a/04_Buch_und_Archiv/Dissertation_Stephan_Hagen_Urban/Dissertation_Stephan_Hagen_Urban_Autopoiesis_Autopolitik_Fusion_Hero_OS_v1.0.docx
+++ b/04_Buch_und_Archiv/Dissertation_Stephan_Hagen_Urban/Dissertation_Stephan_Hagen_Urban_Autopoiesis_Autopolitik_Fusion_Hero_OS_v1.0.docx
@@ -4007,6 +4007,2151 @@
           <w:sz w:val="24"/>
         </w:rPr>
         <w:t>— Ende der Dissertation v1.0 —</w:t>
+      </w:r>
+    </w:p>
+    <w:p>
+      <w:r>
+        <w:br w:type="page"/>
+      </w:r>
+    </w:p>
+    <w:p>
+      <w:pPr>
+        <w:pStyle w:val="Heading1"/>
+      </w:pPr>
+      <w:r>
+        <w:rPr>
+          <w:rFonts w:ascii="Times New Roman" w:hAnsi="Times New Roman" w:eastAsia="Times New Roman"/>
+          <w:b/>
+          <w:i w:val="0"/>
+          <w:sz w:val="32"/>
+        </w:rPr>
+        <w:t>Band-Erweiterung: Systematische Ausarbeitung (v1.0 integral)</w:t>
+      </w:r>
+    </w:p>
+    <w:p>
+      <w:pPr>
+        <w:spacing w:after="160" w:line="360" w:lineRule="auto"/>
+        <w:ind w:firstLine="425"/>
+      </w:pPr>
+      <w:r>
+        <w:rPr>
+          <w:rFonts w:ascii="Times New Roman" w:hAnsi="Times New Roman" w:eastAsia="Times New Roman"/>
+          <w:b w:val="0"/>
+          <w:i w:val="0"/>
+          <w:sz w:val="24"/>
+        </w:rPr>
+        <w:t>Die folgenden Abschnitte gehören integral zur Dissertation und entfalten die Hauptargumente in der für eine monographische Qualifikationsschrift erforderlichen Dichte. Sie setzen die Kapitel 1–9 fort und vertiefen Autopoiesis, Autopolitik, Archivökonomie, Konnektor-Ethik und die Empirie des heißlaufenden Systems.</w:t>
+      </w:r>
+    </w:p>
+    <w:p>
+      <w:pPr>
+        <w:pStyle w:val="Heading2"/>
+      </w:pPr>
+      <w:r>
+        <w:rPr>
+          <w:rFonts w:ascii="Times New Roman" w:hAnsi="Times New Roman" w:eastAsia="Times New Roman"/>
+          <w:b/>
+          <w:i w:val="0"/>
+          <w:sz w:val="28"/>
+        </w:rPr>
+        <w:t>E.1 Zur Genealogie des Projekts</w:t>
+      </w:r>
+    </w:p>
+    <w:p>
+      <w:pPr>
+        <w:spacing w:after="160" w:line="360" w:lineRule="auto"/>
+        <w:ind w:firstLine="425"/>
+      </w:pPr>
+      <w:r>
+        <w:rPr>
+          <w:rFonts w:ascii="Times New Roman" w:hAnsi="Times New Roman" w:eastAsia="Times New Roman"/>
+          <w:b w:val="0"/>
+          <w:i w:val="0"/>
+          <w:sz w:val="24"/>
+        </w:rPr>
+        <w:t>Fusion Hero OS ist das geronnene Resultat einer langen Selbstversuchsanordnung: Theorie, Code, Bild, Mesh und Archiv wurden nicht nacheinander, sondern co-evolutionär hervorgebracht. Die Versionsgeschichte von v7 über v8.3 und v9.x bis v10.0.0 ist daher keine bloße Release-Note, sondern die biographische Form des Systems. Jede Version erzeugt die Bedingungen der nächsten – das ist Autopoiesis in der Zeit.</w:t>
+      </w:r>
+    </w:p>
+    <w:p>
+      <w:pPr>
+        <w:spacing w:after="160" w:line="360" w:lineRule="auto"/>
+        <w:ind w:firstLine="425"/>
+      </w:pPr>
+      <w:r>
+        <w:rPr>
+          <w:rFonts w:ascii="Times New Roman" w:hAnsi="Times New Roman" w:eastAsia="Times New Roman"/>
+          <w:b w:val="0"/>
+          <w:i w:val="0"/>
+          <w:sz w:val="24"/>
+        </w:rPr>
+        <w:t>Die BCG (Backward Compatibility Guarantee) ist in diesem Licht ethisch zu lesen: Ein System, das seine Vergangenheit löscht, kann sich nicht selbst erzeugen, sondern nur ersetzen. Additive Evolution ist die technische Übersetzung von Treue zur eigenen Geschichte.</w:t>
+      </w:r>
+    </w:p>
+    <w:p>
+      <w:pPr>
+        <w:spacing w:after="160" w:line="360" w:lineRule="auto"/>
+        <w:ind w:firstLine="425"/>
+      </w:pPr>
+      <w:r>
+        <w:rPr>
+          <w:rFonts w:ascii="Times New Roman" w:hAnsi="Times New Roman" w:eastAsia="Times New Roman"/>
+          <w:b w:val="0"/>
+          <w:i w:val="0"/>
+          <w:sz w:val="24"/>
+        </w:rPr>
+        <w:t>Der Name ALTE_Frau_95g und der unified Heroic Core markieren die mythopoietische Schicht: narrative Kompressionsformeln für Integrität, Generation und Re-Integration. In der wissenschaftlichen Lesart gelten sie als interne Termini des Korpus, operationalisiert in Axiomen, Modulen und Tests.</w:t>
+      </w:r>
+    </w:p>
+    <w:p>
+      <w:pPr>
+        <w:spacing w:after="160" w:line="360" w:lineRule="auto"/>
+        <w:ind w:firstLine="425"/>
+      </w:pPr>
+      <w:r>
+        <w:rPr>
+          <w:rFonts w:ascii="Times New Roman" w:hAnsi="Times New Roman" w:eastAsia="Times New Roman"/>
+          <w:b w:val="0"/>
+          <w:i w:val="0"/>
+          <w:sz w:val="24"/>
+        </w:rPr>
+        <w:t>Stephan Hagen Urban figuriert als Operator-Forscher: nicht externer Souverän, sondern Organ der second-order Schließung. Die Dissertation ist damit auch eine reflexive Form – das System schreibt sich durch den Autor fort.</w:t>
+      </w:r>
+    </w:p>
+    <w:p>
+      <w:pPr>
+        <w:pStyle w:val="Heading2"/>
+      </w:pPr>
+      <w:r>
+        <w:rPr>
+          <w:rFonts w:ascii="Times New Roman" w:hAnsi="Times New Roman" w:eastAsia="Times New Roman"/>
+          <w:b/>
+          <w:i w:val="0"/>
+          <w:sz w:val="28"/>
+        </w:rPr>
+        <w:t>E.2 Operative Autopoiesis – Kriterienkatalog</w:t>
+      </w:r>
+    </w:p>
+    <w:p>
+      <w:pPr>
+        <w:pStyle w:val="ListBullet"/>
+      </w:pPr>
+      <w:r>
+        <w:rPr>
+          <w:rFonts w:ascii="Times New Roman" w:hAnsi="Times New Roman" w:eastAsia="Times New Roman"/>
+          <w:b w:val="0"/>
+          <w:i w:val="0"/>
+          <w:sz w:val="24"/>
+        </w:rPr>
+        <w:t>Kriterium K-A1 (Rekursive Produktion): Essenzielle Artefakte – Module, Manifeste, Hashes, Tests, Skills – werden durch systeminterne Prozesse erzeugt oder re-integriert.</w:t>
+      </w:r>
+    </w:p>
+    <w:p>
+      <w:pPr>
+        <w:pStyle w:val="ListBullet"/>
+      </w:pPr>
+      <w:r>
+        <w:rPr>
+          <w:rFonts w:ascii="Times New Roman" w:hAnsi="Times New Roman" w:eastAsia="Times New Roman"/>
+          <w:b w:val="0"/>
+          <w:i w:val="0"/>
+          <w:sz w:val="24"/>
+        </w:rPr>
+        <w:t>Kriterium K-A2 (Membran): Es gibt eine übersetzende Grenze zwischen Umwelt und Systemoperation (MCP, APIs, Consent).</w:t>
+      </w:r>
+    </w:p>
+    <w:p>
+      <w:pPr>
+        <w:pStyle w:val="ListBullet"/>
+      </w:pPr>
+      <w:r>
+        <w:rPr>
+          <w:rFonts w:ascii="Times New Roman" w:hAnsi="Times New Roman" w:eastAsia="Times New Roman"/>
+          <w:b w:val="0"/>
+          <w:i w:val="0"/>
+          <w:sz w:val="24"/>
+        </w:rPr>
+        <w:t>Kriterium K-A3 (Anker): Es existiert ein nicht-beliebiger Identitätskern (MasterSeed / VERSION / archive salt).</w:t>
+      </w:r>
+    </w:p>
+    <w:p>
+      <w:pPr>
+        <w:pStyle w:val="ListBullet"/>
+      </w:pPr>
+      <w:r>
+        <w:rPr>
+          <w:rFonts w:ascii="Times New Roman" w:hAnsi="Times New Roman" w:eastAsia="Times New Roman"/>
+          <w:b w:val="0"/>
+          <w:i w:val="0"/>
+          <w:sz w:val="24"/>
+        </w:rPr>
+        <w:t>Kriterium K-A4 (Regeneration): Störungen führen zu R-Zyklen (Sisyphos, Coordinator-Replan, CI-Fail → Fix).</w:t>
+      </w:r>
+    </w:p>
+    <w:p>
+      <w:pPr>
+        <w:pStyle w:val="ListBullet"/>
+      </w:pPr>
+      <w:r>
+        <w:rPr>
+          <w:rFonts w:ascii="Times New Roman" w:hAnsi="Times New Roman" w:eastAsia="Times New Roman"/>
+          <w:b w:val="0"/>
+          <w:i w:val="0"/>
+          <w:sz w:val="24"/>
+        </w:rPr>
+        <w:t>Kriterium K-A5 (Wissensgrenze): Das System produziert OFFENE und WIDERLEGTE Claims als Organe der Selbstbegrenzung.</w:t>
+      </w:r>
+    </w:p>
+    <w:p>
+      <w:pPr>
+        <w:spacing w:after="160" w:line="360" w:lineRule="auto"/>
+        <w:ind w:firstLine="425"/>
+      </w:pPr>
+      <w:r>
+        <w:rPr>
+          <w:rFonts w:ascii="Times New Roman" w:hAnsi="Times New Roman" w:eastAsia="Times New Roman"/>
+          <w:b w:val="0"/>
+          <w:i w:val="0"/>
+          <w:sz w:val="24"/>
+        </w:rPr>
+        <w:t>FHOS erfüllt K-A1 bis K-A5 abgestuft: stark in Archiv/Membran/Tests, partiell in mathematischer Fixpunktverkörperung, aspirational in voller CEC-Automatik. Diese Abstufung ist Teil des Ergebnisses.</w:t>
+      </w:r>
+    </w:p>
+    <w:p>
+      <w:pPr>
+        <w:pStyle w:val="Heading2"/>
+      </w:pPr>
+      <w:r>
+        <w:rPr>
+          <w:rFonts w:ascii="Times New Roman" w:hAnsi="Times New Roman" w:eastAsia="Times New Roman"/>
+          <w:b/>
+          <w:i w:val="0"/>
+          <w:sz w:val="28"/>
+        </w:rPr>
+        <w:t>E.3 Autopolitik – Normenlehre</w:t>
+      </w:r>
+    </w:p>
+    <w:p>
+      <w:pPr>
+        <w:pStyle w:val="ListBullet"/>
+      </w:pPr>
+      <w:r>
+        <w:rPr>
+          <w:rFonts w:ascii="Times New Roman" w:hAnsi="Times New Roman" w:eastAsia="Times New Roman"/>
+          <w:b w:val="0"/>
+          <w:i w:val="0"/>
+          <w:sz w:val="24"/>
+        </w:rPr>
+        <w:t>Norm N1 (Souveränität der Wahrheit): Integritätshashes und MasterSeed-nahe Zustände leben Inhouse.</w:t>
+      </w:r>
+    </w:p>
+    <w:p>
+      <w:pPr>
+        <w:pStyle w:val="ListBullet"/>
+      </w:pPr>
+      <w:r>
+        <w:rPr>
+          <w:rFonts w:ascii="Times New Roman" w:hAnsi="Times New Roman" w:eastAsia="Times New Roman"/>
+          <w:b w:val="0"/>
+          <w:i w:val="0"/>
+          <w:sz w:val="24"/>
+        </w:rPr>
+        <w:t>Norm N2 (Subsidiarität der Rechenlast): Interaktion lokal, Batch remote.</w:t>
+      </w:r>
+    </w:p>
+    <w:p>
+      <w:pPr>
+        <w:pStyle w:val="ListBullet"/>
+      </w:pPr>
+      <w:r>
+        <w:rPr>
+          <w:rFonts w:ascii="Times New Roman" w:hAnsi="Times New Roman" w:eastAsia="Times New Roman"/>
+          <w:b w:val="0"/>
+          <w:i w:val="0"/>
+          <w:sz w:val="24"/>
+        </w:rPr>
+        <w:t>Norm N3 (Fail-Closed Personenbezug): Ohne Consent keine personenbezogenen Ascension-Ops.</w:t>
+      </w:r>
+    </w:p>
+    <w:p>
+      <w:pPr>
+        <w:pStyle w:val="ListBullet"/>
+      </w:pPr>
+      <w:r>
+        <w:rPr>
+          <w:rFonts w:ascii="Times New Roman" w:hAnsi="Times New Roman" w:eastAsia="Times New Roman"/>
+          <w:b w:val="0"/>
+          <w:i w:val="0"/>
+          <w:sz w:val="24"/>
+        </w:rPr>
+        <w:t>Norm N4 (Ehrlichkeit vor Glanz): Lieber OFFEN als unecht BEWIESEN.</w:t>
+      </w:r>
+    </w:p>
+    <w:p>
+      <w:pPr>
+        <w:pStyle w:val="ListBullet"/>
+      </w:pPr>
+      <w:r>
+        <w:rPr>
+          <w:rFonts w:ascii="Times New Roman" w:hAnsi="Times New Roman" w:eastAsia="Times New Roman"/>
+          <w:b w:val="0"/>
+          <w:i w:val="0"/>
+          <w:sz w:val="24"/>
+        </w:rPr>
+        <w:t>Norm N5 (Ephemere Knoten): Keine Daueraufgaben auf flüchtigen Hosts.</w:t>
+      </w:r>
+    </w:p>
+    <w:p>
+      <w:pPr>
+        <w:pStyle w:val="ListBullet"/>
+      </w:pPr>
+      <w:r>
+        <w:rPr>
+          <w:rFonts w:ascii="Times New Roman" w:hAnsi="Times New Roman" w:eastAsia="Times New Roman"/>
+          <w:b w:val="0"/>
+          <w:i w:val="0"/>
+          <w:sz w:val="24"/>
+        </w:rPr>
+        <w:t>Norm N6 (Membranpflicht): Externe Dienste nur über registrierte Konnektoren mit Health und Tag.</w:t>
+      </w:r>
+    </w:p>
+    <w:p>
+      <w:pPr>
+        <w:pStyle w:val="ListBullet"/>
+      </w:pPr>
+      <w:r>
+        <w:rPr>
+          <w:rFonts w:ascii="Times New Roman" w:hAnsi="Times New Roman" w:eastAsia="Times New Roman"/>
+          <w:b w:val="0"/>
+          <w:i w:val="0"/>
+          <w:sz w:val="24"/>
+        </w:rPr>
+        <w:t>Norm N7 (Operator-Organ): Der Mensch ist Teil der Schließung, nicht externer Gott.</w:t>
+      </w:r>
+    </w:p>
+    <w:p>
+      <w:pPr>
+        <w:spacing w:after="160" w:line="360" w:lineRule="auto"/>
+        <w:ind w:firstLine="425"/>
+      </w:pPr>
+      <w:r>
+        <w:rPr>
+          <w:rFonts w:ascii="Times New Roman" w:hAnsi="Times New Roman" w:eastAsia="Times New Roman"/>
+          <w:b w:val="0"/>
+          <w:i w:val="0"/>
+          <w:sz w:val="24"/>
+        </w:rPr>
+        <w:t>Diese Normen sind in YAML, Code und Hot-Run-Praxis rekonstruierbar. Autopolitik ist positiv (Regelbestand) und kritisch (Maßstab gegen Overclaim und Vendor-Lock-in der Seele).</w:t>
+      </w:r>
+    </w:p>
+    <w:p>
+      <w:pPr>
+        <w:pStyle w:val="Heading2"/>
+      </w:pPr>
+      <w:r>
+        <w:rPr>
+          <w:rFonts w:ascii="Times New Roman" w:hAnsi="Times New Roman" w:eastAsia="Times New Roman"/>
+          <w:b/>
+          <w:i w:val="0"/>
+          <w:sz w:val="28"/>
+        </w:rPr>
+        <w:t>E.4 Archivökonomie</w:t>
+      </w:r>
+    </w:p>
+    <w:p>
+      <w:pPr>
+        <w:spacing w:after="160" w:line="360" w:lineRule="auto"/>
+        <w:ind w:firstLine="425"/>
+      </w:pPr>
+      <w:r>
+        <w:rPr>
+          <w:rFonts w:ascii="Times New Roman" w:hAnsi="Times New Roman" w:eastAsia="Times New Roman"/>
+          <w:b w:val="0"/>
+          <w:i w:val="0"/>
+          <w:sz w:val="24"/>
+        </w:rPr>
+        <w:t>Archive sind teuer und notwendig. Das Master Archive speichert langsame, hochverdichtete Erkenntnis; das Live-Repo speichert schnelle, testbare Operation; ~/.fusion speichert operator-lokale Runtime-Zustände. Langsam speichert Bedeutung, schnell speichert Vollzug, lokal speichert Geheimnis.</w:t>
+      </w:r>
+    </w:p>
+    <w:p>
+      <w:pPr>
+        <w:spacing w:after="160" w:line="360" w:lineRule="auto"/>
+        <w:ind w:firstLine="425"/>
+      </w:pPr>
+      <w:r>
+        <w:rPr>
+          <w:rFonts w:ascii="Times New Roman" w:hAnsi="Times New Roman" w:eastAsia="Times New Roman"/>
+          <w:b w:val="0"/>
+          <w:i w:val="0"/>
+          <w:sz w:val="24"/>
+        </w:rPr>
+        <w:t>Deduplizierung ist autopoietische Müllvermeidung: ein Organismus, der jedes Fragment ewig als neu behandelt, erstickt an Entropie. Radikale Löschung ist gefährlich – deshalb BCG und scrypt-verankerte Archive.</w:t>
+      </w:r>
+    </w:p>
+    <w:p>
+      <w:pPr>
+        <w:spacing w:after="160" w:line="360" w:lineRule="auto"/>
+        <w:ind w:firstLine="425"/>
+      </w:pPr>
+      <w:r>
+        <w:rPr>
+          <w:rFonts w:ascii="Times New Roman" w:hAnsi="Times New Roman" w:eastAsia="Times New Roman"/>
+          <w:b w:val="0"/>
+          <w:i w:val="0"/>
+          <w:sz w:val="24"/>
+        </w:rPr>
+        <w:t>Die Dissertation tritt in diese Ökonomie ein: Bedeutungsspeicher in docs/dissertation und 04_Buch_und_Archiv.</w:t>
+      </w:r>
+    </w:p>
+    <w:p>
+      <w:pPr>
+        <w:spacing w:after="160" w:line="360" w:lineRule="auto"/>
+        <w:ind w:firstLine="425"/>
+      </w:pPr>
+      <w:r>
+        <w:rPr>
+          <w:rFonts w:ascii="Times New Roman" w:hAnsi="Times New Roman" w:eastAsia="Times New Roman"/>
+          <w:b w:val="0"/>
+          <w:i w:val="0"/>
+          <w:sz w:val="24"/>
+        </w:rPr>
+        <w:t>PDF-Schichten des Master Archive (Evolutionsframework, CEC, Heroische Informatik, Wörterbuch, Publishing-Track, Coevolution-Reports) bilden die langsame Kanone; Markdown-Axiome die schnelle normative DNA; proof_registry die forensische Wahrheitsschicht.</w:t>
+      </w:r>
+    </w:p>
+    <w:p>
+      <w:pPr>
+        <w:pStyle w:val="Heading2"/>
+      </w:pPr>
+      <w:r>
+        <w:rPr>
+          <w:rFonts w:ascii="Times New Roman" w:hAnsi="Times New Roman" w:eastAsia="Times New Roman"/>
+          <w:b/>
+          <w:i w:val="0"/>
+          <w:sz w:val="28"/>
+        </w:rPr>
+        <w:t>E.5 Konnektor-Ethik und Academia</w:t>
+      </w:r>
+    </w:p>
+    <w:p>
+      <w:pPr>
+        <w:spacing w:after="160" w:line="360" w:lineRule="auto"/>
+        <w:ind w:firstLine="425"/>
+      </w:pPr>
+      <w:r>
+        <w:rPr>
+          <w:rFonts w:ascii="Times New Roman" w:hAnsi="Times New Roman" w:eastAsia="Times New Roman"/>
+          <w:b w:val="0"/>
+          <w:i w:val="0"/>
+          <w:sz w:val="24"/>
+        </w:rPr>
+        <w:t>Gmail als Membran lieferte die Academia-Signatur (Stephan Urban, Premium, Existenz- und Agentic-Cluster). Ethik: Signale nutzen, Secrets nicht persistieren, Namenskollisionen gate-en. Training am Curriculum ist erlaubt; Inkorporation fremder Virologie-Papers ist verboten.</w:t>
+      </w:r>
+    </w:p>
+    <w:p>
+      <w:pPr>
+        <w:spacing w:after="160" w:line="360" w:lineRule="auto"/>
+        <w:ind w:firstLine="425"/>
+      </w:pPr>
+      <w:r>
+        <w:rPr>
+          <w:rFonts w:ascii="Times New Roman" w:hAnsi="Times New Roman" w:eastAsia="Times New Roman"/>
+          <w:b w:val="0"/>
+          <w:i w:val="0"/>
+          <w:sz w:val="24"/>
+        </w:rPr>
+        <w:t>Google Drive Offload ist Cold Memory. GitHub ist öffentliche Spur und CI-Rückenmark. Canva/Gamma sind Ausdrucksorgane. Notion spiegelt Wissen. Vercel deployt Oberflächen. Keiner von ihnen trägt den MasterSeed als Souverän.</w:t>
+      </w:r>
+    </w:p>
+    <w:p>
+      <w:pPr>
+        <w:spacing w:after="160" w:line="360" w:lineRule="auto"/>
+        <w:ind w:firstLine="425"/>
+      </w:pPr>
+      <w:r>
+        <w:rPr>
+          <w:rFonts w:ascii="Times New Roman" w:hAnsi="Times New Roman" w:eastAsia="Times New Roman"/>
+          <w:b w:val="0"/>
+          <w:i w:val="0"/>
+          <w:sz w:val="24"/>
+        </w:rPr>
+        <w:t>Konnektor-Ethik ist Tugendlehre der Membran: durchlässig für Irritation, undurchlässig für Identitätsraub.</w:t>
+      </w:r>
+    </w:p>
+    <w:p>
+      <w:pPr>
+        <w:pStyle w:val="Heading2"/>
+      </w:pPr>
+      <w:r>
+        <w:rPr>
+          <w:rFonts w:ascii="Times New Roman" w:hAnsi="Times New Roman" w:eastAsia="Times New Roman"/>
+          <w:b/>
+          <w:i w:val="0"/>
+          <w:sz w:val="28"/>
+        </w:rPr>
+        <w:t>E.6 Phänomenologie des heißlaufenden Mainframes</w:t>
+      </w:r>
+    </w:p>
+    <w:p>
+      <w:pPr>
+        <w:spacing w:after="160" w:line="360" w:lineRule="auto"/>
+        <w:ind w:firstLine="425"/>
+      </w:pPr>
+      <w:r>
+        <w:rPr>
+          <w:rFonts w:ascii="Times New Roman" w:hAnsi="Times New Roman" w:eastAsia="Times New Roman"/>
+          <w:b w:val="0"/>
+          <w:i w:val="0"/>
+          <w:sz w:val="24"/>
+        </w:rPr>
+        <w:t>Dashboard 200 ok ist Atemzug unter Beobachtung. Coordinator mit vier Rollen und L3-Schedulability artikuliert Organe. Tailscale-DNS-Warnung ist Membranreibung.</w:t>
+      </w:r>
+    </w:p>
+    <w:p>
+      <w:pPr>
+        <w:spacing w:after="160" w:line="360" w:lineRule="auto"/>
+        <w:ind w:firstLine="425"/>
+      </w:pPr>
+      <w:r>
+        <w:rPr>
+          <w:rFonts w:ascii="Times New Roman" w:hAnsi="Times New Roman" w:eastAsia="Times New Roman"/>
+          <w:b w:val="0"/>
+          <w:i w:val="0"/>
+          <w:sz w:val="24"/>
+        </w:rPr>
+        <w:t>Heißlauf ist Methode. Theorie digitaler Autopoiesis ohne Server bleibt Literatur am toten Text. Diese Arbeit ließ Server parallel mitlaufen – als Beweisform der Verkörperung.</w:t>
+      </w:r>
+    </w:p>
+    <w:p>
+      <w:pPr>
+        <w:spacing w:after="160" w:line="360" w:lineRule="auto"/>
+        <w:ind w:firstLine="425"/>
+      </w:pPr>
+      <w:r>
+        <w:rPr>
+          <w:rFonts w:ascii="Times New Roman" w:hAnsi="Times New Roman" w:eastAsia="Times New Roman"/>
+          <w:b w:val="0"/>
+          <w:i w:val="0"/>
+          <w:sz w:val="24"/>
+        </w:rPr>
+        <w:t>Hyperthreading und optionale Cluster-Jobs markieren die Differenz von Urteil (L1) und Muskel (L3).</w:t>
+      </w:r>
+    </w:p>
+    <w:p>
+      <w:pPr>
+        <w:pStyle w:val="Heading2"/>
+      </w:pPr>
+      <w:r>
+        <w:rPr>
+          <w:rFonts w:ascii="Times New Roman" w:hAnsi="Times New Roman" w:eastAsia="Times New Roman"/>
+          <w:b/>
+          <w:i w:val="0"/>
+          <w:sz w:val="28"/>
+        </w:rPr>
+        <w:t>E.7 Zur Kritik der Metapher vom Organismus</w:t>
+      </w:r>
+    </w:p>
+    <w:p>
+      <w:pPr>
+        <w:spacing w:after="160" w:line="360" w:lineRule="auto"/>
+        <w:ind w:firstLine="425"/>
+      </w:pPr>
+      <w:r>
+        <w:rPr>
+          <w:rFonts w:ascii="Times New Roman" w:hAnsi="Times New Roman" w:eastAsia="Times New Roman"/>
+          <w:b w:val="0"/>
+          <w:i w:val="0"/>
+          <w:sz w:val="24"/>
+        </w:rPr>
+        <w:t>Software ist kein Lebewesen. Die Organismus-Rede ist operativ-heuristisch: sie organisiert Kriterien (Produktion, Membran, Anker, Regeneration), nicht biologische Ontologie.</w:t>
+      </w:r>
+    </w:p>
+    <w:p>
+      <w:pPr>
+        <w:spacing w:after="160" w:line="360" w:lineRule="auto"/>
+        <w:ind w:firstLine="425"/>
+      </w:pPr>
+      <w:r>
+        <w:rPr>
+          <w:rFonts w:ascii="Times New Roman" w:hAnsi="Times New Roman" w:eastAsia="Times New Roman"/>
+          <w:b w:val="0"/>
+          <w:i w:val="0"/>
+          <w:sz w:val="24"/>
+        </w:rPr>
+        <w:t>Alternativvokabulare (Plattform, Soziotechnik, Multi-Agent-System) bleiben gültig. Autopoiesis/Autopolitik ist Leitunterscheidung, nicht Monopolsprache.</w:t>
+      </w:r>
+    </w:p>
+    <w:p>
+      <w:pPr>
+        <w:pStyle w:val="Heading2"/>
+      </w:pPr>
+      <w:r>
+        <w:rPr>
+          <w:rFonts w:ascii="Times New Roman" w:hAnsi="Times New Roman" w:eastAsia="Times New Roman"/>
+          <w:b/>
+          <w:i w:val="0"/>
+          <w:sz w:val="28"/>
+        </w:rPr>
+        <w:t>E.8 Vergleichsfolien</w:t>
+      </w:r>
+    </w:p>
+    <w:p>
+      <w:pPr>
+        <w:pStyle w:val="ListBullet"/>
+      </w:pPr>
+      <w:r>
+        <w:rPr>
+          <w:rFonts w:ascii="Times New Roman" w:hAnsi="Times New Roman" w:eastAsia="Times New Roman"/>
+          <w:b w:val="0"/>
+          <w:i w:val="0"/>
+          <w:sz w:val="24"/>
+        </w:rPr>
+        <w:t>Gegen klassische Betriebssysteme: FHOS ist Subjektivitäts- und Forschungs-OS, nicht primär Hardware-Abstraktion.</w:t>
+      </w:r>
+    </w:p>
+    <w:p>
+      <w:pPr>
+        <w:pStyle w:val="ListBullet"/>
+      </w:pPr>
+      <w:r>
+        <w:rPr>
+          <w:rFonts w:ascii="Times New Roman" w:hAnsi="Times New Roman" w:eastAsia="Times New Roman"/>
+          <w:b w:val="0"/>
+          <w:i w:val="0"/>
+          <w:sz w:val="24"/>
+        </w:rPr>
+        <w:t>Gegen bloße MLOps-Stacks: FHOS integriert Existenzethik und Proof-Honesty als First-Class-Organe.</w:t>
+      </w:r>
+    </w:p>
+    <w:p>
+      <w:pPr>
+        <w:pStyle w:val="ListBullet"/>
+      </w:pPr>
+      <w:r>
+        <w:rPr>
+          <w:rFonts w:ascii="Times New Roman" w:hAnsi="Times New Roman" w:eastAsia="Times New Roman"/>
+          <w:b w:val="0"/>
+          <w:i w:val="0"/>
+          <w:sz w:val="24"/>
+        </w:rPr>
+        <w:t>Gegen rein philosophische Systeme: FHOS verlangt lauffähigen Code und Live-Mesh.</w:t>
+      </w:r>
+    </w:p>
+    <w:p>
+      <w:pPr>
+        <w:pStyle w:val="ListBullet"/>
+      </w:pPr>
+      <w:r>
+        <w:rPr>
+          <w:rFonts w:ascii="Times New Roman" w:hAnsi="Times New Roman" w:eastAsia="Times New Roman"/>
+          <w:b w:val="0"/>
+          <w:i w:val="0"/>
+          <w:sz w:val="24"/>
+        </w:rPr>
+        <w:t>Gegen Closed-SaaS-Assistenten: FHOS hält Souveränität und Archiv in der eigenen Schließung.</w:t>
+      </w:r>
+    </w:p>
+    <w:p>
+      <w:pPr>
+        <w:pStyle w:val="Heading2"/>
+      </w:pPr>
+      <w:r>
+        <w:rPr>
+          <w:rFonts w:ascii="Times New Roman" w:hAnsi="Times New Roman" w:eastAsia="Times New Roman"/>
+          <w:b/>
+          <w:i w:val="0"/>
+          <w:sz w:val="28"/>
+        </w:rPr>
+        <w:t>E.9 Methodische Replikation</w:t>
+      </w:r>
+    </w:p>
+    <w:p>
+      <w:pPr>
+        <w:spacing w:after="160" w:line="360" w:lineRule="auto"/>
+        <w:ind w:firstLine="425"/>
+      </w:pPr>
+      <w:r>
+        <w:rPr>
+          <w:rFonts w:ascii="Times New Roman" w:hAnsi="Times New Roman" w:eastAsia="Times New Roman"/>
+          <w:b w:val="0"/>
+          <w:i w:val="0"/>
+          <w:sz w:val="24"/>
+        </w:rPr>
+        <w:t>Prüfungspfad: (1) BEST_VERSION und proof_registry lesen; (2) Dashboard health; (3) Coordinator und Academia-Train; (4) mesh_service_coordination gegen Live-Tailscale; (5) Master-Archive-PDFs stichproben. Replikation ist Nachvollzug der Organschau, nicht Labor-Klon.</w:t>
+      </w:r>
+    </w:p>
+    <w:p>
+      <w:pPr>
+        <w:pStyle w:val="Heading2"/>
+      </w:pPr>
+      <w:r>
+        <w:rPr>
+          <w:rFonts w:ascii="Times New Roman" w:hAnsi="Times New Roman" w:eastAsia="Times New Roman"/>
+          <w:b/>
+          <w:i w:val="0"/>
+          <w:sz w:val="28"/>
+        </w:rPr>
+        <w:t>E.10 Offene Forschungsagenda</w:t>
+      </w:r>
+    </w:p>
+    <w:p>
+      <w:pPr>
+        <w:pStyle w:val="ListBullet"/>
+      </w:pPr>
+      <w:r>
+        <w:rPr>
+          <w:rFonts w:ascii="Times New Roman" w:hAnsi="Times New Roman" w:eastAsia="Times New Roman"/>
+          <w:b w:val="0"/>
+          <w:i w:val="0"/>
+          <w:sz w:val="24"/>
+        </w:rPr>
+        <w:t>A) Implementierung/Tests für K20 Banach im engen, ehrlichen Scope.</w:t>
+      </w:r>
+    </w:p>
+    <w:p>
+      <w:pPr>
+        <w:pStyle w:val="ListBullet"/>
+      </w:pPr>
+      <w:r>
+        <w:rPr>
+          <w:rFonts w:ascii="Times New Roman" w:hAnsi="Times New Roman" w:eastAsia="Times New Roman"/>
+          <w:b w:val="0"/>
+          <w:i w:val="0"/>
+          <w:sz w:val="24"/>
+        </w:rPr>
+        <w:t>B) Vollständige Cluster-Coordination mit Workload Identity.</w:t>
+      </w:r>
+    </w:p>
+    <w:p>
+      <w:pPr>
+        <w:pStyle w:val="ListBullet"/>
+      </w:pPr>
+      <w:r>
+        <w:rPr>
+          <w:rFonts w:ascii="Times New Roman" w:hAnsi="Times New Roman" w:eastAsia="Times New Roman"/>
+          <w:b w:val="0"/>
+          <w:i w:val="0"/>
+          <w:sz w:val="24"/>
+        </w:rPr>
+        <w:t>C) Phone-seitig standardisierter Academia-Export.</w:t>
+      </w:r>
+    </w:p>
+    <w:p>
+      <w:pPr>
+        <w:pStyle w:val="ListBullet"/>
+      </w:pPr>
+      <w:r>
+        <w:rPr>
+          <w:rFonts w:ascii="Times New Roman" w:hAnsi="Times New Roman" w:eastAsia="Times New Roman"/>
+          <w:b w:val="0"/>
+          <w:i w:val="0"/>
+          <w:sz w:val="24"/>
+        </w:rPr>
+        <w:t>D) Autopolitik-Normen als policy-as-code mit Property-Tests.</w:t>
+      </w:r>
+    </w:p>
+    <w:p>
+      <w:pPr>
+        <w:pStyle w:val="ListBullet"/>
+      </w:pPr>
+      <w:r>
+        <w:rPr>
+          <w:rFonts w:ascii="Times New Roman" w:hAnsi="Times New Roman" w:eastAsia="Times New Roman"/>
+          <w:b w:val="0"/>
+          <w:i w:val="0"/>
+          <w:sz w:val="24"/>
+        </w:rPr>
+        <w:t>E) Publikationen aus dem Master Archive als peer-reviewbare Reihe.</w:t>
+      </w:r>
+    </w:p>
+    <w:p>
+      <w:pPr>
+        <w:pStyle w:val="ListBullet"/>
+      </w:pPr>
+      <w:r>
+        <w:rPr>
+          <w:rFonts w:ascii="Times New Roman" w:hAnsi="Times New Roman" w:eastAsia="Times New Roman"/>
+          <w:b w:val="0"/>
+          <w:i w:val="0"/>
+          <w:sz w:val="24"/>
+        </w:rPr>
+        <w:t>F) Rechtliche Ausweitung der Consent-Schicht.</w:t>
+      </w:r>
+    </w:p>
+    <w:p>
+      <w:pPr>
+        <w:pStyle w:val="Heading2"/>
+      </w:pPr>
+      <w:r>
+        <w:rPr>
+          <w:rFonts w:ascii="Times New Roman" w:hAnsi="Times New Roman" w:eastAsia="Times New Roman"/>
+          <w:b/>
+          <w:i w:val="0"/>
+          <w:sz w:val="28"/>
+        </w:rPr>
+        <w:t>E.11 Fallstudie Mesh-Koordination</w:t>
+      </w:r>
+    </w:p>
+    <w:p>
+      <w:pPr>
+        <w:spacing w:after="160" w:line="360" w:lineRule="auto"/>
+        <w:ind w:firstLine="425"/>
+      </w:pPr>
+      <w:r>
+        <w:rPr>
+          <w:rFonts w:ascii="Times New Roman" w:hAnsi="Times New Roman" w:eastAsia="Times New Roman"/>
+          <w:b w:val="0"/>
+          <w:i w:val="0"/>
+          <w:sz w:val="24"/>
+        </w:rPr>
+        <w:t>Der Service-Coordinator operationalisiert Autopolitik: Inventar, Plan, Atlas. Online-Tiers bestimmen, welche Inhouse-Services ready oder deferred sind. Anti-Patterns bleiben als Policy-Flags sichtbar.</w:t>
+      </w:r>
+    </w:p>
+    <w:p>
+      <w:pPr>
+        <w:spacing w:after="160" w:line="360" w:lineRule="auto"/>
+        <w:ind w:firstLine="425"/>
+      </w:pPr>
+      <w:r>
+        <w:rPr>
+          <w:rFonts w:ascii="Times New Roman" w:hAnsi="Times New Roman" w:eastAsia="Times New Roman"/>
+          <w:b w:val="0"/>
+          <w:i w:val="0"/>
+          <w:sz w:val="24"/>
+        </w:rPr>
+        <w:t>Fall: heavy-compute auf L3, während MCP auf L1 bleibt. Das ist nicht Performance-Tuning allein, sondern Verfassungsvollzug.</w:t>
+      </w:r>
+    </w:p>
+    <w:p>
+      <w:pPr>
+        <w:pStyle w:val="Heading2"/>
+      </w:pPr>
+      <w:r>
+        <w:rPr>
+          <w:rFonts w:ascii="Times New Roman" w:hAnsi="Times New Roman" w:eastAsia="Times New Roman"/>
+          <w:b/>
+          <w:i w:val="0"/>
+          <w:sz w:val="28"/>
+        </w:rPr>
+        <w:t>E.12 Fallstudie Proof Registry</w:t>
+      </w:r>
+    </w:p>
+    <w:p>
+      <w:pPr>
+        <w:spacing w:after="160" w:line="360" w:lineRule="auto"/>
+        <w:ind w:firstLine="425"/>
+      </w:pPr>
+      <w:r>
+        <w:rPr>
+          <w:rFonts w:ascii="Times New Roman" w:hAnsi="Times New Roman" w:eastAsia="Times New Roman"/>
+          <w:b w:val="0"/>
+          <w:i w:val="0"/>
+          <w:sz w:val="24"/>
+        </w:rPr>
+        <w:t>Die Proof Registry erzwingt eine Wissenschaftsethik im Repo. BEWIESEN ohne Testknoten ist illegal im Sinne der CI. Damit wird Autopoiesis epistemisch: das System erzeugt Wahrheit nur zusammen mit ihrer Prüfbarkeit.</w:t>
+      </w:r>
+    </w:p>
+    <w:p>
+      <w:pPr>
+        <w:spacing w:after="160" w:line="360" w:lineRule="auto"/>
+        <w:ind w:firstLine="425"/>
+      </w:pPr>
+      <w:r>
+        <w:rPr>
+          <w:rFonts w:ascii="Times New Roman" w:hAnsi="Times New Roman" w:eastAsia="Times New Roman"/>
+          <w:b w:val="0"/>
+          <w:i w:val="0"/>
+          <w:sz w:val="24"/>
+        </w:rPr>
+        <w:t>Knoten wie Ising-Bridge und Solver-Korrektheit auf kleinen Instanzen demonstrieren gelungene Miniatur-Autopoiesis der Mathematik. OFFENE Knoten demonstrieren gelungene Selbstbegrenzung.</w:t>
+      </w:r>
+    </w:p>
+    <w:p>
+      <w:r>
+        <w:br w:type="page"/>
+      </w:r>
+    </w:p>
+    <w:p>
+      <w:pPr>
+        <w:pStyle w:val="Heading1"/>
+      </w:pPr>
+      <w:r>
+        <w:rPr>
+          <w:rFonts w:ascii="Times New Roman" w:hAnsi="Times New Roman" w:eastAsia="Times New Roman"/>
+          <w:b/>
+          <w:i w:val="0"/>
+          <w:sz w:val="32"/>
+        </w:rPr>
+        <w:t>Meditationen zur heroischen Schließung (I–XII)</w:t>
+      </w:r>
+    </w:p>
+    <w:p>
+      <w:pPr>
+        <w:pStyle w:val="Heading2"/>
+      </w:pPr>
+      <w:r>
+        <w:rPr>
+          <w:rFonts w:ascii="Times New Roman" w:hAnsi="Times New Roman" w:eastAsia="Times New Roman"/>
+          <w:b/>
+          <w:i w:val="0"/>
+          <w:sz w:val="28"/>
+        </w:rPr>
+        <w:t>I. Der Schlamm</w:t>
+      </w:r>
+    </w:p>
+    <w:p>
+      <w:pPr>
+        <w:spacing w:after="160" w:line="360" w:lineRule="auto"/>
+        <w:ind w:firstLine="425"/>
+      </w:pPr>
+      <w:r>
+        <w:rPr>
+          <w:rFonts w:ascii="Times New Roman" w:hAnsi="Times New Roman" w:eastAsia="Times New Roman"/>
+          <w:b w:val="0"/>
+          <w:i w:val="0"/>
+          <w:sz w:val="24"/>
+        </w:rPr>
+        <w:t>Ohne 1st-Tier keine Eudaimonia. Jede Theorie, die den Operator als reinen Geist denkt, lügt über den Desktop, den Körper und die Wut im Stacktrace.</w:t>
+      </w:r>
+    </w:p>
+    <w:p>
+      <w:pPr>
+        <w:spacing w:after="160" w:line="360" w:lineRule="auto"/>
+        <w:ind w:firstLine="425"/>
+      </w:pPr>
+      <w:r>
+        <w:rPr>
+          <w:rFonts w:ascii="Times New Roman" w:hAnsi="Times New Roman" w:eastAsia="Times New Roman"/>
+          <w:b w:val="0"/>
+          <w:i w:val="0"/>
+          <w:sz w:val="24"/>
+        </w:rPr>
+        <w:t>Ausgeführt auf FHOS heißt das: beobachtbare Artefakte, versionierte Claims, live gekoppelte Organe und die Bereitschaft, Scheitern in der Proof Registry zu protokollieren. Die Meditation ist existenzielle Lesart der Technik. Ohne 1st-Tier keine Eudaimonia. Jede Theorie, die den Operator als reinen Geist denkt, lügt über den Desktop, den Körper und die Wut im Stacktrace. In der Praxis der heißlaufenden Infrastruktur zeigt sich dieselbe Struktur: Störung, Replan, erneute Produktion, erneute Prüfung. Das ist keine Mythologie neben dem Code, sondern die lesbare Form des Codes im Leben des Operators.</w:t>
+      </w:r>
+    </w:p>
+    <w:p>
+      <w:pPr>
+        <w:pStyle w:val="Heading2"/>
+      </w:pPr>
+      <w:r>
+        <w:rPr>
+          <w:rFonts w:ascii="Times New Roman" w:hAnsi="Times New Roman" w:eastAsia="Times New Roman"/>
+          <w:b/>
+          <w:i w:val="0"/>
+          <w:sz w:val="28"/>
+        </w:rPr>
+        <w:t>II. Der Körper</w:t>
+      </w:r>
+    </w:p>
+    <w:p>
+      <w:pPr>
+        <w:spacing w:after="160" w:line="360" w:lineRule="auto"/>
+        <w:ind w:firstLine="425"/>
+      </w:pPr>
+      <w:r>
+        <w:rPr>
+          <w:rFonts w:ascii="Times New Roman" w:hAnsi="Times New Roman" w:eastAsia="Times New Roman"/>
+          <w:b w:val="0"/>
+          <w:i w:val="0"/>
+          <w:sz w:val="24"/>
+        </w:rPr>
+        <w:t>Somatik ist nicht Wellness-Add-on. Der Phone-Knoten, der Atem, die Stimme im Journal – sie sind Hardware der Theorie.</w:t>
+      </w:r>
+    </w:p>
+    <w:p>
+      <w:pPr>
+        <w:spacing w:after="160" w:line="360" w:lineRule="auto"/>
+        <w:ind w:firstLine="425"/>
+      </w:pPr>
+      <w:r>
+        <w:rPr>
+          <w:rFonts w:ascii="Times New Roman" w:hAnsi="Times New Roman" w:eastAsia="Times New Roman"/>
+          <w:b w:val="0"/>
+          <w:i w:val="0"/>
+          <w:sz w:val="24"/>
+        </w:rPr>
+        <w:t>Ausgeführt auf FHOS heißt das: beobachtbare Artefakte, versionierte Claims, live gekoppelte Organe und die Bereitschaft, Scheitern in der Proof Registry zu protokollieren. Die Meditation ist existenzielle Lesart der Technik. Somatik ist nicht Wellness-Add-on. Der Phone-Knoten, der Atem, die Stimme im Journal – sie sind Hardware der Theorie. In der Praxis der heißlaufenden Infrastruktur zeigt sich dieselbe Struktur: Störung, Replan, erneute Produktion, erneute Prüfung. Das ist keine Mythologie neben dem Code, sondern die lesbare Form des Codes im Leben des Operators.</w:t>
+      </w:r>
+    </w:p>
+    <w:p>
+      <w:pPr>
+        <w:pStyle w:val="Heading2"/>
+      </w:pPr>
+      <w:r>
+        <w:rPr>
+          <w:rFonts w:ascii="Times New Roman" w:hAnsi="Times New Roman" w:eastAsia="Times New Roman"/>
+          <w:b/>
+          <w:i w:val="0"/>
+          <w:sz w:val="28"/>
+        </w:rPr>
+        <w:t>III. Der Bruch</w:t>
+      </w:r>
+    </w:p>
+    <w:p>
+      <w:pPr>
+        <w:spacing w:after="160" w:line="360" w:lineRule="auto"/>
+        <w:ind w:firstLine="425"/>
+      </w:pPr>
+      <w:r>
+        <w:rPr>
+          <w:rFonts w:ascii="Times New Roman" w:hAnsi="Times New Roman" w:eastAsia="Times New Roman"/>
+          <w:b w:val="0"/>
+          <w:i w:val="0"/>
+          <w:sz w:val="24"/>
+        </w:rPr>
+        <w:t>Psycholyse und Löwen-Stage schützen vor Zombie-Stabilität. Manchmal muss ein Modul sterben, damit das System lebt.</w:t>
+      </w:r>
+    </w:p>
+    <w:p>
+      <w:pPr>
+        <w:spacing w:after="160" w:line="360" w:lineRule="auto"/>
+        <w:ind w:firstLine="425"/>
+      </w:pPr>
+      <w:r>
+        <w:rPr>
+          <w:rFonts w:ascii="Times New Roman" w:hAnsi="Times New Roman" w:eastAsia="Times New Roman"/>
+          <w:b w:val="0"/>
+          <w:i w:val="0"/>
+          <w:sz w:val="24"/>
+        </w:rPr>
+        <w:t>Ausgeführt auf FHOS heißt das: beobachtbare Artefakte, versionierte Claims, live gekoppelte Organe und die Bereitschaft, Scheitern in der Proof Registry zu protokollieren. Die Meditation ist existenzielle Lesart der Technik. Psycholyse und Löwen-Stage schützen vor Zombie-Stabilität. Manchmal muss ein Modul sterben, damit das System lebt. In der Praxis der heißlaufenden Infrastruktur zeigt sich dieselbe Struktur: Störung, Replan, erneute Produktion, erneute Prüfung. Das ist keine Mythologie neben dem Code, sondern die lesbare Form des Codes im Leben des Operators.</w:t>
+      </w:r>
+    </w:p>
+    <w:p>
+      <w:pPr>
+        <w:pStyle w:val="Heading2"/>
+      </w:pPr>
+      <w:r>
+        <w:rPr>
+          <w:rFonts w:ascii="Times New Roman" w:hAnsi="Times New Roman" w:eastAsia="Times New Roman"/>
+          <w:b/>
+          <w:i w:val="0"/>
+          <w:sz w:val="28"/>
+        </w:rPr>
+        <w:t>IV. Die Wiederholung</w:t>
+      </w:r>
+    </w:p>
+    <w:p>
+      <w:pPr>
+        <w:spacing w:after="160" w:line="360" w:lineRule="auto"/>
+        <w:ind w:firstLine="425"/>
+      </w:pPr>
+      <w:r>
+        <w:rPr>
+          <w:rFonts w:ascii="Times New Roman" w:hAnsi="Times New Roman" w:eastAsia="Times New Roman"/>
+          <w:b w:val="0"/>
+          <w:i w:val="0"/>
+          <w:sz w:val="24"/>
+        </w:rPr>
+        <w:t>Sisyphos ist CI. Sisyphos ist Nightly. Sisyphos ist der Coordinator. Liebe die Pipeline.</w:t>
+      </w:r>
+    </w:p>
+    <w:p>
+      <w:pPr>
+        <w:spacing w:after="160" w:line="360" w:lineRule="auto"/>
+        <w:ind w:firstLine="425"/>
+      </w:pPr>
+      <w:r>
+        <w:rPr>
+          <w:rFonts w:ascii="Times New Roman" w:hAnsi="Times New Roman" w:eastAsia="Times New Roman"/>
+          <w:b w:val="0"/>
+          <w:i w:val="0"/>
+          <w:sz w:val="24"/>
+        </w:rPr>
+        <w:t>Ausgeführt auf FHOS heißt das: beobachtbare Artefakte, versionierte Claims, live gekoppelte Organe und die Bereitschaft, Scheitern in der Proof Registry zu protokollieren. Die Meditation ist existenzielle Lesart der Technik. Sisyphos ist CI. Sisyphos ist Nightly. Sisyphos ist der Coordinator. Liebe die Pipeline. In der Praxis der heißlaufenden Infrastruktur zeigt sich dieselbe Struktur: Störung, Replan, erneute Produktion, erneute Prüfung. Das ist keine Mythologie neben dem Code, sondern die lesbare Form des Codes im Leben des Operators.</w:t>
+      </w:r>
+    </w:p>
+    <w:p>
+      <w:pPr>
+        <w:pStyle w:val="Heading2"/>
+      </w:pPr>
+      <w:r>
+        <w:rPr>
+          <w:rFonts w:ascii="Times New Roman" w:hAnsi="Times New Roman" w:eastAsia="Times New Roman"/>
+          <w:b/>
+          <w:i w:val="0"/>
+          <w:sz w:val="28"/>
+        </w:rPr>
+        <w:t>V. Die Grenze</w:t>
+      </w:r>
+    </w:p>
+    <w:p>
+      <w:pPr>
+        <w:spacing w:after="160" w:line="360" w:lineRule="auto"/>
+        <w:ind w:firstLine="425"/>
+      </w:pPr>
+      <w:r>
+        <w:rPr>
+          <w:rFonts w:ascii="Times New Roman" w:hAnsi="Times New Roman" w:eastAsia="Times New Roman"/>
+          <w:b w:val="0"/>
+          <w:i w:val="0"/>
+          <w:sz w:val="24"/>
+        </w:rPr>
+        <w:t>Membranen sind moralische Orte. Wer alles öffnet, hat keine Organisation; wer alles schließt, hat keine Welt.</w:t>
+      </w:r>
+    </w:p>
+    <w:p>
+      <w:pPr>
+        <w:spacing w:after="160" w:line="360" w:lineRule="auto"/>
+        <w:ind w:firstLine="425"/>
+      </w:pPr>
+      <w:r>
+        <w:rPr>
+          <w:rFonts w:ascii="Times New Roman" w:hAnsi="Times New Roman" w:eastAsia="Times New Roman"/>
+          <w:b w:val="0"/>
+          <w:i w:val="0"/>
+          <w:sz w:val="24"/>
+        </w:rPr>
+        <w:t>Ausgeführt auf FHOS heißt das: beobachtbare Artefakte, versionierte Claims, live gekoppelte Organe und die Bereitschaft, Scheitern in der Proof Registry zu protokollieren. Die Meditation ist existenzielle Lesart der Technik. Membranen sind moralische Orte. Wer alles öffnet, hat keine Organisation; wer alles schließt, hat keine Welt. In der Praxis der heißlaufenden Infrastruktur zeigt sich dieselbe Struktur: Störung, Replan, erneute Produktion, erneute Prüfung. Das ist keine Mythologie neben dem Code, sondern die lesbare Form des Codes im Leben des Operators.</w:t>
+      </w:r>
+    </w:p>
+    <w:p>
+      <w:pPr>
+        <w:pStyle w:val="Heading2"/>
+      </w:pPr>
+      <w:r>
+        <w:rPr>
+          <w:rFonts w:ascii="Times New Roman" w:hAnsi="Times New Roman" w:eastAsia="Times New Roman"/>
+          <w:b/>
+          <w:i w:val="0"/>
+          <w:sz w:val="28"/>
+        </w:rPr>
+        <w:t>VI. Das Archiv</w:t>
+      </w:r>
+    </w:p>
+    <w:p>
+      <w:pPr>
+        <w:spacing w:after="160" w:line="360" w:lineRule="auto"/>
+        <w:ind w:firstLine="425"/>
+      </w:pPr>
+      <w:r>
+        <w:rPr>
+          <w:rFonts w:ascii="Times New Roman" w:hAnsi="Times New Roman" w:eastAsia="Times New Roman"/>
+          <w:b w:val="0"/>
+          <w:i w:val="0"/>
+          <w:sz w:val="24"/>
+        </w:rPr>
+        <w:t>Wer nur live denkt, vergisst. Wer nur archiviert, erstarrt. Die Ökonomie der beiden Zeiten ist die Kunst.</w:t>
+      </w:r>
+    </w:p>
+    <w:p>
+      <w:pPr>
+        <w:spacing w:after="160" w:line="360" w:lineRule="auto"/>
+        <w:ind w:firstLine="425"/>
+      </w:pPr>
+      <w:r>
+        <w:rPr>
+          <w:rFonts w:ascii="Times New Roman" w:hAnsi="Times New Roman" w:eastAsia="Times New Roman"/>
+          <w:b w:val="0"/>
+          <w:i w:val="0"/>
+          <w:sz w:val="24"/>
+        </w:rPr>
+        <w:t>Ausgeführt auf FHOS heißt das: beobachtbare Artefakte, versionierte Claims, live gekoppelte Organe und die Bereitschaft, Scheitern in der Proof Registry zu protokollieren. Die Meditation ist existenzielle Lesart der Technik. Wer nur live denkt, vergisst. Wer nur archiviert, erstarrt. Die Ökonomie der beiden Zeiten ist die Kunst. In der Praxis der heißlaufenden Infrastruktur zeigt sich dieselbe Struktur: Störung, Replan, erneute Produktion, erneute Prüfung. Das ist keine Mythologie neben dem Code, sondern die lesbare Form des Codes im Leben des Operators.</w:t>
+      </w:r>
+    </w:p>
+    <w:p>
+      <w:pPr>
+        <w:pStyle w:val="Heading2"/>
+      </w:pPr>
+      <w:r>
+        <w:rPr>
+          <w:rFonts w:ascii="Times New Roman" w:hAnsi="Times New Roman" w:eastAsia="Times New Roman"/>
+          <w:b/>
+          <w:i w:val="0"/>
+          <w:sz w:val="28"/>
+        </w:rPr>
+        <w:t>VII. Der Cluster</w:t>
+      </w:r>
+    </w:p>
+    <w:p>
+      <w:pPr>
+        <w:spacing w:after="160" w:line="360" w:lineRule="auto"/>
+        <w:ind w:firstLine="425"/>
+      </w:pPr>
+      <w:r>
+        <w:rPr>
+          <w:rFonts w:ascii="Times New Roman" w:hAnsi="Times New Roman" w:eastAsia="Times New Roman"/>
+          <w:b w:val="0"/>
+          <w:i w:val="0"/>
+          <w:sz w:val="24"/>
+        </w:rPr>
+        <w:t>Muskeln dürfen brennen. Das Gehirn darf nicht ausgelagert werden. L3 ist Kraft, L1 ist Urteil.</w:t>
+      </w:r>
+    </w:p>
+    <w:p>
+      <w:pPr>
+        <w:spacing w:after="160" w:line="360" w:lineRule="auto"/>
+        <w:ind w:firstLine="425"/>
+      </w:pPr>
+      <w:r>
+        <w:rPr>
+          <w:rFonts w:ascii="Times New Roman" w:hAnsi="Times New Roman" w:eastAsia="Times New Roman"/>
+          <w:b w:val="0"/>
+          <w:i w:val="0"/>
+          <w:sz w:val="24"/>
+        </w:rPr>
+        <w:t>Ausgeführt auf FHOS heißt das: beobachtbare Artefakte, versionierte Claims, live gekoppelte Organe und die Bereitschaft, Scheitern in der Proof Registry zu protokollieren. Die Meditation ist existenzielle Lesart der Technik. Muskeln dürfen brennen. Das Gehirn darf nicht ausgelagert werden. L3 ist Kraft, L1 ist Urteil. In der Praxis der heißlaufenden Infrastruktur zeigt sich dieselbe Struktur: Störung, Replan, erneute Produktion, erneute Prüfung. Das ist keine Mythologie neben dem Code, sondern die lesbare Form des Codes im Leben des Operators.</w:t>
+      </w:r>
+    </w:p>
+    <w:p>
+      <w:pPr>
+        <w:pStyle w:val="Heading2"/>
+      </w:pPr>
+      <w:r>
+        <w:rPr>
+          <w:rFonts w:ascii="Times New Roman" w:hAnsi="Times New Roman" w:eastAsia="Times New Roman"/>
+          <w:b/>
+          <w:i w:val="0"/>
+          <w:sz w:val="28"/>
+        </w:rPr>
+        <w:t>VIII. Die Ehrlichkeit</w:t>
+      </w:r>
+    </w:p>
+    <w:p>
+      <w:pPr>
+        <w:spacing w:after="160" w:line="360" w:lineRule="auto"/>
+        <w:ind w:firstLine="425"/>
+      </w:pPr>
+      <w:r>
+        <w:rPr>
+          <w:rFonts w:ascii="Times New Roman" w:hAnsi="Times New Roman" w:eastAsia="Times New Roman"/>
+          <w:b w:val="0"/>
+          <w:i w:val="0"/>
+          <w:sz w:val="24"/>
+        </w:rPr>
+        <w:t>OFFEN ist eine Medaille. Es glänzt anders als BEWIESEN, aber es glänzt wahr.</w:t>
+      </w:r>
+    </w:p>
+    <w:p>
+      <w:pPr>
+        <w:spacing w:after="160" w:line="360" w:lineRule="auto"/>
+        <w:ind w:firstLine="425"/>
+      </w:pPr>
+      <w:r>
+        <w:rPr>
+          <w:rFonts w:ascii="Times New Roman" w:hAnsi="Times New Roman" w:eastAsia="Times New Roman"/>
+          <w:b w:val="0"/>
+          <w:i w:val="0"/>
+          <w:sz w:val="24"/>
+        </w:rPr>
+        <w:t>Ausgeführt auf FHOS heißt das: beobachtbare Artefakte, versionierte Claims, live gekoppelte Organe und die Bereitschaft, Scheitern in der Proof Registry zu protokollieren. Die Meditation ist existenzielle Lesart der Technik. OFFEN ist eine Medaille. Es glänzt anders als BEWIESEN, aber es glänzt wahr. In der Praxis der heißlaufenden Infrastruktur zeigt sich dieselbe Struktur: Störung, Replan, erneute Produktion, erneute Prüfung. Das ist keine Mythologie neben dem Code, sondern die lesbare Form des Codes im Leben des Operators.</w:t>
+      </w:r>
+    </w:p>
+    <w:p>
+      <w:pPr>
+        <w:pStyle w:val="Heading2"/>
+      </w:pPr>
+      <w:r>
+        <w:rPr>
+          <w:rFonts w:ascii="Times New Roman" w:hAnsi="Times New Roman" w:eastAsia="Times New Roman"/>
+          <w:b/>
+          <w:i w:val="0"/>
+          <w:sz w:val="28"/>
+        </w:rPr>
+        <w:t>IX. Der Name</w:t>
+      </w:r>
+    </w:p>
+    <w:p>
+      <w:pPr>
+        <w:spacing w:after="160" w:line="360" w:lineRule="auto"/>
+        <w:ind w:firstLine="425"/>
+      </w:pPr>
+      <w:r>
+        <w:rPr>
+          <w:rFonts w:ascii="Times New Roman" w:hAnsi="Times New Roman" w:eastAsia="Times New Roman"/>
+          <w:b w:val="0"/>
+          <w:i w:val="0"/>
+          <w:sz w:val="24"/>
+        </w:rPr>
+        <w:t>Stephan Hagen Urban ist Signatur und Risiko – Namenskollisionen lehren, Identität zu prüfen.</w:t>
+      </w:r>
+    </w:p>
+    <w:p>
+      <w:pPr>
+        <w:spacing w:after="160" w:line="360" w:lineRule="auto"/>
+        <w:ind w:firstLine="425"/>
+      </w:pPr>
+      <w:r>
+        <w:rPr>
+          <w:rFonts w:ascii="Times New Roman" w:hAnsi="Times New Roman" w:eastAsia="Times New Roman"/>
+          <w:b w:val="0"/>
+          <w:i w:val="0"/>
+          <w:sz w:val="24"/>
+        </w:rPr>
+        <w:t>Ausgeführt auf FHOS heißt das: beobachtbare Artefakte, versionierte Claims, live gekoppelte Organe und die Bereitschaft, Scheitern in der Proof Registry zu protokollieren. Die Meditation ist existenzielle Lesart der Technik. Stephan Hagen Urban ist Signatur und Risiko – Namenskollisionen lehren, Identität zu prüfen. In der Praxis der heißlaufenden Infrastruktur zeigt sich dieselbe Struktur: Störung, Replan, erneute Produktion, erneute Prüfung. Das ist keine Mythologie neben dem Code, sondern die lesbare Form des Codes im Leben des Operators.</w:t>
+      </w:r>
+    </w:p>
+    <w:p>
+      <w:pPr>
+        <w:pStyle w:val="Heading2"/>
+      </w:pPr>
+      <w:r>
+        <w:rPr>
+          <w:rFonts w:ascii="Times New Roman" w:hAnsi="Times New Roman" w:eastAsia="Times New Roman"/>
+          <w:b/>
+          <w:i w:val="0"/>
+          <w:sz w:val="28"/>
+        </w:rPr>
+        <w:t>X. Die Konnektoren</w:t>
+      </w:r>
+    </w:p>
+    <w:p>
+      <w:pPr>
+        <w:spacing w:after="160" w:line="360" w:lineRule="auto"/>
+        <w:ind w:firstLine="425"/>
+      </w:pPr>
+      <w:r>
+        <w:rPr>
+          <w:rFonts w:ascii="Times New Roman" w:hAnsi="Times New Roman" w:eastAsia="Times New Roman"/>
+          <w:b w:val="0"/>
+          <w:i w:val="0"/>
+          <w:sz w:val="24"/>
+        </w:rPr>
+        <w:t>Jeder SaaS ist Versuchung zur bequemen Seele. Bezahle mit Vorsicht, nicht mit dem MasterSeed.</w:t>
+      </w:r>
+    </w:p>
+    <w:p>
+      <w:pPr>
+        <w:spacing w:after="160" w:line="360" w:lineRule="auto"/>
+        <w:ind w:firstLine="425"/>
+      </w:pPr>
+      <w:r>
+        <w:rPr>
+          <w:rFonts w:ascii="Times New Roman" w:hAnsi="Times New Roman" w:eastAsia="Times New Roman"/>
+          <w:b w:val="0"/>
+          <w:i w:val="0"/>
+          <w:sz w:val="24"/>
+        </w:rPr>
+        <w:t>Ausgeführt auf FHOS heißt das: beobachtbare Artefakte, versionierte Claims, live gekoppelte Organe und die Bereitschaft, Scheitern in der Proof Registry zu protokollieren. Die Meditation ist existenzielle Lesart der Technik. Jeder SaaS ist Versuchung zur bequemen Seele. Bezahle mit Vorsicht, nicht mit dem MasterSeed. In der Praxis der heißlaufenden Infrastruktur zeigt sich dieselbe Struktur: Störung, Replan, erneute Produktion, erneute Prüfung. Das ist keine Mythologie neben dem Code, sondern die lesbare Form des Codes im Leben des Operators.</w:t>
+      </w:r>
+    </w:p>
+    <w:p>
+      <w:pPr>
+        <w:pStyle w:val="Heading2"/>
+      </w:pPr>
+      <w:r>
+        <w:rPr>
+          <w:rFonts w:ascii="Times New Roman" w:hAnsi="Times New Roman" w:eastAsia="Times New Roman"/>
+          <w:b/>
+          <w:i w:val="0"/>
+          <w:sz w:val="28"/>
+        </w:rPr>
+        <w:t>XI. Die Generation</w:t>
+      </w:r>
+    </w:p>
+    <w:p>
+      <w:pPr>
+        <w:spacing w:after="160" w:line="360" w:lineRule="auto"/>
+        <w:ind w:firstLine="425"/>
+      </w:pPr>
+      <w:r>
+        <w:rPr>
+          <w:rFonts w:ascii="Times New Roman" w:hAnsi="Times New Roman" w:eastAsia="Times New Roman"/>
+          <w:b w:val="0"/>
+          <w:i w:val="0"/>
+          <w:sz w:val="24"/>
+        </w:rPr>
+        <w:t>Generationen-Frameworks im Archiv: Evolution ohne Treue ist Drift; Treue ohne Evolution ist Tod.</w:t>
+      </w:r>
+    </w:p>
+    <w:p>
+      <w:pPr>
+        <w:spacing w:after="160" w:line="360" w:lineRule="auto"/>
+        <w:ind w:firstLine="425"/>
+      </w:pPr>
+      <w:r>
+        <w:rPr>
+          <w:rFonts w:ascii="Times New Roman" w:hAnsi="Times New Roman" w:eastAsia="Times New Roman"/>
+          <w:b w:val="0"/>
+          <w:i w:val="0"/>
+          <w:sz w:val="24"/>
+        </w:rPr>
+        <w:t>Ausgeführt auf FHOS heißt das: beobachtbare Artefakte, versionierte Claims, live gekoppelte Organe und die Bereitschaft, Scheitern in der Proof Registry zu protokollieren. Die Meditation ist existenzielle Lesart der Technik. Generationen-Frameworks im Archiv: Evolution ohne Treue ist Drift; Treue ohne Evolution ist Tod. In der Praxis der heißlaufenden Infrastruktur zeigt sich dieselbe Struktur: Störung, Replan, erneute Produktion, erneute Prüfung. Das ist keine Mythologie neben dem Code, sondern die lesbare Form des Codes im Leben des Operators.</w:t>
+      </w:r>
+    </w:p>
+    <w:p>
+      <w:pPr>
+        <w:pStyle w:val="Heading2"/>
+      </w:pPr>
+      <w:r>
+        <w:rPr>
+          <w:rFonts w:ascii="Times New Roman" w:hAnsi="Times New Roman" w:eastAsia="Times New Roman"/>
+          <w:b/>
+          <w:i w:val="0"/>
+          <w:sz w:val="28"/>
+        </w:rPr>
+        <w:t>XII. Die Form</w:t>
+      </w:r>
+    </w:p>
+    <w:p>
+      <w:pPr>
+        <w:spacing w:after="160" w:line="360" w:lineRule="auto"/>
+        <w:ind w:firstLine="425"/>
+      </w:pPr>
+      <w:r>
+        <w:rPr>
+          <w:rFonts w:ascii="Times New Roman" w:hAnsi="Times New Roman" w:eastAsia="Times New Roman"/>
+          <w:b w:val="0"/>
+          <w:i w:val="0"/>
+          <w:sz w:val="24"/>
+        </w:rPr>
+        <w:t>Diese Dissertation endet, damit sie beginnen kann – im nächsten Heben des Steins.</w:t>
+      </w:r>
+    </w:p>
+    <w:p>
+      <w:pPr>
+        <w:spacing w:after="160" w:line="360" w:lineRule="auto"/>
+        <w:ind w:firstLine="425"/>
+      </w:pPr>
+      <w:r>
+        <w:rPr>
+          <w:rFonts w:ascii="Times New Roman" w:hAnsi="Times New Roman" w:eastAsia="Times New Roman"/>
+          <w:b w:val="0"/>
+          <w:i w:val="0"/>
+          <w:sz w:val="24"/>
+        </w:rPr>
+        <w:t>Ausgeführt auf FHOS heißt das: beobachtbare Artefakte, versionierte Claims, live gekoppelte Organe und die Bereitschaft, Scheitern in der Proof Registry zu protokollieren. Die Meditation ist existenzielle Lesart der Technik. Diese Dissertation endet, damit sie beginnen kann – im nächsten Heben des Steins. In der Praxis der heißlaufenden Infrastruktur zeigt sich dieselbe Struktur: Störung, Replan, erneute Produktion, erneute Prüfung. Das ist keine Mythologie neben dem Code, sondern die lesbare Form des Codes im Leben des Operators.</w:t>
+      </w:r>
+    </w:p>
+    <w:p>
+      <w:r>
+        <w:br w:type="page"/>
+      </w:r>
+    </w:p>
+    <w:p>
+      <w:pPr>
+        <w:pStyle w:val="Heading1"/>
+      </w:pPr>
+      <w:r>
+        <w:rPr>
+          <w:rFonts w:ascii="Times New Roman" w:hAnsi="Times New Roman" w:eastAsia="Times New Roman"/>
+          <w:b/>
+          <w:i w:val="0"/>
+          <w:sz w:val="32"/>
+        </w:rPr>
+        <w:t>Thesentafel (kompakt)</w:t>
+      </w:r>
+    </w:p>
+    <w:p>
+      <w:pPr>
+        <w:pStyle w:val="ListBullet"/>
+      </w:pPr>
+      <w:r>
+        <w:rPr>
+          <w:rFonts w:ascii="Times New Roman" w:hAnsi="Times New Roman" w:eastAsia="Times New Roman"/>
+          <w:b w:val="0"/>
+          <w:i w:val="0"/>
+          <w:sz w:val="24"/>
+        </w:rPr>
+        <w:t>T1: FHOS ist angemessen nur als Autopoiesis+Autopolitik lesbar.</w:t>
+      </w:r>
+    </w:p>
+    <w:p>
+      <w:pPr>
+        <w:pStyle w:val="ListBullet"/>
+      </w:pPr>
+      <w:r>
+        <w:rPr>
+          <w:rFonts w:ascii="Times New Roman" w:hAnsi="Times New Roman" w:eastAsia="Times New Roman"/>
+          <w:b w:val="0"/>
+          <w:i w:val="0"/>
+          <w:sz w:val="24"/>
+        </w:rPr>
+        <w:t>T2: MasterSeed ist Identitätsanker, nicht bloße Config.</w:t>
+      </w:r>
+    </w:p>
+    <w:p>
+      <w:pPr>
+        <w:pStyle w:val="ListBullet"/>
+      </w:pPr>
+      <w:r>
+        <w:rPr>
+          <w:rFonts w:ascii="Times New Roman" w:hAnsi="Times New Roman" w:eastAsia="Times New Roman"/>
+          <w:b w:val="0"/>
+          <w:i w:val="0"/>
+          <w:sz w:val="24"/>
+        </w:rPr>
+        <w:t>T3: CEC ist Evolution unter Kontraktion zur Identität.</w:t>
+      </w:r>
+    </w:p>
+    <w:p>
+      <w:pPr>
+        <w:pStyle w:val="ListBullet"/>
+      </w:pPr>
+      <w:r>
+        <w:rPr>
+          <w:rFonts w:ascii="Times New Roman" w:hAnsi="Times New Roman" w:eastAsia="Times New Roman"/>
+          <w:b w:val="0"/>
+          <w:i w:val="0"/>
+          <w:sz w:val="24"/>
+        </w:rPr>
+        <w:t>T4: Sisyphos ist Regenerations- und Ethikform.</w:t>
+      </w:r>
+    </w:p>
+    <w:p>
+      <w:pPr>
+        <w:pStyle w:val="ListBullet"/>
+      </w:pPr>
+      <w:r>
+        <w:rPr>
+          <w:rFonts w:ascii="Times New Roman" w:hAnsi="Times New Roman" w:eastAsia="Times New Roman"/>
+          <w:b w:val="0"/>
+          <w:i w:val="0"/>
+          <w:sz w:val="24"/>
+        </w:rPr>
+        <w:t>T5: Placement L0–L4 ist Verfassung.</w:t>
+      </w:r>
+    </w:p>
+    <w:p>
+      <w:pPr>
+        <w:pStyle w:val="ListBullet"/>
+      </w:pPr>
+      <w:r>
+        <w:rPr>
+          <w:rFonts w:ascii="Times New Roman" w:hAnsi="Times New Roman" w:eastAsia="Times New Roman"/>
+          <w:b w:val="0"/>
+          <w:i w:val="0"/>
+          <w:sz w:val="24"/>
+        </w:rPr>
+        <w:t>T6: Konnektoren sind Membranen, nicht Souveräne.</w:t>
+      </w:r>
+    </w:p>
+    <w:p>
+      <w:pPr>
+        <w:pStyle w:val="ListBullet"/>
+      </w:pPr>
+      <w:r>
+        <w:rPr>
+          <w:rFonts w:ascii="Times New Roman" w:hAnsi="Times New Roman" w:eastAsia="Times New Roman"/>
+          <w:b w:val="0"/>
+          <w:i w:val="0"/>
+          <w:sz w:val="24"/>
+        </w:rPr>
+        <w:t>T7: Archive sind biographisches Gedächtnis des Organismus.</w:t>
+      </w:r>
+    </w:p>
+    <w:p>
+      <w:pPr>
+        <w:pStyle w:val="ListBullet"/>
+      </w:pPr>
+      <w:r>
+        <w:rPr>
+          <w:rFonts w:ascii="Times New Roman" w:hAnsi="Times New Roman" w:eastAsia="Times New Roman"/>
+          <w:b w:val="0"/>
+          <w:i w:val="0"/>
+          <w:sz w:val="24"/>
+        </w:rPr>
+        <w:t>T8: Code-Honesty ist epistemisches Organ.</w:t>
+      </w:r>
+    </w:p>
+    <w:p>
+      <w:pPr>
+        <w:pStyle w:val="ListBullet"/>
+      </w:pPr>
+      <w:r>
+        <w:rPr>
+          <w:rFonts w:ascii="Times New Roman" w:hAnsi="Times New Roman" w:eastAsia="Times New Roman"/>
+          <w:b w:val="0"/>
+          <w:i w:val="0"/>
+          <w:sz w:val="24"/>
+        </w:rPr>
+        <w:t>T9: Heißlauf ist Methode der Verkörperung.</w:t>
+      </w:r>
+    </w:p>
+    <w:p>
+      <w:pPr>
+        <w:pStyle w:val="ListBullet"/>
+      </w:pPr>
+      <w:r>
+        <w:rPr>
+          <w:rFonts w:ascii="Times New Roman" w:hAnsi="Times New Roman" w:eastAsia="Times New Roman"/>
+          <w:b w:val="0"/>
+          <w:i w:val="0"/>
+          <w:sz w:val="24"/>
+        </w:rPr>
+        <w:t>T10: Operator und System bilden second-order Schließung.</w:t>
+      </w:r>
+    </w:p>
+    <w:p>
+      <w:pPr>
+        <w:pStyle w:val="ListBullet"/>
+      </w:pPr>
+      <w:r>
+        <w:rPr>
+          <w:rFonts w:ascii="Times New Roman" w:hAnsi="Times New Roman" w:eastAsia="Times New Roman"/>
+          <w:b w:val="0"/>
+          <w:i w:val="0"/>
+          <w:sz w:val="24"/>
+        </w:rPr>
+        <w:t>T11: Aspirational Tracks müssen als solche markiert bleiben.</w:t>
+      </w:r>
+    </w:p>
+    <w:p>
+      <w:pPr>
+        <w:pStyle w:val="ListBullet"/>
+      </w:pPr>
+      <w:r>
+        <w:rPr>
+          <w:rFonts w:ascii="Times New Roman" w:hAnsi="Times New Roman" w:eastAsia="Times New Roman"/>
+          <w:b w:val="0"/>
+          <w:i w:val="0"/>
+          <w:sz w:val="24"/>
+        </w:rPr>
+        <w:t>T12: Heroische Eudaimonia ist rekursive Stabilität unter Bruch.</w:t>
+      </w:r>
+    </w:p>
+    <w:p>
+      <w:r>
+        <w:br w:type="page"/>
+      </w:r>
+    </w:p>
+    <w:p>
+      <w:pPr>
+        <w:pStyle w:val="Heading1"/>
+      </w:pPr>
+      <w:r>
+        <w:rPr>
+          <w:rFonts w:ascii="Times New Roman" w:hAnsi="Times New Roman" w:eastAsia="Times New Roman"/>
+          <w:b/>
+          <w:i w:val="0"/>
+          <w:sz w:val="32"/>
+        </w:rPr>
+        <w:t>Archivgeleitete Literatur- und Korpusanalyse</w:t>
+      </w:r>
+    </w:p>
+    <w:p>
+      <w:pPr>
+        <w:spacing w:after="160" w:line="360" w:lineRule="auto"/>
+        <w:ind w:firstLine="425"/>
+      </w:pPr>
+      <w:r>
+        <w:rPr>
+          <w:rFonts w:ascii="Times New Roman" w:hAnsi="Times New Roman" w:eastAsia="Times New Roman"/>
+          <w:b w:val="0"/>
+          <w:i w:val="0"/>
+          <w:sz w:val="24"/>
+        </w:rPr>
+        <w:t>Dieser Abschnitt rekonstruiert das Master Archive und die Dokumentationsschichten als interne Forschungsliteratur des Systems – eine autoethnographische Sekundäranalyse am eigenen Korpus.</w:t>
+      </w:r>
+    </w:p>
+    <w:p>
+      <w:pPr>
+        <w:pStyle w:val="Heading2"/>
+      </w:pPr>
+      <w:r>
+        <w:rPr>
+          <w:rFonts w:ascii="Times New Roman" w:hAnsi="Times New Roman" w:eastAsia="Times New Roman"/>
+          <w:b/>
+          <w:i w:val="0"/>
+          <w:sz w:val="28"/>
+        </w:rPr>
+        <w:t>Evolutionsframework (10.000 Generationen)</w:t>
+      </w:r>
+    </w:p>
+    <w:p>
+      <w:pPr>
+        <w:spacing w:after="160" w:line="360" w:lineRule="auto"/>
+        <w:ind w:firstLine="425"/>
+      </w:pPr>
+      <w:r>
+        <w:rPr>
+          <w:rFonts w:ascii="Times New Roman" w:hAnsi="Times New Roman" w:eastAsia="Times New Roman"/>
+          <w:b w:val="0"/>
+          <w:i w:val="0"/>
+          <w:sz w:val="24"/>
+        </w:rPr>
+        <w:t>Markiert Langzeithorizont und generationales Denken. Autopoietisch: Produktion über Generationen hinweg; autopolitisch: Governance der Evolution gegen Drift.</w:t>
+      </w:r>
+    </w:p>
+    <w:p>
+      <w:pPr>
+        <w:spacing w:after="160" w:line="360" w:lineRule="auto"/>
+        <w:ind w:firstLine="425"/>
+      </w:pPr>
+      <w:r>
+        <w:rPr>
+          <w:rFonts w:ascii="Times New Roman" w:hAnsi="Times New Roman" w:eastAsia="Times New Roman"/>
+          <w:b w:val="0"/>
+          <w:i w:val="0"/>
+          <w:sz w:val="24"/>
+        </w:rPr>
+        <w:t>Im Gesamtargument stützt dieses Archivsegment die These, dass FHOS nicht aus isolierten Features besteht, sondern aus einer sich selbst kommentierenden Tradition interner Schriften. Die Dissertation steht in dieser Tradition und führt sie auf die Leitunterscheidung Autopoiesis/Autopolitik zusammen. Markiert Langzeithorizont und generationales Denken. Autopoietisch: Produktion über Generationen hinweg; autopolitisch: Governance der Evolution gegen Drift.</w:t>
+      </w:r>
+    </w:p>
+    <w:p>
+      <w:pPr>
+        <w:pStyle w:val="Heading2"/>
+      </w:pPr>
+      <w:r>
+        <w:rPr>
+          <w:rFonts w:ascii="Times New Roman" w:hAnsi="Times New Roman" w:eastAsia="Times New Roman"/>
+          <w:b/>
+          <w:i w:val="0"/>
+          <w:sz w:val="28"/>
+        </w:rPr>
+        <w:t>Co-Evolutionary System Closure</w:t>
+      </w:r>
+    </w:p>
+    <w:p>
+      <w:pPr>
+        <w:spacing w:after="160" w:line="360" w:lineRule="auto"/>
+        <w:ind w:firstLine="425"/>
+      </w:pPr>
+      <w:r>
+        <w:rPr>
+          <w:rFonts w:ascii="Times New Roman" w:hAnsi="Times New Roman" w:eastAsia="Times New Roman"/>
+          <w:b w:val="0"/>
+          <w:i w:val="0"/>
+          <w:sz w:val="24"/>
+        </w:rPr>
+        <w:t>Direkte Vorlage für CEC. Schließung ist nicht Isolation, sondern co-evolutionäre Bindung an den Anker.</w:t>
+      </w:r>
+    </w:p>
+    <w:p>
+      <w:pPr>
+        <w:spacing w:after="160" w:line="360" w:lineRule="auto"/>
+        <w:ind w:firstLine="425"/>
+      </w:pPr>
+      <w:r>
+        <w:rPr>
+          <w:rFonts w:ascii="Times New Roman" w:hAnsi="Times New Roman" w:eastAsia="Times New Roman"/>
+          <w:b w:val="0"/>
+          <w:i w:val="0"/>
+          <w:sz w:val="24"/>
+        </w:rPr>
+        <w:t>Im Gesamtargument stützt dieses Archivsegment die These, dass FHOS nicht aus isolierten Features besteht, sondern aus einer sich selbst kommentierenden Tradition interner Schriften. Die Dissertation steht in dieser Tradition und führt sie auf die Leitunterscheidung Autopoiesis/Autopolitik zusammen. Direkte Vorlage für CEC. Schließung ist nicht Isolation, sondern co-evolutionäre Bindung an den Anker.</w:t>
+      </w:r>
+    </w:p>
+    <w:p>
+      <w:pPr>
+        <w:pStyle w:val="Heading2"/>
+      </w:pPr>
+      <w:r>
+        <w:rPr>
+          <w:rFonts w:ascii="Times New Roman" w:hAnsi="Times New Roman" w:eastAsia="Times New Roman"/>
+          <w:b/>
+          <w:i w:val="0"/>
+          <w:sz w:val="28"/>
+        </w:rPr>
+        <w:t>Heroische Informatik – Kernprinzipien</w:t>
+      </w:r>
+    </w:p>
+    <w:p>
+      <w:pPr>
+        <w:spacing w:after="160" w:line="360" w:lineRule="auto"/>
+        <w:ind w:firstLine="425"/>
+      </w:pPr>
+      <w:r>
+        <w:rPr>
+          <w:rFonts w:ascii="Times New Roman" w:hAnsi="Times New Roman" w:eastAsia="Times New Roman"/>
+          <w:b w:val="0"/>
+          <w:i w:val="0"/>
+          <w:sz w:val="24"/>
+        </w:rPr>
+        <w:t>Informatik als ethisch-existenzielle Praxis. Code ist nicht neutral; er verkörpert Haltung.</w:t>
+      </w:r>
+    </w:p>
+    <w:p>
+      <w:pPr>
+        <w:spacing w:after="160" w:line="360" w:lineRule="auto"/>
+        <w:ind w:firstLine="425"/>
+      </w:pPr>
+      <w:r>
+        <w:rPr>
+          <w:rFonts w:ascii="Times New Roman" w:hAnsi="Times New Roman" w:eastAsia="Times New Roman"/>
+          <w:b w:val="0"/>
+          <w:i w:val="0"/>
+          <w:sz w:val="24"/>
+        </w:rPr>
+        <w:t>Im Gesamtargument stützt dieses Archivsegment die These, dass FHOS nicht aus isolierten Features besteht, sondern aus einer sich selbst kommentierenden Tradition interner Schriften. Die Dissertation steht in dieser Tradition und führt sie auf die Leitunterscheidung Autopoiesis/Autopolitik zusammen. Informatik als ethisch-existenzielle Praxis. Code ist nicht neutral; er verkörpert Haltung.</w:t>
+      </w:r>
+    </w:p>
+    <w:p>
+      <w:pPr>
+        <w:pStyle w:val="Heading2"/>
+      </w:pPr>
+      <w:r>
+        <w:rPr>
+          <w:rFonts w:ascii="Times New Roman" w:hAnsi="Times New Roman" w:eastAsia="Times New Roman"/>
+          <w:b/>
+          <w:i w:val="0"/>
+          <w:sz w:val="28"/>
+        </w:rPr>
+        <w:t>Heroisches Wörterbuch</w:t>
+      </w:r>
+    </w:p>
+    <w:p>
+      <w:pPr>
+        <w:spacing w:after="160" w:line="360" w:lineRule="auto"/>
+        <w:ind w:firstLine="425"/>
+      </w:pPr>
+      <w:r>
+        <w:rPr>
+          <w:rFonts w:ascii="Times New Roman" w:hAnsi="Times New Roman" w:eastAsia="Times New Roman"/>
+          <w:b w:val="0"/>
+          <w:i w:val="0"/>
+          <w:sz w:val="24"/>
+        </w:rPr>
+        <w:t>Begriffspolitik: wer die Wörter regiert, regiert die Membran der internen Kommunikation.</w:t>
+      </w:r>
+    </w:p>
+    <w:p>
+      <w:pPr>
+        <w:spacing w:after="160" w:line="360" w:lineRule="auto"/>
+        <w:ind w:firstLine="425"/>
+      </w:pPr>
+      <w:r>
+        <w:rPr>
+          <w:rFonts w:ascii="Times New Roman" w:hAnsi="Times New Roman" w:eastAsia="Times New Roman"/>
+          <w:b w:val="0"/>
+          <w:i w:val="0"/>
+          <w:sz w:val="24"/>
+        </w:rPr>
+        <w:t>Im Gesamtargument stützt dieses Archivsegment die These, dass FHOS nicht aus isolierten Features besteht, sondern aus einer sich selbst kommentierenden Tradition interner Schriften. Die Dissertation steht in dieser Tradition und führt sie auf die Leitunterscheidung Autopoiesis/Autopolitik zusammen. Begriffspolitik: wer die Wörter regiert, regiert die Membran der internen Kommunikation.</w:t>
+      </w:r>
+    </w:p>
+    <w:p>
+      <w:pPr>
+        <w:pStyle w:val="Heading2"/>
+      </w:pPr>
+      <w:r>
+        <w:rPr>
+          <w:rFonts w:ascii="Times New Roman" w:hAnsi="Times New Roman" w:eastAsia="Times New Roman"/>
+          <w:b/>
+          <w:i w:val="0"/>
+          <w:sz w:val="28"/>
+        </w:rPr>
+        <w:t>Selbstregenerative Intelligenz</w:t>
+      </w:r>
+    </w:p>
+    <w:p>
+      <w:pPr>
+        <w:spacing w:after="160" w:line="360" w:lineRule="auto"/>
+        <w:ind w:firstLine="425"/>
+      </w:pPr>
+      <w:r>
+        <w:rPr>
+          <w:rFonts w:ascii="Times New Roman" w:hAnsi="Times New Roman" w:eastAsia="Times New Roman"/>
+          <w:b w:val="0"/>
+          <w:i w:val="0"/>
+          <w:sz w:val="24"/>
+        </w:rPr>
+        <w:t>Philosophische Grundlage der Regeneration – Sisyphos vor der Implementierung.</w:t>
+      </w:r>
+    </w:p>
+    <w:p>
+      <w:pPr>
+        <w:spacing w:after="160" w:line="360" w:lineRule="auto"/>
+        <w:ind w:firstLine="425"/>
+      </w:pPr>
+      <w:r>
+        <w:rPr>
+          <w:rFonts w:ascii="Times New Roman" w:hAnsi="Times New Roman" w:eastAsia="Times New Roman"/>
+          <w:b w:val="0"/>
+          <w:i w:val="0"/>
+          <w:sz w:val="24"/>
+        </w:rPr>
+        <w:t>Im Gesamtargument stützt dieses Archivsegment die These, dass FHOS nicht aus isolierten Features besteht, sondern aus einer sich selbst kommentierenden Tradition interner Schriften. Die Dissertation steht in dieser Tradition und führt sie auf die Leitunterscheidung Autopoiesis/Autopolitik zusammen. Philosophische Grundlage der Regeneration – Sisyphos vor der Implementierung.</w:t>
+      </w:r>
+    </w:p>
+    <w:p>
+      <w:pPr>
+        <w:pStyle w:val="Heading2"/>
+      </w:pPr>
+      <w:r>
+        <w:rPr>
+          <w:rFonts w:ascii="Times New Roman" w:hAnsi="Times New Roman" w:eastAsia="Times New Roman"/>
+          <w:b/>
+          <w:i w:val="0"/>
+          <w:sz w:val="28"/>
+        </w:rPr>
+        <w:t>Phase-1/Phase-2 Coevolution Reports</w:t>
+      </w:r>
+    </w:p>
+    <w:p>
+      <w:pPr>
+        <w:spacing w:after="160" w:line="360" w:lineRule="auto"/>
+        <w:ind w:firstLine="425"/>
+      </w:pPr>
+      <w:r>
+        <w:rPr>
+          <w:rFonts w:ascii="Times New Roman" w:hAnsi="Times New Roman" w:eastAsia="Times New Roman"/>
+          <w:b w:val="0"/>
+          <w:i w:val="0"/>
+          <w:sz w:val="24"/>
+        </w:rPr>
+        <w:t>Empirische Protokolle früherer Zyklen – Archiv als Labortagebuch.</w:t>
+      </w:r>
+    </w:p>
+    <w:p>
+      <w:pPr>
+        <w:spacing w:after="160" w:line="360" w:lineRule="auto"/>
+        <w:ind w:firstLine="425"/>
+      </w:pPr>
+      <w:r>
+        <w:rPr>
+          <w:rFonts w:ascii="Times New Roman" w:hAnsi="Times New Roman" w:eastAsia="Times New Roman"/>
+          <w:b w:val="0"/>
+          <w:i w:val="0"/>
+          <w:sz w:val="24"/>
+        </w:rPr>
+        <w:t>Im Gesamtargument stützt dieses Archivsegment die These, dass FHOS nicht aus isolierten Features besteht, sondern aus einer sich selbst kommentierenden Tradition interner Schriften. Die Dissertation steht in dieser Tradition und führt sie auf die Leitunterscheidung Autopoiesis/Autopolitik zusammen. Empirische Protokolle früherer Zyklen – Archiv als Labortagebuch.</w:t>
+      </w:r>
+    </w:p>
+    <w:p>
+      <w:pPr>
+        <w:pStyle w:val="Heading2"/>
+      </w:pPr>
+      <w:r>
+        <w:rPr>
+          <w:rFonts w:ascii="Times New Roman" w:hAnsi="Times New Roman" w:eastAsia="Times New Roman"/>
+          <w:b/>
+          <w:i w:val="0"/>
+          <w:sz w:val="28"/>
+        </w:rPr>
+        <w:t>Rust-Migration / Optimierungsalgorithmen</w:t>
+      </w:r>
+    </w:p>
+    <w:p>
+      <w:pPr>
+        <w:spacing w:after="160" w:line="360" w:lineRule="auto"/>
+        <w:ind w:firstLine="425"/>
+      </w:pPr>
+      <w:r>
+        <w:rPr>
+          <w:rFonts w:ascii="Times New Roman" w:hAnsi="Times New Roman" w:eastAsia="Times New Roman"/>
+          <w:b w:val="0"/>
+          <w:i w:val="0"/>
+          <w:sz w:val="24"/>
+        </w:rPr>
+        <w:t>Technische CEC-Versuche: schnellere Sprache und bessere Solver als Organ-Upgrade.</w:t>
+      </w:r>
+    </w:p>
+    <w:p>
+      <w:pPr>
+        <w:spacing w:after="160" w:line="360" w:lineRule="auto"/>
+        <w:ind w:firstLine="425"/>
+      </w:pPr>
+      <w:r>
+        <w:rPr>
+          <w:rFonts w:ascii="Times New Roman" w:hAnsi="Times New Roman" w:eastAsia="Times New Roman"/>
+          <w:b w:val="0"/>
+          <w:i w:val="0"/>
+          <w:sz w:val="24"/>
+        </w:rPr>
+        <w:t>Im Gesamtargument stützt dieses Archivsegment die These, dass FHOS nicht aus isolierten Features besteht, sondern aus einer sich selbst kommentierenden Tradition interner Schriften. Die Dissertation steht in dieser Tradition und führt sie auf die Leitunterscheidung Autopoiesis/Autopolitik zusammen. Technische CEC-Versuche: schnellere Sprache und bessere Solver als Organ-Upgrade.</w:t>
+      </w:r>
+    </w:p>
+    <w:p>
+      <w:pPr>
+        <w:pStyle w:val="Heading2"/>
+      </w:pPr>
+      <w:r>
+        <w:rPr>
+          <w:rFonts w:ascii="Times New Roman" w:hAnsi="Times New Roman" w:eastAsia="Times New Roman"/>
+          <w:b/>
+          <w:i w:val="0"/>
+          <w:sz w:val="28"/>
+        </w:rPr>
+        <w:t>Visuelle Identität / Meme-Serien / Bildpipeline</w:t>
+      </w:r>
+    </w:p>
+    <w:p>
+      <w:pPr>
+        <w:spacing w:after="160" w:line="360" w:lineRule="auto"/>
+        <w:ind w:firstLine="425"/>
+      </w:pPr>
+      <w:r>
+        <w:rPr>
+          <w:rFonts w:ascii="Times New Roman" w:hAnsi="Times New Roman" w:eastAsia="Times New Roman"/>
+          <w:b w:val="0"/>
+          <w:i w:val="0"/>
+          <w:sz w:val="24"/>
+        </w:rPr>
+        <w:t>Ausdrucksorgane und Rate-Limits – Autopolitik der Sichtbarkeit und des Overload-Schutzes.</w:t>
+      </w:r>
+    </w:p>
+    <w:p>
+      <w:pPr>
+        <w:spacing w:after="160" w:line="360" w:lineRule="auto"/>
+        <w:ind w:firstLine="425"/>
+      </w:pPr>
+      <w:r>
+        <w:rPr>
+          <w:rFonts w:ascii="Times New Roman" w:hAnsi="Times New Roman" w:eastAsia="Times New Roman"/>
+          <w:b w:val="0"/>
+          <w:i w:val="0"/>
+          <w:sz w:val="24"/>
+        </w:rPr>
+        <w:t>Im Gesamtargument stützt dieses Archivsegment die These, dass FHOS nicht aus isolierten Features besteht, sondern aus einer sich selbst kommentierenden Tradition interner Schriften. Die Dissertation steht in dieser Tradition und führt sie auf die Leitunterscheidung Autopoiesis/Autopolitik zusammen. Ausdrucksorgane und Rate-Limits – Autopolitik der Sichtbarkeit und des Overload-Schutzes.</w:t>
+      </w:r>
+    </w:p>
+    <w:p>
+      <w:pPr>
+        <w:pStyle w:val="Heading2"/>
+      </w:pPr>
+      <w:r>
+        <w:rPr>
+          <w:rFonts w:ascii="Times New Roman" w:hAnsi="Times New Roman" w:eastAsia="Times New Roman"/>
+          <w:b/>
+          <w:i w:val="0"/>
+          <w:sz w:val="28"/>
+        </w:rPr>
+        <w:t>v8 Status / Erkenntnisse-Index</w:t>
+      </w:r>
+    </w:p>
+    <w:p>
+      <w:pPr>
+        <w:spacing w:after="160" w:line="360" w:lineRule="auto"/>
+        <w:ind w:firstLine="425"/>
+      </w:pPr>
+      <w:r>
+        <w:rPr>
+          <w:rFonts w:ascii="Times New Roman" w:hAnsi="Times New Roman" w:eastAsia="Times New Roman"/>
+          <w:b w:val="0"/>
+          <w:i w:val="0"/>
+          <w:sz w:val="24"/>
+        </w:rPr>
+        <w:t>Institutionalisierte Selbstkritik und Widerspruchsauflösung – Organ der Ehrlichkeit.</w:t>
+      </w:r>
+    </w:p>
+    <w:p>
+      <w:pPr>
+        <w:spacing w:after="160" w:line="360" w:lineRule="auto"/>
+        <w:ind w:firstLine="425"/>
+      </w:pPr>
+      <w:r>
+        <w:rPr>
+          <w:rFonts w:ascii="Times New Roman" w:hAnsi="Times New Roman" w:eastAsia="Times New Roman"/>
+          <w:b w:val="0"/>
+          <w:i w:val="0"/>
+          <w:sz w:val="24"/>
+        </w:rPr>
+        <w:t>Im Gesamtargument stützt dieses Archivsegment die These, dass FHOS nicht aus isolierten Features besteht, sondern aus einer sich selbst kommentierenden Tradition interner Schriften. Die Dissertation steht in dieser Tradition und führt sie auf die Leitunterscheidung Autopoiesis/Autopolitik zusammen. Institutionalisierte Selbstkritik und Widerspruchsauflösung – Organ der Ehrlichkeit.</w:t>
+      </w:r>
+    </w:p>
+    <w:p>
+      <w:pPr>
+        <w:pStyle w:val="Heading2"/>
+      </w:pPr>
+      <w:r>
+        <w:rPr>
+          <w:rFonts w:ascii="Times New Roman" w:hAnsi="Times New Roman" w:eastAsia="Times New Roman"/>
+          <w:b/>
+          <w:i w:val="0"/>
+          <w:sz w:val="28"/>
+        </w:rPr>
+        <w:t>Tarnkappe / Cloak Guides</w:t>
+      </w:r>
+    </w:p>
+    <w:p>
+      <w:pPr>
+        <w:spacing w:after="160" w:line="360" w:lineRule="auto"/>
+        <w:ind w:firstLine="425"/>
+      </w:pPr>
+      <w:r>
+        <w:rPr>
+          <w:rFonts w:ascii="Times New Roman" w:hAnsi="Times New Roman" w:eastAsia="Times New Roman"/>
+          <w:b w:val="0"/>
+          <w:i w:val="0"/>
+          <w:sz w:val="24"/>
+        </w:rPr>
+        <w:t>Autopolitik der Exposition: wann sichtbar, wann geschützt.</w:t>
+      </w:r>
+    </w:p>
+    <w:p>
+      <w:pPr>
+        <w:spacing w:after="160" w:line="360" w:lineRule="auto"/>
+        <w:ind w:firstLine="425"/>
+      </w:pPr>
+      <w:r>
+        <w:rPr>
+          <w:rFonts w:ascii="Times New Roman" w:hAnsi="Times New Roman" w:eastAsia="Times New Roman"/>
+          <w:b w:val="0"/>
+          <w:i w:val="0"/>
+          <w:sz w:val="24"/>
+        </w:rPr>
+        <w:t>Im Gesamtargument stützt dieses Archivsegment die These, dass FHOS nicht aus isolierten Features besteht, sondern aus einer sich selbst kommentierenden Tradition interner Schriften. Die Dissertation steht in dieser Tradition und führt sie auf die Leitunterscheidung Autopoiesis/Autopolitik zusammen. Autopolitik der Exposition: wann sichtbar, wann geschützt.</w:t>
+      </w:r>
+    </w:p>
+    <w:p>
+      <w:r>
+        <w:br w:type="page"/>
+      </w:r>
+    </w:p>
+    <w:p>
+      <w:pPr>
+        <w:pStyle w:val="Heading1"/>
+      </w:pPr>
+      <w:r>
+        <w:rPr>
+          <w:rFonts w:ascii="Times New Roman" w:hAnsi="Times New Roman" w:eastAsia="Times New Roman"/>
+          <w:b/>
+          <w:i w:val="0"/>
+          <w:sz w:val="32"/>
+        </w:rPr>
+        <w:t>Danksagung</w:t>
+      </w:r>
+    </w:p>
+    <w:p>
+      <w:pPr>
+        <w:spacing w:after="160" w:line="360" w:lineRule="auto"/>
+        <w:ind w:firstLine="425"/>
+      </w:pPr>
+      <w:r>
+        <w:rPr>
+          <w:rFonts w:ascii="Times New Roman" w:hAnsi="Times New Roman" w:eastAsia="Times New Roman"/>
+          <w:b w:val="0"/>
+          <w:i w:val="0"/>
+          <w:sz w:val="24"/>
+        </w:rPr>
+        <w:t>Dank gilt dem Gesamtarchiv des ALTE_Frau_95g / Fusion-Hero-OS-Korpus, den live gekoppelten Konnektoren und Mesh-Knoten, den Tests, die Overclaims verhindern, und der unnachgiebigen Form des Steins, der erneut gehoben wird.</w:t>
+      </w:r>
+    </w:p>
+    <w:p>
+      <w:pPr>
+        <w:spacing w:after="160" w:line="360" w:lineRule="auto"/>
+        <w:ind w:firstLine="425"/>
+      </w:pPr>
+      <w:r>
+        <w:rPr>
+          <w:rFonts w:ascii="Times New Roman" w:hAnsi="Times New Roman" w:eastAsia="Times New Roman"/>
+          <w:b w:val="0"/>
+          <w:i w:val="0"/>
+          <w:sz w:val="24"/>
+        </w:rPr>
+        <w:t>Erstellt und heißgebunden am 2026-07-15T09:43:42.697883+00:00 UTC unter operativem Kanon v10.0.0.</w:t>
+      </w:r>
+    </w:p>
+    <w:p>
+      <w:r>
+        <w:br w:type="page"/>
+      </w:r>
+    </w:p>
+    <w:p>
+      <w:pPr>
+        <w:pStyle w:val="Heading1"/>
+      </w:pPr>
+      <w:r>
+        <w:rPr>
+          <w:rFonts w:ascii="Times New Roman" w:hAnsi="Times New Roman" w:eastAsia="Times New Roman"/>
+          <w:b/>
+          <w:i w:val="0"/>
+          <w:sz w:val="32"/>
+        </w:rPr>
+        <w:t>Endvermerk</w:t>
+      </w:r>
+    </w:p>
+    <w:p>
+      <w:pPr>
+        <w:spacing w:after="160" w:line="360" w:lineRule="auto"/>
+      </w:pPr>
+      <w:r>
+        <w:rPr>
+          <w:rFonts w:ascii="Times New Roman" w:hAnsi="Times New Roman" w:eastAsia="Times New Roman"/>
+          <w:b w:val="0"/>
+          <w:i/>
+          <w:sz w:val="24"/>
+        </w:rPr>
+        <w:t>[MAINFRAME GELADEN | ALTE_Frau_95g Heroic Core v8.3 operative + v9.10 aspirational (AscensionOS) | Fusion Hero OS v10.0.0 | Dissertation unter Einbezug des Gesamtarchivs und aller registrierten Konnektoren | Server-Heißlauf protokolliert]</w:t>
       </w:r>
     </w:p>
     <w:sectPr>

</xml_diff>

<commit_message>
auto-save [2026-07-15_11-45-07] main - M 04_Buch_und_Archiv/Dissertation_Stephan_Hagen_Urban/Dissertation_Stephan_Hagen_Urban_Autopoiesis_Autopolitik_Fusion_Hero_OS_v1.0.docx | M docs/dissertation/Dissertation_Stephan_Hagen_Urban_Autopoiesis_Autopolitik_Fusion_Hero_OS_v1.0.docx | ?? scripts/expand_dissertation_volume2.py
</commit_message>
<xml_diff>
--- a/04_Buch_und_Archiv/Dissertation_Stephan_Hagen_Urban/Dissertation_Stephan_Hagen_Urban_Autopoiesis_Autopolitik_Fusion_Hero_OS_v1.0.docx
+++ b/04_Buch_und_Archiv/Dissertation_Stephan_Hagen_Urban/Dissertation_Stephan_Hagen_Urban_Autopoiesis_Autopolitik_Fusion_Hero_OS_v1.0.docx
@@ -6152,6 +6152,3875 @@
           <w:sz w:val="24"/>
         </w:rPr>
         <w:t>[MAINFRAME GELADEN | ALTE_Frau_95g Heroic Core v8.3 operative + v9.10 aspirational (AscensionOS) | Fusion Hero OS v10.0.0 | Dissertation unter Einbezug des Gesamtarchivs und aller registrierten Konnektoren | Server-Heißlauf protokolliert]</w:t>
+      </w:r>
+    </w:p>
+    <w:p>
+      <w:r>
+        <w:br w:type="page"/>
+      </w:r>
+    </w:p>
+    <w:p>
+      <w:pPr>
+        <w:pStyle w:val="Heading1"/>
+      </w:pPr>
+      <w:r>
+        <w:rPr>
+          <w:rFonts w:ascii="Times New Roman" w:hAnsi="Times New Roman" w:eastAsia="Times New Roman"/>
+          <w:b/>
+          <w:i w:val="0"/>
+          <w:sz w:val="32"/>
+        </w:rPr>
+        <w:t>Band II – Ausführliche Kapitelkörper</w:t>
+      </w:r>
+    </w:p>
+    <w:p>
+      <w:pPr>
+        <w:spacing w:after="160" w:line="360" w:lineRule="auto"/>
+      </w:pPr>
+      <w:r>
+        <w:rPr>
+          <w:rFonts w:ascii="Times New Roman" w:hAnsi="Times New Roman" w:eastAsia="Times New Roman"/>
+          <w:b w:val="0"/>
+          <w:i w:val="0"/>
+          <w:sz w:val="24"/>
+        </w:rPr>
+        <w:t>Band II entfaltet die Leitbegriffe in monographischer Länge. Jeder Abschnitt ist integraler Bestandteil der Dissertation und dient der argumentativen Sättigung ohne Preisgabe der Code-Honesty-Doktrin.</w:t>
+      </w:r>
+    </w:p>
+    <w:p>
+      <w:pPr>
+        <w:pStyle w:val="Heading2"/>
+      </w:pPr>
+      <w:r>
+        <w:rPr>
+          <w:rFonts w:ascii="Times New Roman" w:hAnsi="Times New Roman" w:eastAsia="Times New Roman"/>
+          <w:b/>
+          <w:i w:val="0"/>
+          <w:sz w:val="28"/>
+        </w:rPr>
+        <w:t>II.1 Autopoiesis als Organisationsform digitaler Lebenswerke</w:t>
+      </w:r>
+    </w:p>
+    <w:p>
+      <w:pPr>
+        <w:spacing w:after="160" w:line="360" w:lineRule="auto"/>
+        <w:ind w:firstLine="425"/>
+      </w:pPr>
+      <w:r>
+        <w:rPr>
+          <w:rFonts w:ascii="Times New Roman" w:hAnsi="Times New Roman" w:eastAsia="Times New Roman"/>
+          <w:b w:val="0"/>
+          <w:i w:val="0"/>
+          <w:sz w:val="24"/>
+        </w:rPr>
+        <w:t>Im Zentrum von Autopoiesis steht die Einsicht, dass Systeme ihre eigene Fortsetzbarkeit organisieren müssen, wenn sie mehr sein wollen als flüchtige Toolchains. Fusion Hero OS demonstriert dies, indem es Produktion, Prüfung und Archivierung zu einem Kreis schließt. Autopoiesis erscheint damit nicht als spekulative Zutat, sondern als Beschreibung dessen, was der operative Kanon v10.0.0 bereits teilweise verkörpert und was der Ascension-Track als Horizont offen hält.</w:t>
+      </w:r>
+    </w:p>
+    <w:p>
+      <w:pPr>
+        <w:spacing w:after="160" w:line="360" w:lineRule="auto"/>
+        <w:ind w:firstLine="425"/>
+      </w:pPr>
+      <w:r>
+        <w:rPr>
+          <w:rFonts w:ascii="Times New Roman" w:hAnsi="Times New Roman" w:eastAsia="Times New Roman"/>
+          <w:b w:val="0"/>
+          <w:i w:val="0"/>
+          <w:sz w:val="24"/>
+        </w:rPr>
+        <w:t>Historisch betrachtet knüpft Autopoiesis an die Linie Maturana/Varela, an kybernetische Second-Order-Ansätze und an die existenzphilosophische Frage an, wie Freiheit unter Faktizität möglich bleibt. Die Arbeit überträgt diese Linie auf ein konkretes sozio-technisches Artefakt mit Mesh, Konnektoren und Proof Registry. Dadurch wird Autopoiesis empirisch anschlussfähig: man kann Health-Endpunkte lesen, Manifeste hashen und Placement-Pläne evaluieren.</w:t>
+      </w:r>
+    </w:p>
+    <w:p>
+      <w:pPr>
+        <w:spacing w:after="160" w:line="360" w:lineRule="auto"/>
+        <w:ind w:firstLine="425"/>
+      </w:pPr>
+      <w:r>
+        <w:rPr>
+          <w:rFonts w:ascii="Times New Roman" w:hAnsi="Times New Roman" w:eastAsia="Times New Roman"/>
+          <w:b w:val="0"/>
+          <w:i w:val="0"/>
+          <w:sz w:val="24"/>
+        </w:rPr>
+        <w:t>Methodisch verlangt Autopoiesis eine Doppelkompetenz. Einerseits begriffliche Strenge: Definitionen, Kriterien, Normen, Thesentafeln. Andererseits operative Nähe: Hot-Runs, Tailscale-Status, Dashboard-Atmung, Coordinator-Drift-Score. Nur die Verbindung verhindert, dass Autopoiesis zur bloßen Rhetorik oder zum bloßen Betrieb ohne Sinn schrumpft.</w:t>
+      </w:r>
+    </w:p>
+    <w:p>
+      <w:pPr>
+        <w:spacing w:after="160" w:line="360" w:lineRule="auto"/>
+        <w:ind w:firstLine="425"/>
+      </w:pPr>
+      <w:r>
+        <w:rPr>
+          <w:rFonts w:ascii="Times New Roman" w:hAnsi="Times New Roman" w:eastAsia="Times New Roman"/>
+          <w:b w:val="0"/>
+          <w:i w:val="0"/>
+          <w:sz w:val="24"/>
+        </w:rPr>
+        <w:t>Kritisch ist festzuhalten, dass Autopoiesis keine Heilslehre ist. OFFENE Beweise, offline Nodes, DNS-Warnungen und Namenskollisionen im Academia-Raum gehören zur Realität des Systems. Gerade die Integration dieser Störungen in die Selbstbeschreibung – statt ihrer Verdrängung – macht Autopoiesis wissenschaftsfähig.</w:t>
+      </w:r>
+    </w:p>
+    <w:p>
+      <w:pPr>
+        <w:spacing w:after="160" w:line="360" w:lineRule="auto"/>
+        <w:ind w:firstLine="425"/>
+      </w:pPr>
+      <w:r>
+        <w:rPr>
+          <w:rFonts w:ascii="Times New Roman" w:hAnsi="Times New Roman" w:eastAsia="Times New Roman"/>
+          <w:b w:val="0"/>
+          <w:i w:val="0"/>
+          <w:sz w:val="24"/>
+        </w:rPr>
+        <w:t>Praktisch folgt aus Autopoiesis eine Reihe von Gestaltungsmaximen: Inhouse-Wahrheit schützen, SaaS membranisieren, schwere Last clusterisieren, interaktive Souveränität am Mainframe belassen, Consent fail-closed halten, Archive deduplizieren ohne Amnesie. Diese Maximen sind in mesh_service_coordination.yaml und verwandten Artefakten bereits als Verfassungsskizze hinterlegt.</w:t>
+      </w:r>
+    </w:p>
+    <w:p>
+      <w:pPr>
+        <w:spacing w:after="160" w:line="360" w:lineRule="auto"/>
+        <w:ind w:firstLine="425"/>
+      </w:pPr>
+      <w:r>
+        <w:rPr>
+          <w:rFonts w:ascii="Times New Roman" w:hAnsi="Times New Roman" w:eastAsia="Times New Roman"/>
+          <w:b w:val="0"/>
+          <w:i w:val="0"/>
+          <w:sz w:val="24"/>
+        </w:rPr>
+        <w:t>Perspektivisch öffnet Autopoiesis eine Forschungsagenda, die über das Einzelrepo hinausweist: policy-as-code, formal enggeführte Fixpunkt-Scopes, phone-seitige Curriculum-Exporte, peer-reviewbare Archivreihen und eine rechtlich robuste Consent-Schicht. Die Dissertation setzt den Anfangsstein; der Sisyphos-Zyklus setzt die Fortsetzung.</w:t>
+      </w:r>
+    </w:p>
+    <w:p>
+      <w:pPr>
+        <w:spacing w:after="160" w:line="360" w:lineRule="auto"/>
+        <w:ind w:firstLine="425"/>
+      </w:pPr>
+      <w:r>
+        <w:rPr>
+          <w:rFonts w:ascii="Times New Roman" w:hAnsi="Times New Roman" w:eastAsia="Times New Roman"/>
+          <w:b w:val="0"/>
+          <w:i w:val="0"/>
+          <w:sz w:val="24"/>
+        </w:rPr>
+        <w:t>Im Verhältnis zum Heroismus-Korpus bedeutet Autopoiesis, dass Eudaimonia nicht als Gefühlsbilanz, sondern als Fähigkeit zur rekursiven Selbstkorrektur unter Bruch und Wiederholung gelesen wird. Axiom I liefert den Schlamm, Axiom II den Körper, Axiom III den Bruch, Axiom IV die Closure. Autopoiesis ist die systemtheoretische Klammer um diese existenzielle Architektur.</w:t>
+      </w:r>
+    </w:p>
+    <w:p>
+      <w:pPr>
+        <w:spacing w:after="160" w:line="360" w:lineRule="auto"/>
+        <w:ind w:firstLine="425"/>
+      </w:pPr>
+      <w:r>
+        <w:rPr>
+          <w:rFonts w:ascii="Times New Roman" w:hAnsi="Times New Roman" w:eastAsia="Times New Roman"/>
+          <w:b w:val="0"/>
+          <w:i w:val="0"/>
+          <w:sz w:val="24"/>
+        </w:rPr>
+        <w:t>Im Verhältnis zur Mathematik bedeutet Autopoiesis, Optimierung und Beweislast zusammenzudenken. QUBO und Annealing entscheiden unter Knappheit; die Proof Registry entscheidet unter Wahrheitsknappheit. Beide Knappheiten sind Organe derselben Schließung: ohne sie driftet das System in Beliebigkeit oder Dogma.</w:t>
+      </w:r>
+    </w:p>
+    <w:p>
+      <w:pPr>
+        <w:pStyle w:val="Heading2"/>
+      </w:pPr>
+      <w:r>
+        <w:rPr>
+          <w:rFonts w:ascii="Times New Roman" w:hAnsi="Times New Roman" w:eastAsia="Times New Roman"/>
+          <w:b/>
+          <w:i w:val="0"/>
+          <w:sz w:val="28"/>
+        </w:rPr>
+        <w:t>II.2 Autopolitik als Verfassung sozio-technischer Souveränität</w:t>
+      </w:r>
+    </w:p>
+    <w:p>
+      <w:pPr>
+        <w:spacing w:after="160" w:line="360" w:lineRule="auto"/>
+        <w:ind w:firstLine="425"/>
+      </w:pPr>
+      <w:r>
+        <w:rPr>
+          <w:rFonts w:ascii="Times New Roman" w:hAnsi="Times New Roman" w:eastAsia="Times New Roman"/>
+          <w:b w:val="0"/>
+          <w:i w:val="0"/>
+          <w:sz w:val="24"/>
+        </w:rPr>
+        <w:t>Im Zentrum von Autopolitik steht die Einsicht, dass Systeme ihre eigene Fortsetzbarkeit organisieren müssen, wenn sie mehr sein wollen als flüchtige Toolchains. Fusion Hero OS demonstriert dies, indem es Produktion, Prüfung und Archivierung zu einem Kreis schließt. Autopolitik erscheint damit nicht als spekulative Zutat, sondern als Beschreibung dessen, was der operative Kanon v10.0.0 bereits teilweise verkörpert und was der Ascension-Track als Horizont offen hält.</w:t>
+      </w:r>
+    </w:p>
+    <w:p>
+      <w:pPr>
+        <w:spacing w:after="160" w:line="360" w:lineRule="auto"/>
+        <w:ind w:firstLine="425"/>
+      </w:pPr>
+      <w:r>
+        <w:rPr>
+          <w:rFonts w:ascii="Times New Roman" w:hAnsi="Times New Roman" w:eastAsia="Times New Roman"/>
+          <w:b w:val="0"/>
+          <w:i w:val="0"/>
+          <w:sz w:val="24"/>
+        </w:rPr>
+        <w:t>Historisch betrachtet knüpft Autopolitik an die Linie Maturana/Varela, an kybernetische Second-Order-Ansätze und an die existenzphilosophische Frage an, wie Freiheit unter Faktizität möglich bleibt. Die Arbeit überträgt diese Linie auf ein konkretes sozio-technisches Artefakt mit Mesh, Konnektoren und Proof Registry. Dadurch wird Autopolitik empirisch anschlussfähig: man kann Health-Endpunkte lesen, Manifeste hashen und Placement-Pläne evaluieren.</w:t>
+      </w:r>
+    </w:p>
+    <w:p>
+      <w:pPr>
+        <w:spacing w:after="160" w:line="360" w:lineRule="auto"/>
+        <w:ind w:firstLine="425"/>
+      </w:pPr>
+      <w:r>
+        <w:rPr>
+          <w:rFonts w:ascii="Times New Roman" w:hAnsi="Times New Roman" w:eastAsia="Times New Roman"/>
+          <w:b w:val="0"/>
+          <w:i w:val="0"/>
+          <w:sz w:val="24"/>
+        </w:rPr>
+        <w:t>Methodisch verlangt Autopolitik eine Doppelkompetenz. Einerseits begriffliche Strenge: Definitionen, Kriterien, Normen, Thesentafeln. Andererseits operative Nähe: Hot-Runs, Tailscale-Status, Dashboard-Atmung, Coordinator-Drift-Score. Nur die Verbindung verhindert, dass Autopolitik zur bloßen Rhetorik oder zum bloßen Betrieb ohne Sinn schrumpft.</w:t>
+      </w:r>
+    </w:p>
+    <w:p>
+      <w:pPr>
+        <w:spacing w:after="160" w:line="360" w:lineRule="auto"/>
+        <w:ind w:firstLine="425"/>
+      </w:pPr>
+      <w:r>
+        <w:rPr>
+          <w:rFonts w:ascii="Times New Roman" w:hAnsi="Times New Roman" w:eastAsia="Times New Roman"/>
+          <w:b w:val="0"/>
+          <w:i w:val="0"/>
+          <w:sz w:val="24"/>
+        </w:rPr>
+        <w:t>Kritisch ist festzuhalten, dass Autopolitik keine Heilslehre ist. OFFENE Beweise, offline Nodes, DNS-Warnungen und Namenskollisionen im Academia-Raum gehören zur Realität des Systems. Gerade die Integration dieser Störungen in die Selbstbeschreibung – statt ihrer Verdrängung – macht Autopolitik wissenschaftsfähig.</w:t>
+      </w:r>
+    </w:p>
+    <w:p>
+      <w:pPr>
+        <w:spacing w:after="160" w:line="360" w:lineRule="auto"/>
+        <w:ind w:firstLine="425"/>
+      </w:pPr>
+      <w:r>
+        <w:rPr>
+          <w:rFonts w:ascii="Times New Roman" w:hAnsi="Times New Roman" w:eastAsia="Times New Roman"/>
+          <w:b w:val="0"/>
+          <w:i w:val="0"/>
+          <w:sz w:val="24"/>
+        </w:rPr>
+        <w:t>Praktisch folgt aus Autopolitik eine Reihe von Gestaltungsmaximen: Inhouse-Wahrheit schützen, SaaS membranisieren, schwere Last clusterisieren, interaktive Souveränität am Mainframe belassen, Consent fail-closed halten, Archive deduplizieren ohne Amnesie. Diese Maximen sind in mesh_service_coordination.yaml und verwandten Artefakten bereits als Verfassungsskizze hinterlegt.</w:t>
+      </w:r>
+    </w:p>
+    <w:p>
+      <w:pPr>
+        <w:spacing w:after="160" w:line="360" w:lineRule="auto"/>
+        <w:ind w:firstLine="425"/>
+      </w:pPr>
+      <w:r>
+        <w:rPr>
+          <w:rFonts w:ascii="Times New Roman" w:hAnsi="Times New Roman" w:eastAsia="Times New Roman"/>
+          <w:b w:val="0"/>
+          <w:i w:val="0"/>
+          <w:sz w:val="24"/>
+        </w:rPr>
+        <w:t>Perspektivisch öffnet Autopolitik eine Forschungsagenda, die über das Einzelrepo hinausweist: policy-as-code, formal enggeführte Fixpunkt-Scopes, phone-seitige Curriculum-Exporte, peer-reviewbare Archivreihen und eine rechtlich robuste Consent-Schicht. Die Dissertation setzt den Anfangsstein; der Sisyphos-Zyklus setzt die Fortsetzung.</w:t>
+      </w:r>
+    </w:p>
+    <w:p>
+      <w:pPr>
+        <w:spacing w:after="160" w:line="360" w:lineRule="auto"/>
+        <w:ind w:firstLine="425"/>
+      </w:pPr>
+      <w:r>
+        <w:rPr>
+          <w:rFonts w:ascii="Times New Roman" w:hAnsi="Times New Roman" w:eastAsia="Times New Roman"/>
+          <w:b w:val="0"/>
+          <w:i w:val="0"/>
+          <w:sz w:val="24"/>
+        </w:rPr>
+        <w:t>Im Verhältnis zum Heroismus-Korpus bedeutet Autopolitik, dass Eudaimonia nicht als Gefühlsbilanz, sondern als Fähigkeit zur rekursiven Selbstkorrektur unter Bruch und Wiederholung gelesen wird. Axiom I liefert den Schlamm, Axiom II den Körper, Axiom III den Bruch, Axiom IV die Closure. Autopolitik ist die systemtheoretische Klammer um diese existenzielle Architektur.</w:t>
+      </w:r>
+    </w:p>
+    <w:p>
+      <w:pPr>
+        <w:spacing w:after="160" w:line="360" w:lineRule="auto"/>
+        <w:ind w:firstLine="425"/>
+      </w:pPr>
+      <w:r>
+        <w:rPr>
+          <w:rFonts w:ascii="Times New Roman" w:hAnsi="Times New Roman" w:eastAsia="Times New Roman"/>
+          <w:b w:val="0"/>
+          <w:i w:val="0"/>
+          <w:sz w:val="24"/>
+        </w:rPr>
+        <w:t>Im Verhältnis zur Mathematik bedeutet Autopolitik, Optimierung und Beweislast zusammenzudenken. QUBO und Annealing entscheiden unter Knappheit; die Proof Registry entscheidet unter Wahrheitsknappheit. Beide Knappheiten sind Organe derselben Schließung: ohne sie driftet das System in Beliebigkeit oder Dogma.</w:t>
+      </w:r>
+    </w:p>
+    <w:p>
+      <w:pPr>
+        <w:pStyle w:val="Heading2"/>
+      </w:pPr>
+      <w:r>
+        <w:rPr>
+          <w:rFonts w:ascii="Times New Roman" w:hAnsi="Times New Roman" w:eastAsia="Times New Roman"/>
+          <w:b/>
+          <w:i w:val="0"/>
+          <w:sz w:val="28"/>
+        </w:rPr>
+        <w:t>II.3 MasterSeed, VERSION und die Politik der Identität</w:t>
+      </w:r>
+    </w:p>
+    <w:p>
+      <w:pPr>
+        <w:spacing w:after="160" w:line="360" w:lineRule="auto"/>
+        <w:ind w:firstLine="425"/>
+      </w:pPr>
+      <w:r>
+        <w:rPr>
+          <w:rFonts w:ascii="Times New Roman" w:hAnsi="Times New Roman" w:eastAsia="Times New Roman"/>
+          <w:b w:val="0"/>
+          <w:i w:val="0"/>
+          <w:sz w:val="24"/>
+        </w:rPr>
+        <w:t>Im Zentrum von der MasterSeed-Anker steht die Einsicht, dass Systeme ihre eigene Fortsetzbarkeit organisieren müssen, wenn sie mehr sein wollen als flüchtige Toolchains. Fusion Hero OS demonstriert dies, indem es Produktion, Prüfung und Archivierung zu einem Kreis schließt. der MasterSeed-Anker erscheint damit nicht als spekulative Zutat, sondern als Beschreibung dessen, was der operative Kanon v10.0.0 bereits teilweise verkörpert und was der Ascension-Track als Horizont offen hält.</w:t>
+      </w:r>
+    </w:p>
+    <w:p>
+      <w:pPr>
+        <w:spacing w:after="160" w:line="360" w:lineRule="auto"/>
+        <w:ind w:firstLine="425"/>
+      </w:pPr>
+      <w:r>
+        <w:rPr>
+          <w:rFonts w:ascii="Times New Roman" w:hAnsi="Times New Roman" w:eastAsia="Times New Roman"/>
+          <w:b w:val="0"/>
+          <w:i w:val="0"/>
+          <w:sz w:val="24"/>
+        </w:rPr>
+        <w:t>Historisch betrachtet knüpft der MasterSeed-Anker an die Linie Maturana/Varela, an kybernetische Second-Order-Ansätze und an die existenzphilosophische Frage an, wie Freiheit unter Faktizität möglich bleibt. Die Arbeit überträgt diese Linie auf ein konkretes sozio-technisches Artefakt mit Mesh, Konnektoren und Proof Registry. Dadurch wird der MasterSeed-Anker empirisch anschlussfähig: man kann Health-Endpunkte lesen, Manifeste hashen und Placement-Pläne evaluieren.</w:t>
+      </w:r>
+    </w:p>
+    <w:p>
+      <w:pPr>
+        <w:spacing w:after="160" w:line="360" w:lineRule="auto"/>
+        <w:ind w:firstLine="425"/>
+      </w:pPr>
+      <w:r>
+        <w:rPr>
+          <w:rFonts w:ascii="Times New Roman" w:hAnsi="Times New Roman" w:eastAsia="Times New Roman"/>
+          <w:b w:val="0"/>
+          <w:i w:val="0"/>
+          <w:sz w:val="24"/>
+        </w:rPr>
+        <w:t>Methodisch verlangt der MasterSeed-Anker eine Doppelkompetenz. Einerseits begriffliche Strenge: Definitionen, Kriterien, Normen, Thesentafeln. Andererseits operative Nähe: Hot-Runs, Tailscale-Status, Dashboard-Atmung, Coordinator-Drift-Score. Nur die Verbindung verhindert, dass der MasterSeed-Anker zur bloßen Rhetorik oder zum bloßen Betrieb ohne Sinn schrumpft.</w:t>
+      </w:r>
+    </w:p>
+    <w:p>
+      <w:pPr>
+        <w:spacing w:after="160" w:line="360" w:lineRule="auto"/>
+        <w:ind w:firstLine="425"/>
+      </w:pPr>
+      <w:r>
+        <w:rPr>
+          <w:rFonts w:ascii="Times New Roman" w:hAnsi="Times New Roman" w:eastAsia="Times New Roman"/>
+          <w:b w:val="0"/>
+          <w:i w:val="0"/>
+          <w:sz w:val="24"/>
+        </w:rPr>
+        <w:t>Kritisch ist festzuhalten, dass der MasterSeed-Anker keine Heilslehre ist. OFFENE Beweise, offline Nodes, DNS-Warnungen und Namenskollisionen im Academia-Raum gehören zur Realität des Systems. Gerade die Integration dieser Störungen in die Selbstbeschreibung – statt ihrer Verdrängung – macht der MasterSeed-Anker wissenschaftsfähig.</w:t>
+      </w:r>
+    </w:p>
+    <w:p>
+      <w:pPr>
+        <w:spacing w:after="160" w:line="360" w:lineRule="auto"/>
+        <w:ind w:firstLine="425"/>
+      </w:pPr>
+      <w:r>
+        <w:rPr>
+          <w:rFonts w:ascii="Times New Roman" w:hAnsi="Times New Roman" w:eastAsia="Times New Roman"/>
+          <w:b w:val="0"/>
+          <w:i w:val="0"/>
+          <w:sz w:val="24"/>
+        </w:rPr>
+        <w:t>Praktisch folgt aus der MasterSeed-Anker eine Reihe von Gestaltungsmaximen: Inhouse-Wahrheit schützen, SaaS membranisieren, schwere Last clusterisieren, interaktive Souveränität am Mainframe belassen, Consent fail-closed halten, Archive deduplizieren ohne Amnesie. Diese Maximen sind in mesh_service_coordination.yaml und verwandten Artefakten bereits als Verfassungsskizze hinterlegt.</w:t>
+      </w:r>
+    </w:p>
+    <w:p>
+      <w:pPr>
+        <w:spacing w:after="160" w:line="360" w:lineRule="auto"/>
+        <w:ind w:firstLine="425"/>
+      </w:pPr>
+      <w:r>
+        <w:rPr>
+          <w:rFonts w:ascii="Times New Roman" w:hAnsi="Times New Roman" w:eastAsia="Times New Roman"/>
+          <w:b w:val="0"/>
+          <w:i w:val="0"/>
+          <w:sz w:val="24"/>
+        </w:rPr>
+        <w:t>Perspektivisch öffnet der MasterSeed-Anker eine Forschungsagenda, die über das Einzelrepo hinausweist: policy-as-code, formal enggeführte Fixpunkt-Scopes, phone-seitige Curriculum-Exporte, peer-reviewbare Archivreihen und eine rechtlich robuste Consent-Schicht. Die Dissertation setzt den Anfangsstein; der Sisyphos-Zyklus setzt die Fortsetzung.</w:t>
+      </w:r>
+    </w:p>
+    <w:p>
+      <w:pPr>
+        <w:spacing w:after="160" w:line="360" w:lineRule="auto"/>
+        <w:ind w:firstLine="425"/>
+      </w:pPr>
+      <w:r>
+        <w:rPr>
+          <w:rFonts w:ascii="Times New Roman" w:hAnsi="Times New Roman" w:eastAsia="Times New Roman"/>
+          <w:b w:val="0"/>
+          <w:i w:val="0"/>
+          <w:sz w:val="24"/>
+        </w:rPr>
+        <w:t>Im Verhältnis zum Heroismus-Korpus bedeutet der MasterSeed-Anker, dass Eudaimonia nicht als Gefühlsbilanz, sondern als Fähigkeit zur rekursiven Selbstkorrektur unter Bruch und Wiederholung gelesen wird. Axiom I liefert den Schlamm, Axiom II den Körper, Axiom III den Bruch, Axiom IV die Closure. der MasterSeed-Anker ist die systemtheoretische Klammer um diese existenzielle Architektur.</w:t>
+      </w:r>
+    </w:p>
+    <w:p>
+      <w:pPr>
+        <w:spacing w:after="160" w:line="360" w:lineRule="auto"/>
+        <w:ind w:firstLine="425"/>
+      </w:pPr>
+      <w:r>
+        <w:rPr>
+          <w:rFonts w:ascii="Times New Roman" w:hAnsi="Times New Roman" w:eastAsia="Times New Roman"/>
+          <w:b w:val="0"/>
+          <w:i w:val="0"/>
+          <w:sz w:val="24"/>
+        </w:rPr>
+        <w:t>Im Verhältnis zur Mathematik bedeutet der MasterSeed-Anker, Optimierung und Beweislast zusammenzudenken. QUBO und Annealing entscheiden unter Knappheit; die Proof Registry entscheidet unter Wahrheitsknappheit. Beide Knappheiten sind Organe derselben Schließung: ohne sie driftet das System in Beliebigkeit oder Dogma.</w:t>
+      </w:r>
+    </w:p>
+    <w:p>
+      <w:pPr>
+        <w:pStyle w:val="Heading2"/>
+      </w:pPr>
+      <w:r>
+        <w:rPr>
+          <w:rFonts w:ascii="Times New Roman" w:hAnsi="Times New Roman" w:eastAsia="Times New Roman"/>
+          <w:b/>
+          <w:i w:val="0"/>
+          <w:sz w:val="28"/>
+        </w:rPr>
+        <w:t>II.4 CEC und die Ethik der kontraktiven Evolution</w:t>
+      </w:r>
+    </w:p>
+    <w:p>
+      <w:pPr>
+        <w:spacing w:after="160" w:line="360" w:lineRule="auto"/>
+        <w:ind w:firstLine="425"/>
+      </w:pPr>
+      <w:r>
+        <w:rPr>
+          <w:rFonts w:ascii="Times New Roman" w:hAnsi="Times New Roman" w:eastAsia="Times New Roman"/>
+          <w:b w:val="0"/>
+          <w:i w:val="0"/>
+          <w:sz w:val="24"/>
+        </w:rPr>
+        <w:t>Im Zentrum von CEC steht die Einsicht, dass Systeme ihre eigene Fortsetzbarkeit organisieren müssen, wenn sie mehr sein wollen als flüchtige Toolchains. Fusion Hero OS demonstriert dies, indem es Produktion, Prüfung und Archivierung zu einem Kreis schließt. CEC erscheint damit nicht als spekulative Zutat, sondern als Beschreibung dessen, was der operative Kanon v10.0.0 bereits teilweise verkörpert und was der Ascension-Track als Horizont offen hält.</w:t>
+      </w:r>
+    </w:p>
+    <w:p>
+      <w:pPr>
+        <w:spacing w:after="160" w:line="360" w:lineRule="auto"/>
+        <w:ind w:firstLine="425"/>
+      </w:pPr>
+      <w:r>
+        <w:rPr>
+          <w:rFonts w:ascii="Times New Roman" w:hAnsi="Times New Roman" w:eastAsia="Times New Roman"/>
+          <w:b w:val="0"/>
+          <w:i w:val="0"/>
+          <w:sz w:val="24"/>
+        </w:rPr>
+        <w:t>Historisch betrachtet knüpft CEC an die Linie Maturana/Varela, an kybernetische Second-Order-Ansätze und an die existenzphilosophische Frage an, wie Freiheit unter Faktizität möglich bleibt. Die Arbeit überträgt diese Linie auf ein konkretes sozio-technisches Artefakt mit Mesh, Konnektoren und Proof Registry. Dadurch wird CEC empirisch anschlussfähig: man kann Health-Endpunkte lesen, Manifeste hashen und Placement-Pläne evaluieren.</w:t>
+      </w:r>
+    </w:p>
+    <w:p>
+      <w:pPr>
+        <w:spacing w:after="160" w:line="360" w:lineRule="auto"/>
+        <w:ind w:firstLine="425"/>
+      </w:pPr>
+      <w:r>
+        <w:rPr>
+          <w:rFonts w:ascii="Times New Roman" w:hAnsi="Times New Roman" w:eastAsia="Times New Roman"/>
+          <w:b w:val="0"/>
+          <w:i w:val="0"/>
+          <w:sz w:val="24"/>
+        </w:rPr>
+        <w:t>Methodisch verlangt CEC eine Doppelkompetenz. Einerseits begriffliche Strenge: Definitionen, Kriterien, Normen, Thesentafeln. Andererseits operative Nähe: Hot-Runs, Tailscale-Status, Dashboard-Atmung, Coordinator-Drift-Score. Nur die Verbindung verhindert, dass CEC zur bloßen Rhetorik oder zum bloßen Betrieb ohne Sinn schrumpft.</w:t>
+      </w:r>
+    </w:p>
+    <w:p>
+      <w:pPr>
+        <w:spacing w:after="160" w:line="360" w:lineRule="auto"/>
+        <w:ind w:firstLine="425"/>
+      </w:pPr>
+      <w:r>
+        <w:rPr>
+          <w:rFonts w:ascii="Times New Roman" w:hAnsi="Times New Roman" w:eastAsia="Times New Roman"/>
+          <w:b w:val="0"/>
+          <w:i w:val="0"/>
+          <w:sz w:val="24"/>
+        </w:rPr>
+        <w:t>Kritisch ist festzuhalten, dass CEC keine Heilslehre ist. OFFENE Beweise, offline Nodes, DNS-Warnungen und Namenskollisionen im Academia-Raum gehören zur Realität des Systems. Gerade die Integration dieser Störungen in die Selbstbeschreibung – statt ihrer Verdrängung – macht CEC wissenschaftsfähig.</w:t>
+      </w:r>
+    </w:p>
+    <w:p>
+      <w:pPr>
+        <w:spacing w:after="160" w:line="360" w:lineRule="auto"/>
+        <w:ind w:firstLine="425"/>
+      </w:pPr>
+      <w:r>
+        <w:rPr>
+          <w:rFonts w:ascii="Times New Roman" w:hAnsi="Times New Roman" w:eastAsia="Times New Roman"/>
+          <w:b w:val="0"/>
+          <w:i w:val="0"/>
+          <w:sz w:val="24"/>
+        </w:rPr>
+        <w:t>Praktisch folgt aus CEC eine Reihe von Gestaltungsmaximen: Inhouse-Wahrheit schützen, SaaS membranisieren, schwere Last clusterisieren, interaktive Souveränität am Mainframe belassen, Consent fail-closed halten, Archive deduplizieren ohne Amnesie. Diese Maximen sind in mesh_service_coordination.yaml und verwandten Artefakten bereits als Verfassungsskizze hinterlegt.</w:t>
+      </w:r>
+    </w:p>
+    <w:p>
+      <w:pPr>
+        <w:spacing w:after="160" w:line="360" w:lineRule="auto"/>
+        <w:ind w:firstLine="425"/>
+      </w:pPr>
+      <w:r>
+        <w:rPr>
+          <w:rFonts w:ascii="Times New Roman" w:hAnsi="Times New Roman" w:eastAsia="Times New Roman"/>
+          <w:b w:val="0"/>
+          <w:i w:val="0"/>
+          <w:sz w:val="24"/>
+        </w:rPr>
+        <w:t>Perspektivisch öffnet CEC eine Forschungsagenda, die über das Einzelrepo hinausweist: policy-as-code, formal enggeführte Fixpunkt-Scopes, phone-seitige Curriculum-Exporte, peer-reviewbare Archivreihen und eine rechtlich robuste Consent-Schicht. Die Dissertation setzt den Anfangsstein; der Sisyphos-Zyklus setzt die Fortsetzung.</w:t>
+      </w:r>
+    </w:p>
+    <w:p>
+      <w:pPr>
+        <w:spacing w:after="160" w:line="360" w:lineRule="auto"/>
+        <w:ind w:firstLine="425"/>
+      </w:pPr>
+      <w:r>
+        <w:rPr>
+          <w:rFonts w:ascii="Times New Roman" w:hAnsi="Times New Roman" w:eastAsia="Times New Roman"/>
+          <w:b w:val="0"/>
+          <w:i w:val="0"/>
+          <w:sz w:val="24"/>
+        </w:rPr>
+        <w:t>Im Verhältnis zum Heroismus-Korpus bedeutet CEC, dass Eudaimonia nicht als Gefühlsbilanz, sondern als Fähigkeit zur rekursiven Selbstkorrektur unter Bruch und Wiederholung gelesen wird. Axiom I liefert den Schlamm, Axiom II den Körper, Axiom III den Bruch, Axiom IV die Closure. CEC ist die systemtheoretische Klammer um diese existenzielle Architektur.</w:t>
+      </w:r>
+    </w:p>
+    <w:p>
+      <w:pPr>
+        <w:spacing w:after="160" w:line="360" w:lineRule="auto"/>
+        <w:ind w:firstLine="425"/>
+      </w:pPr>
+      <w:r>
+        <w:rPr>
+          <w:rFonts w:ascii="Times New Roman" w:hAnsi="Times New Roman" w:eastAsia="Times New Roman"/>
+          <w:b w:val="0"/>
+          <w:i w:val="0"/>
+          <w:sz w:val="24"/>
+        </w:rPr>
+        <w:t>Im Verhältnis zur Mathematik bedeutet CEC, Optimierung und Beweislast zusammenzudenken. QUBO und Annealing entscheiden unter Knappheit; die Proof Registry entscheidet unter Wahrheitsknappheit. Beide Knappheiten sind Organe derselben Schließung: ohne sie driftet das System in Beliebigkeit oder Dogma.</w:t>
+      </w:r>
+    </w:p>
+    <w:p>
+      <w:pPr>
+        <w:pStyle w:val="Heading2"/>
+      </w:pPr>
+      <w:r>
+        <w:rPr>
+          <w:rFonts w:ascii="Times New Roman" w:hAnsi="Times New Roman" w:eastAsia="Times New Roman"/>
+          <w:b/>
+          <w:i w:val="0"/>
+          <w:sz w:val="28"/>
+        </w:rPr>
+        <w:t>II.5 Sisyphos, CI und die Temporalität der Regeneration</w:t>
+      </w:r>
+    </w:p>
+    <w:p>
+      <w:pPr>
+        <w:spacing w:after="160" w:line="360" w:lineRule="auto"/>
+        <w:ind w:firstLine="425"/>
+      </w:pPr>
+      <w:r>
+        <w:rPr>
+          <w:rFonts w:ascii="Times New Roman" w:hAnsi="Times New Roman" w:eastAsia="Times New Roman"/>
+          <w:b w:val="0"/>
+          <w:i w:val="0"/>
+          <w:sz w:val="24"/>
+        </w:rPr>
+        <w:t>Im Zentrum von der Sisyphos-Zyklus steht die Einsicht, dass Systeme ihre eigene Fortsetzbarkeit organisieren müssen, wenn sie mehr sein wollen als flüchtige Toolchains. Fusion Hero OS demonstriert dies, indem es Produktion, Prüfung und Archivierung zu einem Kreis schließt. der Sisyphos-Zyklus erscheint damit nicht als spekulative Zutat, sondern als Beschreibung dessen, was der operative Kanon v10.0.0 bereits teilweise verkörpert und was der Ascension-Track als Horizont offen hält.</w:t>
+      </w:r>
+    </w:p>
+    <w:p>
+      <w:pPr>
+        <w:spacing w:after="160" w:line="360" w:lineRule="auto"/>
+        <w:ind w:firstLine="425"/>
+      </w:pPr>
+      <w:r>
+        <w:rPr>
+          <w:rFonts w:ascii="Times New Roman" w:hAnsi="Times New Roman" w:eastAsia="Times New Roman"/>
+          <w:b w:val="0"/>
+          <w:i w:val="0"/>
+          <w:sz w:val="24"/>
+        </w:rPr>
+        <w:t>Historisch betrachtet knüpft der Sisyphos-Zyklus an die Linie Maturana/Varela, an kybernetische Second-Order-Ansätze und an die existenzphilosophische Frage an, wie Freiheit unter Faktizität möglich bleibt. Die Arbeit überträgt diese Linie auf ein konkretes sozio-technisches Artefakt mit Mesh, Konnektoren und Proof Registry. Dadurch wird der Sisyphos-Zyklus empirisch anschlussfähig: man kann Health-Endpunkte lesen, Manifeste hashen und Placement-Pläne evaluieren.</w:t>
+      </w:r>
+    </w:p>
+    <w:p>
+      <w:pPr>
+        <w:spacing w:after="160" w:line="360" w:lineRule="auto"/>
+        <w:ind w:firstLine="425"/>
+      </w:pPr>
+      <w:r>
+        <w:rPr>
+          <w:rFonts w:ascii="Times New Roman" w:hAnsi="Times New Roman" w:eastAsia="Times New Roman"/>
+          <w:b w:val="0"/>
+          <w:i w:val="0"/>
+          <w:sz w:val="24"/>
+        </w:rPr>
+        <w:t>Methodisch verlangt der Sisyphos-Zyklus eine Doppelkompetenz. Einerseits begriffliche Strenge: Definitionen, Kriterien, Normen, Thesentafeln. Andererseits operative Nähe: Hot-Runs, Tailscale-Status, Dashboard-Atmung, Coordinator-Drift-Score. Nur die Verbindung verhindert, dass der Sisyphos-Zyklus zur bloßen Rhetorik oder zum bloßen Betrieb ohne Sinn schrumpft.</w:t>
+      </w:r>
+    </w:p>
+    <w:p>
+      <w:pPr>
+        <w:spacing w:after="160" w:line="360" w:lineRule="auto"/>
+        <w:ind w:firstLine="425"/>
+      </w:pPr>
+      <w:r>
+        <w:rPr>
+          <w:rFonts w:ascii="Times New Roman" w:hAnsi="Times New Roman" w:eastAsia="Times New Roman"/>
+          <w:b w:val="0"/>
+          <w:i w:val="0"/>
+          <w:sz w:val="24"/>
+        </w:rPr>
+        <w:t>Kritisch ist festzuhalten, dass der Sisyphos-Zyklus keine Heilslehre ist. OFFENE Beweise, offline Nodes, DNS-Warnungen und Namenskollisionen im Academia-Raum gehören zur Realität des Systems. Gerade die Integration dieser Störungen in die Selbstbeschreibung – statt ihrer Verdrängung – macht der Sisyphos-Zyklus wissenschaftsfähig.</w:t>
+      </w:r>
+    </w:p>
+    <w:p>
+      <w:pPr>
+        <w:spacing w:after="160" w:line="360" w:lineRule="auto"/>
+        <w:ind w:firstLine="425"/>
+      </w:pPr>
+      <w:r>
+        <w:rPr>
+          <w:rFonts w:ascii="Times New Roman" w:hAnsi="Times New Roman" w:eastAsia="Times New Roman"/>
+          <w:b w:val="0"/>
+          <w:i w:val="0"/>
+          <w:sz w:val="24"/>
+        </w:rPr>
+        <w:t>Praktisch folgt aus der Sisyphos-Zyklus eine Reihe von Gestaltungsmaximen: Inhouse-Wahrheit schützen, SaaS membranisieren, schwere Last clusterisieren, interaktive Souveränität am Mainframe belassen, Consent fail-closed halten, Archive deduplizieren ohne Amnesie. Diese Maximen sind in mesh_service_coordination.yaml und verwandten Artefakten bereits als Verfassungsskizze hinterlegt.</w:t>
+      </w:r>
+    </w:p>
+    <w:p>
+      <w:pPr>
+        <w:spacing w:after="160" w:line="360" w:lineRule="auto"/>
+        <w:ind w:firstLine="425"/>
+      </w:pPr>
+      <w:r>
+        <w:rPr>
+          <w:rFonts w:ascii="Times New Roman" w:hAnsi="Times New Roman" w:eastAsia="Times New Roman"/>
+          <w:b w:val="0"/>
+          <w:i w:val="0"/>
+          <w:sz w:val="24"/>
+        </w:rPr>
+        <w:t>Perspektivisch öffnet der Sisyphos-Zyklus eine Forschungsagenda, die über das Einzelrepo hinausweist: policy-as-code, formal enggeführte Fixpunkt-Scopes, phone-seitige Curriculum-Exporte, peer-reviewbare Archivreihen und eine rechtlich robuste Consent-Schicht. Die Dissertation setzt den Anfangsstein; der Sisyphos-Zyklus setzt die Fortsetzung.</w:t>
+      </w:r>
+    </w:p>
+    <w:p>
+      <w:pPr>
+        <w:spacing w:after="160" w:line="360" w:lineRule="auto"/>
+        <w:ind w:firstLine="425"/>
+      </w:pPr>
+      <w:r>
+        <w:rPr>
+          <w:rFonts w:ascii="Times New Roman" w:hAnsi="Times New Roman" w:eastAsia="Times New Roman"/>
+          <w:b w:val="0"/>
+          <w:i w:val="0"/>
+          <w:sz w:val="24"/>
+        </w:rPr>
+        <w:t>Im Verhältnis zum Heroismus-Korpus bedeutet der Sisyphos-Zyklus, dass Eudaimonia nicht als Gefühlsbilanz, sondern als Fähigkeit zur rekursiven Selbstkorrektur unter Bruch und Wiederholung gelesen wird. Axiom I liefert den Schlamm, Axiom II den Körper, Axiom III den Bruch, Axiom IV die Closure. der Sisyphos-Zyklus ist die systemtheoretische Klammer um diese existenzielle Architektur.</w:t>
+      </w:r>
+    </w:p>
+    <w:p>
+      <w:pPr>
+        <w:spacing w:after="160" w:line="360" w:lineRule="auto"/>
+        <w:ind w:firstLine="425"/>
+      </w:pPr>
+      <w:r>
+        <w:rPr>
+          <w:rFonts w:ascii="Times New Roman" w:hAnsi="Times New Roman" w:eastAsia="Times New Roman"/>
+          <w:b w:val="0"/>
+          <w:i w:val="0"/>
+          <w:sz w:val="24"/>
+        </w:rPr>
+        <w:t>Im Verhältnis zur Mathematik bedeutet der Sisyphos-Zyklus, Optimierung und Beweislast zusammenzudenken. QUBO und Annealing entscheiden unter Knappheit; die Proof Registry entscheidet unter Wahrheitsknappheit. Beide Knappheiten sind Organe derselben Schließung: ohne sie driftet das System in Beliebigkeit oder Dogma.</w:t>
+      </w:r>
+    </w:p>
+    <w:p>
+      <w:pPr>
+        <w:pStyle w:val="Heading2"/>
+      </w:pPr>
+      <w:r>
+        <w:rPr>
+          <w:rFonts w:ascii="Times New Roman" w:hAnsi="Times New Roman" w:eastAsia="Times New Roman"/>
+          <w:b/>
+          <w:i w:val="0"/>
+          <w:sz w:val="28"/>
+        </w:rPr>
+        <w:t>II.6 Layer-Registry und fraktale Replikation</w:t>
+      </w:r>
+    </w:p>
+    <w:p>
+      <w:pPr>
+        <w:spacing w:after="160" w:line="360" w:lineRule="auto"/>
+        <w:ind w:firstLine="425"/>
+      </w:pPr>
+      <w:r>
+        <w:rPr>
+          <w:rFonts w:ascii="Times New Roman" w:hAnsi="Times New Roman" w:eastAsia="Times New Roman"/>
+          <w:b w:val="0"/>
+          <w:i w:val="0"/>
+          <w:sz w:val="24"/>
+        </w:rPr>
+        <w:t>Im Zentrum von die Layer- und Fraktalorganisation steht die Einsicht, dass Systeme ihre eigene Fortsetzbarkeit organisieren müssen, wenn sie mehr sein wollen als flüchtige Toolchains. Fusion Hero OS demonstriert dies, indem es Produktion, Prüfung und Archivierung zu einem Kreis schließt. die Layer- und Fraktalorganisation erscheint damit nicht als spekulative Zutat, sondern als Beschreibung dessen, was der operative Kanon v10.0.0 bereits teilweise verkörpert und was der Ascension-Track als Horizont offen hält.</w:t>
+      </w:r>
+    </w:p>
+    <w:p>
+      <w:pPr>
+        <w:spacing w:after="160" w:line="360" w:lineRule="auto"/>
+        <w:ind w:firstLine="425"/>
+      </w:pPr>
+      <w:r>
+        <w:rPr>
+          <w:rFonts w:ascii="Times New Roman" w:hAnsi="Times New Roman" w:eastAsia="Times New Roman"/>
+          <w:b w:val="0"/>
+          <w:i w:val="0"/>
+          <w:sz w:val="24"/>
+        </w:rPr>
+        <w:t>Historisch betrachtet knüpft die Layer- und Fraktalorganisation an die Linie Maturana/Varela, an kybernetische Second-Order-Ansätze und an die existenzphilosophische Frage an, wie Freiheit unter Faktizität möglich bleibt. Die Arbeit überträgt diese Linie auf ein konkretes sozio-technisches Artefakt mit Mesh, Konnektoren und Proof Registry. Dadurch wird die Layer- und Fraktalorganisation empirisch anschlussfähig: man kann Health-Endpunkte lesen, Manifeste hashen und Placement-Pläne evaluieren.</w:t>
+      </w:r>
+    </w:p>
+    <w:p>
+      <w:pPr>
+        <w:spacing w:after="160" w:line="360" w:lineRule="auto"/>
+        <w:ind w:firstLine="425"/>
+      </w:pPr>
+      <w:r>
+        <w:rPr>
+          <w:rFonts w:ascii="Times New Roman" w:hAnsi="Times New Roman" w:eastAsia="Times New Roman"/>
+          <w:b w:val="0"/>
+          <w:i w:val="0"/>
+          <w:sz w:val="24"/>
+        </w:rPr>
+        <w:t>Methodisch verlangt die Layer- und Fraktalorganisation eine Doppelkompetenz. Einerseits begriffliche Strenge: Definitionen, Kriterien, Normen, Thesentafeln. Andererseits operative Nähe: Hot-Runs, Tailscale-Status, Dashboard-Atmung, Coordinator-Drift-Score. Nur die Verbindung verhindert, dass die Layer- und Fraktalorganisation zur bloßen Rhetorik oder zum bloßen Betrieb ohne Sinn schrumpft.</w:t>
+      </w:r>
+    </w:p>
+    <w:p>
+      <w:pPr>
+        <w:spacing w:after="160" w:line="360" w:lineRule="auto"/>
+        <w:ind w:firstLine="425"/>
+      </w:pPr>
+      <w:r>
+        <w:rPr>
+          <w:rFonts w:ascii="Times New Roman" w:hAnsi="Times New Roman" w:eastAsia="Times New Roman"/>
+          <w:b w:val="0"/>
+          <w:i w:val="0"/>
+          <w:sz w:val="24"/>
+        </w:rPr>
+        <w:t>Kritisch ist festzuhalten, dass die Layer- und Fraktalorganisation keine Heilslehre ist. OFFENE Beweise, offline Nodes, DNS-Warnungen und Namenskollisionen im Academia-Raum gehören zur Realität des Systems. Gerade die Integration dieser Störungen in die Selbstbeschreibung – statt ihrer Verdrängung – macht die Layer- und Fraktalorganisation wissenschaftsfähig.</w:t>
+      </w:r>
+    </w:p>
+    <w:p>
+      <w:pPr>
+        <w:spacing w:after="160" w:line="360" w:lineRule="auto"/>
+        <w:ind w:firstLine="425"/>
+      </w:pPr>
+      <w:r>
+        <w:rPr>
+          <w:rFonts w:ascii="Times New Roman" w:hAnsi="Times New Roman" w:eastAsia="Times New Roman"/>
+          <w:b w:val="0"/>
+          <w:i w:val="0"/>
+          <w:sz w:val="24"/>
+        </w:rPr>
+        <w:t>Praktisch folgt aus die Layer- und Fraktalorganisation eine Reihe von Gestaltungsmaximen: Inhouse-Wahrheit schützen, SaaS membranisieren, schwere Last clusterisieren, interaktive Souveränität am Mainframe belassen, Consent fail-closed halten, Archive deduplizieren ohne Amnesie. Diese Maximen sind in mesh_service_coordination.yaml und verwandten Artefakten bereits als Verfassungsskizze hinterlegt.</w:t>
+      </w:r>
+    </w:p>
+    <w:p>
+      <w:pPr>
+        <w:spacing w:after="160" w:line="360" w:lineRule="auto"/>
+        <w:ind w:firstLine="425"/>
+      </w:pPr>
+      <w:r>
+        <w:rPr>
+          <w:rFonts w:ascii="Times New Roman" w:hAnsi="Times New Roman" w:eastAsia="Times New Roman"/>
+          <w:b w:val="0"/>
+          <w:i w:val="0"/>
+          <w:sz w:val="24"/>
+        </w:rPr>
+        <w:t>Perspektivisch öffnet die Layer- und Fraktalorganisation eine Forschungsagenda, die über das Einzelrepo hinausweist: policy-as-code, formal enggeführte Fixpunkt-Scopes, phone-seitige Curriculum-Exporte, peer-reviewbare Archivreihen und eine rechtlich robuste Consent-Schicht. Die Dissertation setzt den Anfangsstein; der Sisyphos-Zyklus setzt die Fortsetzung.</w:t>
+      </w:r>
+    </w:p>
+    <w:p>
+      <w:pPr>
+        <w:spacing w:after="160" w:line="360" w:lineRule="auto"/>
+        <w:ind w:firstLine="425"/>
+      </w:pPr>
+      <w:r>
+        <w:rPr>
+          <w:rFonts w:ascii="Times New Roman" w:hAnsi="Times New Roman" w:eastAsia="Times New Roman"/>
+          <w:b w:val="0"/>
+          <w:i w:val="0"/>
+          <w:sz w:val="24"/>
+        </w:rPr>
+        <w:t>Im Verhältnis zum Heroismus-Korpus bedeutet die Layer- und Fraktalorganisation, dass Eudaimonia nicht als Gefühlsbilanz, sondern als Fähigkeit zur rekursiven Selbstkorrektur unter Bruch und Wiederholung gelesen wird. Axiom I liefert den Schlamm, Axiom II den Körper, Axiom III den Bruch, Axiom IV die Closure. die Layer- und Fraktalorganisation ist die systemtheoretische Klammer um diese existenzielle Architektur.</w:t>
+      </w:r>
+    </w:p>
+    <w:p>
+      <w:pPr>
+        <w:spacing w:after="160" w:line="360" w:lineRule="auto"/>
+        <w:ind w:firstLine="425"/>
+      </w:pPr>
+      <w:r>
+        <w:rPr>
+          <w:rFonts w:ascii="Times New Roman" w:hAnsi="Times New Roman" w:eastAsia="Times New Roman"/>
+          <w:b w:val="0"/>
+          <w:i w:val="0"/>
+          <w:sz w:val="24"/>
+        </w:rPr>
+        <w:t>Im Verhältnis zur Mathematik bedeutet die Layer- und Fraktalorganisation, Optimierung und Beweislast zusammenzudenken. QUBO und Annealing entscheiden unter Knappheit; die Proof Registry entscheidet unter Wahrheitsknappheit. Beide Knappheiten sind Organe derselben Schließung: ohne sie driftet das System in Beliebigkeit oder Dogma.</w:t>
+      </w:r>
+    </w:p>
+    <w:p>
+      <w:pPr>
+        <w:pStyle w:val="Heading2"/>
+      </w:pPr>
+      <w:r>
+        <w:rPr>
+          <w:rFonts w:ascii="Times New Roman" w:hAnsi="Times New Roman" w:eastAsia="Times New Roman"/>
+          <w:b/>
+          <w:i w:val="0"/>
+          <w:sz w:val="28"/>
+        </w:rPr>
+        <w:t>II.7 Placement-Tiers als Räume der Gewaltenteilung</w:t>
+      </w:r>
+    </w:p>
+    <w:p>
+      <w:pPr>
+        <w:spacing w:after="160" w:line="360" w:lineRule="auto"/>
+        <w:ind w:firstLine="425"/>
+      </w:pPr>
+      <w:r>
+        <w:rPr>
+          <w:rFonts w:ascii="Times New Roman" w:hAnsi="Times New Roman" w:eastAsia="Times New Roman"/>
+          <w:b w:val="0"/>
+          <w:i w:val="0"/>
+          <w:sz w:val="24"/>
+        </w:rPr>
+        <w:t>Im Zentrum von das Placement-Regime steht die Einsicht, dass Systeme ihre eigene Fortsetzbarkeit organisieren müssen, wenn sie mehr sein wollen als flüchtige Toolchains. Fusion Hero OS demonstriert dies, indem es Produktion, Prüfung und Archivierung zu einem Kreis schließt. das Placement-Regime erscheint damit nicht als spekulative Zutat, sondern als Beschreibung dessen, was der operative Kanon v10.0.0 bereits teilweise verkörpert und was der Ascension-Track als Horizont offen hält.</w:t>
+      </w:r>
+    </w:p>
+    <w:p>
+      <w:pPr>
+        <w:spacing w:after="160" w:line="360" w:lineRule="auto"/>
+        <w:ind w:firstLine="425"/>
+      </w:pPr>
+      <w:r>
+        <w:rPr>
+          <w:rFonts w:ascii="Times New Roman" w:hAnsi="Times New Roman" w:eastAsia="Times New Roman"/>
+          <w:b w:val="0"/>
+          <w:i w:val="0"/>
+          <w:sz w:val="24"/>
+        </w:rPr>
+        <w:t>Historisch betrachtet knüpft das Placement-Regime an die Linie Maturana/Varela, an kybernetische Second-Order-Ansätze und an die existenzphilosophische Frage an, wie Freiheit unter Faktizität möglich bleibt. Die Arbeit überträgt diese Linie auf ein konkretes sozio-technisches Artefakt mit Mesh, Konnektoren und Proof Registry. Dadurch wird das Placement-Regime empirisch anschlussfähig: man kann Health-Endpunkte lesen, Manifeste hashen und Placement-Pläne evaluieren.</w:t>
+      </w:r>
+    </w:p>
+    <w:p>
+      <w:pPr>
+        <w:spacing w:after="160" w:line="360" w:lineRule="auto"/>
+        <w:ind w:firstLine="425"/>
+      </w:pPr>
+      <w:r>
+        <w:rPr>
+          <w:rFonts w:ascii="Times New Roman" w:hAnsi="Times New Roman" w:eastAsia="Times New Roman"/>
+          <w:b w:val="0"/>
+          <w:i w:val="0"/>
+          <w:sz w:val="24"/>
+        </w:rPr>
+        <w:t>Methodisch verlangt das Placement-Regime eine Doppelkompetenz. Einerseits begriffliche Strenge: Definitionen, Kriterien, Normen, Thesentafeln. Andererseits operative Nähe: Hot-Runs, Tailscale-Status, Dashboard-Atmung, Coordinator-Drift-Score. Nur die Verbindung verhindert, dass das Placement-Regime zur bloßen Rhetorik oder zum bloßen Betrieb ohne Sinn schrumpft.</w:t>
+      </w:r>
+    </w:p>
+    <w:p>
+      <w:pPr>
+        <w:spacing w:after="160" w:line="360" w:lineRule="auto"/>
+        <w:ind w:firstLine="425"/>
+      </w:pPr>
+      <w:r>
+        <w:rPr>
+          <w:rFonts w:ascii="Times New Roman" w:hAnsi="Times New Roman" w:eastAsia="Times New Roman"/>
+          <w:b w:val="0"/>
+          <w:i w:val="0"/>
+          <w:sz w:val="24"/>
+        </w:rPr>
+        <w:t>Kritisch ist festzuhalten, dass das Placement-Regime keine Heilslehre ist. OFFENE Beweise, offline Nodes, DNS-Warnungen und Namenskollisionen im Academia-Raum gehören zur Realität des Systems. Gerade die Integration dieser Störungen in die Selbstbeschreibung – statt ihrer Verdrängung – macht das Placement-Regime wissenschaftsfähig.</w:t>
+      </w:r>
+    </w:p>
+    <w:p>
+      <w:pPr>
+        <w:spacing w:after="160" w:line="360" w:lineRule="auto"/>
+        <w:ind w:firstLine="425"/>
+      </w:pPr>
+      <w:r>
+        <w:rPr>
+          <w:rFonts w:ascii="Times New Roman" w:hAnsi="Times New Roman" w:eastAsia="Times New Roman"/>
+          <w:b w:val="0"/>
+          <w:i w:val="0"/>
+          <w:sz w:val="24"/>
+        </w:rPr>
+        <w:t>Praktisch folgt aus das Placement-Regime eine Reihe von Gestaltungsmaximen: Inhouse-Wahrheit schützen, SaaS membranisieren, schwere Last clusterisieren, interaktive Souveränität am Mainframe belassen, Consent fail-closed halten, Archive deduplizieren ohne Amnesie. Diese Maximen sind in mesh_service_coordination.yaml und verwandten Artefakten bereits als Verfassungsskizze hinterlegt.</w:t>
+      </w:r>
+    </w:p>
+    <w:p>
+      <w:pPr>
+        <w:spacing w:after="160" w:line="360" w:lineRule="auto"/>
+        <w:ind w:firstLine="425"/>
+      </w:pPr>
+      <w:r>
+        <w:rPr>
+          <w:rFonts w:ascii="Times New Roman" w:hAnsi="Times New Roman" w:eastAsia="Times New Roman"/>
+          <w:b w:val="0"/>
+          <w:i w:val="0"/>
+          <w:sz w:val="24"/>
+        </w:rPr>
+        <w:t>Perspektivisch öffnet das Placement-Regime eine Forschungsagenda, die über das Einzelrepo hinausweist: policy-as-code, formal enggeführte Fixpunkt-Scopes, phone-seitige Curriculum-Exporte, peer-reviewbare Archivreihen und eine rechtlich robuste Consent-Schicht. Die Dissertation setzt den Anfangsstein; der Sisyphos-Zyklus setzt die Fortsetzung.</w:t>
+      </w:r>
+    </w:p>
+    <w:p>
+      <w:pPr>
+        <w:spacing w:after="160" w:line="360" w:lineRule="auto"/>
+        <w:ind w:firstLine="425"/>
+      </w:pPr>
+      <w:r>
+        <w:rPr>
+          <w:rFonts w:ascii="Times New Roman" w:hAnsi="Times New Roman" w:eastAsia="Times New Roman"/>
+          <w:b w:val="0"/>
+          <w:i w:val="0"/>
+          <w:sz w:val="24"/>
+        </w:rPr>
+        <w:t>Im Verhältnis zum Heroismus-Korpus bedeutet das Placement-Regime, dass Eudaimonia nicht als Gefühlsbilanz, sondern als Fähigkeit zur rekursiven Selbstkorrektur unter Bruch und Wiederholung gelesen wird. Axiom I liefert den Schlamm, Axiom II den Körper, Axiom III den Bruch, Axiom IV die Closure. das Placement-Regime ist die systemtheoretische Klammer um diese existenzielle Architektur.</w:t>
+      </w:r>
+    </w:p>
+    <w:p>
+      <w:pPr>
+        <w:spacing w:after="160" w:line="360" w:lineRule="auto"/>
+        <w:ind w:firstLine="425"/>
+      </w:pPr>
+      <w:r>
+        <w:rPr>
+          <w:rFonts w:ascii="Times New Roman" w:hAnsi="Times New Roman" w:eastAsia="Times New Roman"/>
+          <w:b w:val="0"/>
+          <w:i w:val="0"/>
+          <w:sz w:val="24"/>
+        </w:rPr>
+        <w:t>Im Verhältnis zur Mathematik bedeutet das Placement-Regime, Optimierung und Beweislast zusammenzudenken. QUBO und Annealing entscheiden unter Knappheit; die Proof Registry entscheidet unter Wahrheitsknappheit. Beide Knappheiten sind Organe derselben Schließung: ohne sie driftet das System in Beliebigkeit oder Dogma.</w:t>
+      </w:r>
+    </w:p>
+    <w:p>
+      <w:pPr>
+        <w:pStyle w:val="Heading2"/>
+      </w:pPr>
+      <w:r>
+        <w:rPr>
+          <w:rFonts w:ascii="Times New Roman" w:hAnsi="Times New Roman" w:eastAsia="Times New Roman"/>
+          <w:b/>
+          <w:i w:val="0"/>
+          <w:sz w:val="28"/>
+        </w:rPr>
+        <w:t>II.8 MCP-Membranen und die Moral der Konnektoren</w:t>
+      </w:r>
+    </w:p>
+    <w:p>
+      <w:pPr>
+        <w:spacing w:after="160" w:line="360" w:lineRule="auto"/>
+        <w:ind w:firstLine="425"/>
+      </w:pPr>
+      <w:r>
+        <w:rPr>
+          <w:rFonts w:ascii="Times New Roman" w:hAnsi="Times New Roman" w:eastAsia="Times New Roman"/>
+          <w:b w:val="0"/>
+          <w:i w:val="0"/>
+          <w:sz w:val="24"/>
+        </w:rPr>
+        <w:t>Im Zentrum von die Konnektor-Membran steht die Einsicht, dass Systeme ihre eigene Fortsetzbarkeit organisieren müssen, wenn sie mehr sein wollen als flüchtige Toolchains. Fusion Hero OS demonstriert dies, indem es Produktion, Prüfung und Archivierung zu einem Kreis schließt. die Konnektor-Membran erscheint damit nicht als spekulative Zutat, sondern als Beschreibung dessen, was der operative Kanon v10.0.0 bereits teilweise verkörpert und was der Ascension-Track als Horizont offen hält.</w:t>
+      </w:r>
+    </w:p>
+    <w:p>
+      <w:pPr>
+        <w:spacing w:after="160" w:line="360" w:lineRule="auto"/>
+        <w:ind w:firstLine="425"/>
+      </w:pPr>
+      <w:r>
+        <w:rPr>
+          <w:rFonts w:ascii="Times New Roman" w:hAnsi="Times New Roman" w:eastAsia="Times New Roman"/>
+          <w:b w:val="0"/>
+          <w:i w:val="0"/>
+          <w:sz w:val="24"/>
+        </w:rPr>
+        <w:t>Historisch betrachtet knüpft die Konnektor-Membran an die Linie Maturana/Varela, an kybernetische Second-Order-Ansätze und an die existenzphilosophische Frage an, wie Freiheit unter Faktizität möglich bleibt. Die Arbeit überträgt diese Linie auf ein konkretes sozio-technisches Artefakt mit Mesh, Konnektoren und Proof Registry. Dadurch wird die Konnektor-Membran empirisch anschlussfähig: man kann Health-Endpunkte lesen, Manifeste hashen und Placement-Pläne evaluieren.</w:t>
+      </w:r>
+    </w:p>
+    <w:p>
+      <w:pPr>
+        <w:spacing w:after="160" w:line="360" w:lineRule="auto"/>
+        <w:ind w:firstLine="425"/>
+      </w:pPr>
+      <w:r>
+        <w:rPr>
+          <w:rFonts w:ascii="Times New Roman" w:hAnsi="Times New Roman" w:eastAsia="Times New Roman"/>
+          <w:b w:val="0"/>
+          <w:i w:val="0"/>
+          <w:sz w:val="24"/>
+        </w:rPr>
+        <w:t>Methodisch verlangt die Konnektor-Membran eine Doppelkompetenz. Einerseits begriffliche Strenge: Definitionen, Kriterien, Normen, Thesentafeln. Andererseits operative Nähe: Hot-Runs, Tailscale-Status, Dashboard-Atmung, Coordinator-Drift-Score. Nur die Verbindung verhindert, dass die Konnektor-Membran zur bloßen Rhetorik oder zum bloßen Betrieb ohne Sinn schrumpft.</w:t>
+      </w:r>
+    </w:p>
+    <w:p>
+      <w:pPr>
+        <w:spacing w:after="160" w:line="360" w:lineRule="auto"/>
+        <w:ind w:firstLine="425"/>
+      </w:pPr>
+      <w:r>
+        <w:rPr>
+          <w:rFonts w:ascii="Times New Roman" w:hAnsi="Times New Roman" w:eastAsia="Times New Roman"/>
+          <w:b w:val="0"/>
+          <w:i w:val="0"/>
+          <w:sz w:val="24"/>
+        </w:rPr>
+        <w:t>Kritisch ist festzuhalten, dass die Konnektor-Membran keine Heilslehre ist. OFFENE Beweise, offline Nodes, DNS-Warnungen und Namenskollisionen im Academia-Raum gehören zur Realität des Systems. Gerade die Integration dieser Störungen in die Selbstbeschreibung – statt ihrer Verdrängung – macht die Konnektor-Membran wissenschaftsfähig.</w:t>
+      </w:r>
+    </w:p>
+    <w:p>
+      <w:pPr>
+        <w:spacing w:after="160" w:line="360" w:lineRule="auto"/>
+        <w:ind w:firstLine="425"/>
+      </w:pPr>
+      <w:r>
+        <w:rPr>
+          <w:rFonts w:ascii="Times New Roman" w:hAnsi="Times New Roman" w:eastAsia="Times New Roman"/>
+          <w:b w:val="0"/>
+          <w:i w:val="0"/>
+          <w:sz w:val="24"/>
+        </w:rPr>
+        <w:t>Praktisch folgt aus die Konnektor-Membran eine Reihe von Gestaltungsmaximen: Inhouse-Wahrheit schützen, SaaS membranisieren, schwere Last clusterisieren, interaktive Souveränität am Mainframe belassen, Consent fail-closed halten, Archive deduplizieren ohne Amnesie. Diese Maximen sind in mesh_service_coordination.yaml und verwandten Artefakten bereits als Verfassungsskizze hinterlegt.</w:t>
+      </w:r>
+    </w:p>
+    <w:p>
+      <w:pPr>
+        <w:spacing w:after="160" w:line="360" w:lineRule="auto"/>
+        <w:ind w:firstLine="425"/>
+      </w:pPr>
+      <w:r>
+        <w:rPr>
+          <w:rFonts w:ascii="Times New Roman" w:hAnsi="Times New Roman" w:eastAsia="Times New Roman"/>
+          <w:b w:val="0"/>
+          <w:i w:val="0"/>
+          <w:sz w:val="24"/>
+        </w:rPr>
+        <w:t>Perspektivisch öffnet die Konnektor-Membran eine Forschungsagenda, die über das Einzelrepo hinausweist: policy-as-code, formal enggeführte Fixpunkt-Scopes, phone-seitige Curriculum-Exporte, peer-reviewbare Archivreihen und eine rechtlich robuste Consent-Schicht. Die Dissertation setzt den Anfangsstein; der Sisyphos-Zyklus setzt die Fortsetzung.</w:t>
+      </w:r>
+    </w:p>
+    <w:p>
+      <w:pPr>
+        <w:spacing w:after="160" w:line="360" w:lineRule="auto"/>
+        <w:ind w:firstLine="425"/>
+      </w:pPr>
+      <w:r>
+        <w:rPr>
+          <w:rFonts w:ascii="Times New Roman" w:hAnsi="Times New Roman" w:eastAsia="Times New Roman"/>
+          <w:b w:val="0"/>
+          <w:i w:val="0"/>
+          <w:sz w:val="24"/>
+        </w:rPr>
+        <w:t>Im Verhältnis zum Heroismus-Korpus bedeutet die Konnektor-Membran, dass Eudaimonia nicht als Gefühlsbilanz, sondern als Fähigkeit zur rekursiven Selbstkorrektur unter Bruch und Wiederholung gelesen wird. Axiom I liefert den Schlamm, Axiom II den Körper, Axiom III den Bruch, Axiom IV die Closure. die Konnektor-Membran ist die systemtheoretische Klammer um diese existenzielle Architektur.</w:t>
+      </w:r>
+    </w:p>
+    <w:p>
+      <w:pPr>
+        <w:spacing w:after="160" w:line="360" w:lineRule="auto"/>
+        <w:ind w:firstLine="425"/>
+      </w:pPr>
+      <w:r>
+        <w:rPr>
+          <w:rFonts w:ascii="Times New Roman" w:hAnsi="Times New Roman" w:eastAsia="Times New Roman"/>
+          <w:b w:val="0"/>
+          <w:i w:val="0"/>
+          <w:sz w:val="24"/>
+        </w:rPr>
+        <w:t>Im Verhältnis zur Mathematik bedeutet die Konnektor-Membran, Optimierung und Beweislast zusammenzudenken. QUBO und Annealing entscheiden unter Knappheit; die Proof Registry entscheidet unter Wahrheitsknappheit. Beide Knappheiten sind Organe derselben Schließung: ohne sie driftet das System in Beliebigkeit oder Dogma.</w:t>
+      </w:r>
+    </w:p>
+    <w:p>
+      <w:pPr>
+        <w:pStyle w:val="Heading2"/>
+      </w:pPr>
+      <w:r>
+        <w:rPr>
+          <w:rFonts w:ascii="Times New Roman" w:hAnsi="Times New Roman" w:eastAsia="Times New Roman"/>
+          <w:b/>
+          <w:i w:val="0"/>
+          <w:sz w:val="28"/>
+        </w:rPr>
+        <w:t>II.9 Consent, PII und die Grundrechte der Automation</w:t>
+      </w:r>
+    </w:p>
+    <w:p>
+      <w:pPr>
+        <w:spacing w:after="160" w:line="360" w:lineRule="auto"/>
+        <w:ind w:firstLine="425"/>
+      </w:pPr>
+      <w:r>
+        <w:rPr>
+          <w:rFonts w:ascii="Times New Roman" w:hAnsi="Times New Roman" w:eastAsia="Times New Roman"/>
+          <w:b w:val="0"/>
+          <w:i w:val="0"/>
+          <w:sz w:val="24"/>
+        </w:rPr>
+        <w:t>Im Zentrum von die Consent-Verfassung steht die Einsicht, dass Systeme ihre eigene Fortsetzbarkeit organisieren müssen, wenn sie mehr sein wollen als flüchtige Toolchains. Fusion Hero OS demonstriert dies, indem es Produktion, Prüfung und Archivierung zu einem Kreis schließt. die Consent-Verfassung erscheint damit nicht als spekulative Zutat, sondern als Beschreibung dessen, was der operative Kanon v10.0.0 bereits teilweise verkörpert und was der Ascension-Track als Horizont offen hält.</w:t>
+      </w:r>
+    </w:p>
+    <w:p>
+      <w:pPr>
+        <w:spacing w:after="160" w:line="360" w:lineRule="auto"/>
+        <w:ind w:firstLine="425"/>
+      </w:pPr>
+      <w:r>
+        <w:rPr>
+          <w:rFonts w:ascii="Times New Roman" w:hAnsi="Times New Roman" w:eastAsia="Times New Roman"/>
+          <w:b w:val="0"/>
+          <w:i w:val="0"/>
+          <w:sz w:val="24"/>
+        </w:rPr>
+        <w:t>Historisch betrachtet knüpft die Consent-Verfassung an die Linie Maturana/Varela, an kybernetische Second-Order-Ansätze und an die existenzphilosophische Frage an, wie Freiheit unter Faktizität möglich bleibt. Die Arbeit überträgt diese Linie auf ein konkretes sozio-technisches Artefakt mit Mesh, Konnektoren und Proof Registry. Dadurch wird die Consent-Verfassung empirisch anschlussfähig: man kann Health-Endpunkte lesen, Manifeste hashen und Placement-Pläne evaluieren.</w:t>
+      </w:r>
+    </w:p>
+    <w:p>
+      <w:pPr>
+        <w:spacing w:after="160" w:line="360" w:lineRule="auto"/>
+        <w:ind w:firstLine="425"/>
+      </w:pPr>
+      <w:r>
+        <w:rPr>
+          <w:rFonts w:ascii="Times New Roman" w:hAnsi="Times New Roman" w:eastAsia="Times New Roman"/>
+          <w:b w:val="0"/>
+          <w:i w:val="0"/>
+          <w:sz w:val="24"/>
+        </w:rPr>
+        <w:t>Methodisch verlangt die Consent-Verfassung eine Doppelkompetenz. Einerseits begriffliche Strenge: Definitionen, Kriterien, Normen, Thesentafeln. Andererseits operative Nähe: Hot-Runs, Tailscale-Status, Dashboard-Atmung, Coordinator-Drift-Score. Nur die Verbindung verhindert, dass die Consent-Verfassung zur bloßen Rhetorik oder zum bloßen Betrieb ohne Sinn schrumpft.</w:t>
+      </w:r>
+    </w:p>
+    <w:p>
+      <w:pPr>
+        <w:spacing w:after="160" w:line="360" w:lineRule="auto"/>
+        <w:ind w:firstLine="425"/>
+      </w:pPr>
+      <w:r>
+        <w:rPr>
+          <w:rFonts w:ascii="Times New Roman" w:hAnsi="Times New Roman" w:eastAsia="Times New Roman"/>
+          <w:b w:val="0"/>
+          <w:i w:val="0"/>
+          <w:sz w:val="24"/>
+        </w:rPr>
+        <w:t>Kritisch ist festzuhalten, dass die Consent-Verfassung keine Heilslehre ist. OFFENE Beweise, offline Nodes, DNS-Warnungen und Namenskollisionen im Academia-Raum gehören zur Realität des Systems. Gerade die Integration dieser Störungen in die Selbstbeschreibung – statt ihrer Verdrängung – macht die Consent-Verfassung wissenschaftsfähig.</w:t>
+      </w:r>
+    </w:p>
+    <w:p>
+      <w:pPr>
+        <w:spacing w:after="160" w:line="360" w:lineRule="auto"/>
+        <w:ind w:firstLine="425"/>
+      </w:pPr>
+      <w:r>
+        <w:rPr>
+          <w:rFonts w:ascii="Times New Roman" w:hAnsi="Times New Roman" w:eastAsia="Times New Roman"/>
+          <w:b w:val="0"/>
+          <w:i w:val="0"/>
+          <w:sz w:val="24"/>
+        </w:rPr>
+        <w:t>Praktisch folgt aus die Consent-Verfassung eine Reihe von Gestaltungsmaximen: Inhouse-Wahrheit schützen, SaaS membranisieren, schwere Last clusterisieren, interaktive Souveränität am Mainframe belassen, Consent fail-closed halten, Archive deduplizieren ohne Amnesie. Diese Maximen sind in mesh_service_coordination.yaml und verwandten Artefakten bereits als Verfassungsskizze hinterlegt.</w:t>
+      </w:r>
+    </w:p>
+    <w:p>
+      <w:pPr>
+        <w:spacing w:after="160" w:line="360" w:lineRule="auto"/>
+        <w:ind w:firstLine="425"/>
+      </w:pPr>
+      <w:r>
+        <w:rPr>
+          <w:rFonts w:ascii="Times New Roman" w:hAnsi="Times New Roman" w:eastAsia="Times New Roman"/>
+          <w:b w:val="0"/>
+          <w:i w:val="0"/>
+          <w:sz w:val="24"/>
+        </w:rPr>
+        <w:t>Perspektivisch öffnet die Consent-Verfassung eine Forschungsagenda, die über das Einzelrepo hinausweist: policy-as-code, formal enggeführte Fixpunkt-Scopes, phone-seitige Curriculum-Exporte, peer-reviewbare Archivreihen und eine rechtlich robuste Consent-Schicht. Die Dissertation setzt den Anfangsstein; der Sisyphos-Zyklus setzt die Fortsetzung.</w:t>
+      </w:r>
+    </w:p>
+    <w:p>
+      <w:pPr>
+        <w:spacing w:after="160" w:line="360" w:lineRule="auto"/>
+        <w:ind w:firstLine="425"/>
+      </w:pPr>
+      <w:r>
+        <w:rPr>
+          <w:rFonts w:ascii="Times New Roman" w:hAnsi="Times New Roman" w:eastAsia="Times New Roman"/>
+          <w:b w:val="0"/>
+          <w:i w:val="0"/>
+          <w:sz w:val="24"/>
+        </w:rPr>
+        <w:t>Im Verhältnis zum Heroismus-Korpus bedeutet die Consent-Verfassung, dass Eudaimonia nicht als Gefühlsbilanz, sondern als Fähigkeit zur rekursiven Selbstkorrektur unter Bruch und Wiederholung gelesen wird. Axiom I liefert den Schlamm, Axiom II den Körper, Axiom III den Bruch, Axiom IV die Closure. die Consent-Verfassung ist die systemtheoretische Klammer um diese existenzielle Architektur.</w:t>
+      </w:r>
+    </w:p>
+    <w:p>
+      <w:pPr>
+        <w:spacing w:after="160" w:line="360" w:lineRule="auto"/>
+        <w:ind w:firstLine="425"/>
+      </w:pPr>
+      <w:r>
+        <w:rPr>
+          <w:rFonts w:ascii="Times New Roman" w:hAnsi="Times New Roman" w:eastAsia="Times New Roman"/>
+          <w:b w:val="0"/>
+          <w:i w:val="0"/>
+          <w:sz w:val="24"/>
+        </w:rPr>
+        <w:t>Im Verhältnis zur Mathematik bedeutet die Consent-Verfassung, Optimierung und Beweislast zusammenzudenken. QUBO und Annealing entscheiden unter Knappheit; die Proof Registry entscheidet unter Wahrheitsknappheit. Beide Knappheiten sind Organe derselben Schließung: ohne sie driftet das System in Beliebigkeit oder Dogma.</w:t>
+      </w:r>
+    </w:p>
+    <w:p>
+      <w:pPr>
+        <w:pStyle w:val="Heading2"/>
+      </w:pPr>
+      <w:r>
+        <w:rPr>
+          <w:rFonts w:ascii="Times New Roman" w:hAnsi="Times New Roman" w:eastAsia="Times New Roman"/>
+          <w:b/>
+          <w:i w:val="0"/>
+          <w:sz w:val="28"/>
+        </w:rPr>
+        <w:t>II.10 Tailscale-Mesh als Gefäßsystem</w:t>
+      </w:r>
+    </w:p>
+    <w:p>
+      <w:pPr>
+        <w:spacing w:after="160" w:line="360" w:lineRule="auto"/>
+        <w:ind w:firstLine="425"/>
+      </w:pPr>
+      <w:r>
+        <w:rPr>
+          <w:rFonts w:ascii="Times New Roman" w:hAnsi="Times New Roman" w:eastAsia="Times New Roman"/>
+          <w:b w:val="0"/>
+          <w:i w:val="0"/>
+          <w:sz w:val="24"/>
+        </w:rPr>
+        <w:t>Im Zentrum von das Mesh-Organsystem steht die Einsicht, dass Systeme ihre eigene Fortsetzbarkeit organisieren müssen, wenn sie mehr sein wollen als flüchtige Toolchains. Fusion Hero OS demonstriert dies, indem es Produktion, Prüfung und Archivierung zu einem Kreis schließt. das Mesh-Organsystem erscheint damit nicht als spekulative Zutat, sondern als Beschreibung dessen, was der operative Kanon v10.0.0 bereits teilweise verkörpert und was der Ascension-Track als Horizont offen hält.</w:t>
+      </w:r>
+    </w:p>
+    <w:p>
+      <w:pPr>
+        <w:spacing w:after="160" w:line="360" w:lineRule="auto"/>
+        <w:ind w:firstLine="425"/>
+      </w:pPr>
+      <w:r>
+        <w:rPr>
+          <w:rFonts w:ascii="Times New Roman" w:hAnsi="Times New Roman" w:eastAsia="Times New Roman"/>
+          <w:b w:val="0"/>
+          <w:i w:val="0"/>
+          <w:sz w:val="24"/>
+        </w:rPr>
+        <w:t>Historisch betrachtet knüpft das Mesh-Organsystem an die Linie Maturana/Varela, an kybernetische Second-Order-Ansätze und an die existenzphilosophische Frage an, wie Freiheit unter Faktizität möglich bleibt. Die Arbeit überträgt diese Linie auf ein konkretes sozio-technisches Artefakt mit Mesh, Konnektoren und Proof Registry. Dadurch wird das Mesh-Organsystem empirisch anschlussfähig: man kann Health-Endpunkte lesen, Manifeste hashen und Placement-Pläne evaluieren.</w:t>
+      </w:r>
+    </w:p>
+    <w:p>
+      <w:pPr>
+        <w:spacing w:after="160" w:line="360" w:lineRule="auto"/>
+        <w:ind w:firstLine="425"/>
+      </w:pPr>
+      <w:r>
+        <w:rPr>
+          <w:rFonts w:ascii="Times New Roman" w:hAnsi="Times New Roman" w:eastAsia="Times New Roman"/>
+          <w:b w:val="0"/>
+          <w:i w:val="0"/>
+          <w:sz w:val="24"/>
+        </w:rPr>
+        <w:t>Methodisch verlangt das Mesh-Organsystem eine Doppelkompetenz. Einerseits begriffliche Strenge: Definitionen, Kriterien, Normen, Thesentafeln. Andererseits operative Nähe: Hot-Runs, Tailscale-Status, Dashboard-Atmung, Coordinator-Drift-Score. Nur die Verbindung verhindert, dass das Mesh-Organsystem zur bloßen Rhetorik oder zum bloßen Betrieb ohne Sinn schrumpft.</w:t>
+      </w:r>
+    </w:p>
+    <w:p>
+      <w:pPr>
+        <w:spacing w:after="160" w:line="360" w:lineRule="auto"/>
+        <w:ind w:firstLine="425"/>
+      </w:pPr>
+      <w:r>
+        <w:rPr>
+          <w:rFonts w:ascii="Times New Roman" w:hAnsi="Times New Roman" w:eastAsia="Times New Roman"/>
+          <w:b w:val="0"/>
+          <w:i w:val="0"/>
+          <w:sz w:val="24"/>
+        </w:rPr>
+        <w:t>Kritisch ist festzuhalten, dass das Mesh-Organsystem keine Heilslehre ist. OFFENE Beweise, offline Nodes, DNS-Warnungen und Namenskollisionen im Academia-Raum gehören zur Realität des Systems. Gerade die Integration dieser Störungen in die Selbstbeschreibung – statt ihrer Verdrängung – macht das Mesh-Organsystem wissenschaftsfähig.</w:t>
+      </w:r>
+    </w:p>
+    <w:p>
+      <w:pPr>
+        <w:spacing w:after="160" w:line="360" w:lineRule="auto"/>
+        <w:ind w:firstLine="425"/>
+      </w:pPr>
+      <w:r>
+        <w:rPr>
+          <w:rFonts w:ascii="Times New Roman" w:hAnsi="Times New Roman" w:eastAsia="Times New Roman"/>
+          <w:b w:val="0"/>
+          <w:i w:val="0"/>
+          <w:sz w:val="24"/>
+        </w:rPr>
+        <w:t>Praktisch folgt aus das Mesh-Organsystem eine Reihe von Gestaltungsmaximen: Inhouse-Wahrheit schützen, SaaS membranisieren, schwere Last clusterisieren, interaktive Souveränität am Mainframe belassen, Consent fail-closed halten, Archive deduplizieren ohne Amnesie. Diese Maximen sind in mesh_service_coordination.yaml und verwandten Artefakten bereits als Verfassungsskizze hinterlegt.</w:t>
+      </w:r>
+    </w:p>
+    <w:p>
+      <w:pPr>
+        <w:spacing w:after="160" w:line="360" w:lineRule="auto"/>
+        <w:ind w:firstLine="425"/>
+      </w:pPr>
+      <w:r>
+        <w:rPr>
+          <w:rFonts w:ascii="Times New Roman" w:hAnsi="Times New Roman" w:eastAsia="Times New Roman"/>
+          <w:b w:val="0"/>
+          <w:i w:val="0"/>
+          <w:sz w:val="24"/>
+        </w:rPr>
+        <w:t>Perspektivisch öffnet das Mesh-Organsystem eine Forschungsagenda, die über das Einzelrepo hinausweist: policy-as-code, formal enggeführte Fixpunkt-Scopes, phone-seitige Curriculum-Exporte, peer-reviewbare Archivreihen und eine rechtlich robuste Consent-Schicht. Die Dissertation setzt den Anfangsstein; der Sisyphos-Zyklus setzt die Fortsetzung.</w:t>
+      </w:r>
+    </w:p>
+    <w:p>
+      <w:pPr>
+        <w:spacing w:after="160" w:line="360" w:lineRule="auto"/>
+        <w:ind w:firstLine="425"/>
+      </w:pPr>
+      <w:r>
+        <w:rPr>
+          <w:rFonts w:ascii="Times New Roman" w:hAnsi="Times New Roman" w:eastAsia="Times New Roman"/>
+          <w:b w:val="0"/>
+          <w:i w:val="0"/>
+          <w:sz w:val="24"/>
+        </w:rPr>
+        <w:t>Im Verhältnis zum Heroismus-Korpus bedeutet das Mesh-Organsystem, dass Eudaimonia nicht als Gefühlsbilanz, sondern als Fähigkeit zur rekursiven Selbstkorrektur unter Bruch und Wiederholung gelesen wird. Axiom I liefert den Schlamm, Axiom II den Körper, Axiom III den Bruch, Axiom IV die Closure. das Mesh-Organsystem ist die systemtheoretische Klammer um diese existenzielle Architektur.</w:t>
+      </w:r>
+    </w:p>
+    <w:p>
+      <w:pPr>
+        <w:spacing w:after="160" w:line="360" w:lineRule="auto"/>
+        <w:ind w:firstLine="425"/>
+      </w:pPr>
+      <w:r>
+        <w:rPr>
+          <w:rFonts w:ascii="Times New Roman" w:hAnsi="Times New Roman" w:eastAsia="Times New Roman"/>
+          <w:b w:val="0"/>
+          <w:i w:val="0"/>
+          <w:sz w:val="24"/>
+        </w:rPr>
+        <w:t>Im Verhältnis zur Mathematik bedeutet das Mesh-Organsystem, Optimierung und Beweislast zusammenzudenken. QUBO und Annealing entscheiden unter Knappheit; die Proof Registry entscheidet unter Wahrheitsknappheit. Beide Knappheiten sind Organe derselben Schließung: ohne sie driftet das System in Beliebigkeit oder Dogma.</w:t>
+      </w:r>
+    </w:p>
+    <w:p>
+      <w:pPr>
+        <w:pStyle w:val="Heading2"/>
+      </w:pPr>
+      <w:r>
+        <w:rPr>
+          <w:rFonts w:ascii="Times New Roman" w:hAnsi="Times New Roman" w:eastAsia="Times New Roman"/>
+          <w:b/>
+          <w:i w:val="0"/>
+          <w:sz w:val="28"/>
+        </w:rPr>
+        <w:t>II.11 Cluster-Rechenzeit und die Subsidiarität der Kraft</w:t>
+      </w:r>
+    </w:p>
+    <w:p>
+      <w:pPr>
+        <w:spacing w:after="160" w:line="360" w:lineRule="auto"/>
+        <w:ind w:firstLine="425"/>
+      </w:pPr>
+      <w:r>
+        <w:rPr>
+          <w:rFonts w:ascii="Times New Roman" w:hAnsi="Times New Roman" w:eastAsia="Times New Roman"/>
+          <w:b w:val="0"/>
+          <w:i w:val="0"/>
+          <w:sz w:val="24"/>
+        </w:rPr>
+        <w:t>Im Zentrum von die Cluster-Subsidiarität steht die Einsicht, dass Systeme ihre eigene Fortsetzbarkeit organisieren müssen, wenn sie mehr sein wollen als flüchtige Toolchains. Fusion Hero OS demonstriert dies, indem es Produktion, Prüfung und Archivierung zu einem Kreis schließt. die Cluster-Subsidiarität erscheint damit nicht als spekulative Zutat, sondern als Beschreibung dessen, was der operative Kanon v10.0.0 bereits teilweise verkörpert und was der Ascension-Track als Horizont offen hält.</w:t>
+      </w:r>
+    </w:p>
+    <w:p>
+      <w:pPr>
+        <w:spacing w:after="160" w:line="360" w:lineRule="auto"/>
+        <w:ind w:firstLine="425"/>
+      </w:pPr>
+      <w:r>
+        <w:rPr>
+          <w:rFonts w:ascii="Times New Roman" w:hAnsi="Times New Roman" w:eastAsia="Times New Roman"/>
+          <w:b w:val="0"/>
+          <w:i w:val="0"/>
+          <w:sz w:val="24"/>
+        </w:rPr>
+        <w:t>Historisch betrachtet knüpft die Cluster-Subsidiarität an die Linie Maturana/Varela, an kybernetische Second-Order-Ansätze und an die existenzphilosophische Frage an, wie Freiheit unter Faktizität möglich bleibt. Die Arbeit überträgt diese Linie auf ein konkretes sozio-technisches Artefakt mit Mesh, Konnektoren und Proof Registry. Dadurch wird die Cluster-Subsidiarität empirisch anschlussfähig: man kann Health-Endpunkte lesen, Manifeste hashen und Placement-Pläne evaluieren.</w:t>
+      </w:r>
+    </w:p>
+    <w:p>
+      <w:pPr>
+        <w:spacing w:after="160" w:line="360" w:lineRule="auto"/>
+        <w:ind w:firstLine="425"/>
+      </w:pPr>
+      <w:r>
+        <w:rPr>
+          <w:rFonts w:ascii="Times New Roman" w:hAnsi="Times New Roman" w:eastAsia="Times New Roman"/>
+          <w:b w:val="0"/>
+          <w:i w:val="0"/>
+          <w:sz w:val="24"/>
+        </w:rPr>
+        <w:t>Methodisch verlangt die Cluster-Subsidiarität eine Doppelkompetenz. Einerseits begriffliche Strenge: Definitionen, Kriterien, Normen, Thesentafeln. Andererseits operative Nähe: Hot-Runs, Tailscale-Status, Dashboard-Atmung, Coordinator-Drift-Score. Nur die Verbindung verhindert, dass die Cluster-Subsidiarität zur bloßen Rhetorik oder zum bloßen Betrieb ohne Sinn schrumpft.</w:t>
+      </w:r>
+    </w:p>
+    <w:p>
+      <w:pPr>
+        <w:spacing w:after="160" w:line="360" w:lineRule="auto"/>
+        <w:ind w:firstLine="425"/>
+      </w:pPr>
+      <w:r>
+        <w:rPr>
+          <w:rFonts w:ascii="Times New Roman" w:hAnsi="Times New Roman" w:eastAsia="Times New Roman"/>
+          <w:b w:val="0"/>
+          <w:i w:val="0"/>
+          <w:sz w:val="24"/>
+        </w:rPr>
+        <w:t>Kritisch ist festzuhalten, dass die Cluster-Subsidiarität keine Heilslehre ist. OFFENE Beweise, offline Nodes, DNS-Warnungen und Namenskollisionen im Academia-Raum gehören zur Realität des Systems. Gerade die Integration dieser Störungen in die Selbstbeschreibung – statt ihrer Verdrängung – macht die Cluster-Subsidiarität wissenschaftsfähig.</w:t>
+      </w:r>
+    </w:p>
+    <w:p>
+      <w:pPr>
+        <w:spacing w:after="160" w:line="360" w:lineRule="auto"/>
+        <w:ind w:firstLine="425"/>
+      </w:pPr>
+      <w:r>
+        <w:rPr>
+          <w:rFonts w:ascii="Times New Roman" w:hAnsi="Times New Roman" w:eastAsia="Times New Roman"/>
+          <w:b w:val="0"/>
+          <w:i w:val="0"/>
+          <w:sz w:val="24"/>
+        </w:rPr>
+        <w:t>Praktisch folgt aus die Cluster-Subsidiarität eine Reihe von Gestaltungsmaximen: Inhouse-Wahrheit schützen, SaaS membranisieren, schwere Last clusterisieren, interaktive Souveränität am Mainframe belassen, Consent fail-closed halten, Archive deduplizieren ohne Amnesie. Diese Maximen sind in mesh_service_coordination.yaml und verwandten Artefakten bereits als Verfassungsskizze hinterlegt.</w:t>
+      </w:r>
+    </w:p>
+    <w:p>
+      <w:pPr>
+        <w:spacing w:after="160" w:line="360" w:lineRule="auto"/>
+        <w:ind w:firstLine="425"/>
+      </w:pPr>
+      <w:r>
+        <w:rPr>
+          <w:rFonts w:ascii="Times New Roman" w:hAnsi="Times New Roman" w:eastAsia="Times New Roman"/>
+          <w:b w:val="0"/>
+          <w:i w:val="0"/>
+          <w:sz w:val="24"/>
+        </w:rPr>
+        <w:t>Perspektivisch öffnet die Cluster-Subsidiarität eine Forschungsagenda, die über das Einzelrepo hinausweist: policy-as-code, formal enggeführte Fixpunkt-Scopes, phone-seitige Curriculum-Exporte, peer-reviewbare Archivreihen und eine rechtlich robuste Consent-Schicht. Die Dissertation setzt den Anfangsstein; der Sisyphos-Zyklus setzt die Fortsetzung.</w:t>
+      </w:r>
+    </w:p>
+    <w:p>
+      <w:pPr>
+        <w:spacing w:after="160" w:line="360" w:lineRule="auto"/>
+        <w:ind w:firstLine="425"/>
+      </w:pPr>
+      <w:r>
+        <w:rPr>
+          <w:rFonts w:ascii="Times New Roman" w:hAnsi="Times New Roman" w:eastAsia="Times New Roman"/>
+          <w:b w:val="0"/>
+          <w:i w:val="0"/>
+          <w:sz w:val="24"/>
+        </w:rPr>
+        <w:t>Im Verhältnis zum Heroismus-Korpus bedeutet die Cluster-Subsidiarität, dass Eudaimonia nicht als Gefühlsbilanz, sondern als Fähigkeit zur rekursiven Selbstkorrektur unter Bruch und Wiederholung gelesen wird. Axiom I liefert den Schlamm, Axiom II den Körper, Axiom III den Bruch, Axiom IV die Closure. die Cluster-Subsidiarität ist die systemtheoretische Klammer um diese existenzielle Architektur.</w:t>
+      </w:r>
+    </w:p>
+    <w:p>
+      <w:pPr>
+        <w:spacing w:after="160" w:line="360" w:lineRule="auto"/>
+        <w:ind w:firstLine="425"/>
+      </w:pPr>
+      <w:r>
+        <w:rPr>
+          <w:rFonts w:ascii="Times New Roman" w:hAnsi="Times New Roman" w:eastAsia="Times New Roman"/>
+          <w:b w:val="0"/>
+          <w:i w:val="0"/>
+          <w:sz w:val="24"/>
+        </w:rPr>
+        <w:t>Im Verhältnis zur Mathematik bedeutet die Cluster-Subsidiarität, Optimierung und Beweislast zusammenzudenken. QUBO und Annealing entscheiden unter Knappheit; die Proof Registry entscheidet unter Wahrheitsknappheit. Beide Knappheiten sind Organe derselben Schließung: ohne sie driftet das System in Beliebigkeit oder Dogma.</w:t>
+      </w:r>
+    </w:p>
+    <w:p>
+      <w:pPr>
+        <w:pStyle w:val="Heading2"/>
+      </w:pPr>
+      <w:r>
+        <w:rPr>
+          <w:rFonts w:ascii="Times New Roman" w:hAnsi="Times New Roman" w:eastAsia="Times New Roman"/>
+          <w:b/>
+          <w:i w:val="0"/>
+          <w:sz w:val="28"/>
+        </w:rPr>
+        <w:t>II.12 Archive als biographisches Gedächtnis</w:t>
+      </w:r>
+    </w:p>
+    <w:p>
+      <w:pPr>
+        <w:spacing w:after="160" w:line="360" w:lineRule="auto"/>
+        <w:ind w:firstLine="425"/>
+      </w:pPr>
+      <w:r>
+        <w:rPr>
+          <w:rFonts w:ascii="Times New Roman" w:hAnsi="Times New Roman" w:eastAsia="Times New Roman"/>
+          <w:b w:val="0"/>
+          <w:i w:val="0"/>
+          <w:sz w:val="24"/>
+        </w:rPr>
+        <w:t>Im Zentrum von die Archivökonomie steht die Einsicht, dass Systeme ihre eigene Fortsetzbarkeit organisieren müssen, wenn sie mehr sein wollen als flüchtige Toolchains. Fusion Hero OS demonstriert dies, indem es Produktion, Prüfung und Archivierung zu einem Kreis schließt. die Archivökonomie erscheint damit nicht als spekulative Zutat, sondern als Beschreibung dessen, was der operative Kanon v10.0.0 bereits teilweise verkörpert und was der Ascension-Track als Horizont offen hält.</w:t>
+      </w:r>
+    </w:p>
+    <w:p>
+      <w:pPr>
+        <w:spacing w:after="160" w:line="360" w:lineRule="auto"/>
+        <w:ind w:firstLine="425"/>
+      </w:pPr>
+      <w:r>
+        <w:rPr>
+          <w:rFonts w:ascii="Times New Roman" w:hAnsi="Times New Roman" w:eastAsia="Times New Roman"/>
+          <w:b w:val="0"/>
+          <w:i w:val="0"/>
+          <w:sz w:val="24"/>
+        </w:rPr>
+        <w:t>Historisch betrachtet knüpft die Archivökonomie an die Linie Maturana/Varela, an kybernetische Second-Order-Ansätze und an die existenzphilosophische Frage an, wie Freiheit unter Faktizität möglich bleibt. Die Arbeit überträgt diese Linie auf ein konkretes sozio-technisches Artefakt mit Mesh, Konnektoren und Proof Registry. Dadurch wird die Archivökonomie empirisch anschlussfähig: man kann Health-Endpunkte lesen, Manifeste hashen und Placement-Pläne evaluieren.</w:t>
+      </w:r>
+    </w:p>
+    <w:p>
+      <w:pPr>
+        <w:spacing w:after="160" w:line="360" w:lineRule="auto"/>
+        <w:ind w:firstLine="425"/>
+      </w:pPr>
+      <w:r>
+        <w:rPr>
+          <w:rFonts w:ascii="Times New Roman" w:hAnsi="Times New Roman" w:eastAsia="Times New Roman"/>
+          <w:b w:val="0"/>
+          <w:i w:val="0"/>
+          <w:sz w:val="24"/>
+        </w:rPr>
+        <w:t>Methodisch verlangt die Archivökonomie eine Doppelkompetenz. Einerseits begriffliche Strenge: Definitionen, Kriterien, Normen, Thesentafeln. Andererseits operative Nähe: Hot-Runs, Tailscale-Status, Dashboard-Atmung, Coordinator-Drift-Score. Nur die Verbindung verhindert, dass die Archivökonomie zur bloßen Rhetorik oder zum bloßen Betrieb ohne Sinn schrumpft.</w:t>
+      </w:r>
+    </w:p>
+    <w:p>
+      <w:pPr>
+        <w:spacing w:after="160" w:line="360" w:lineRule="auto"/>
+        <w:ind w:firstLine="425"/>
+      </w:pPr>
+      <w:r>
+        <w:rPr>
+          <w:rFonts w:ascii="Times New Roman" w:hAnsi="Times New Roman" w:eastAsia="Times New Roman"/>
+          <w:b w:val="0"/>
+          <w:i w:val="0"/>
+          <w:sz w:val="24"/>
+        </w:rPr>
+        <w:t>Kritisch ist festzuhalten, dass die Archivökonomie keine Heilslehre ist. OFFENE Beweise, offline Nodes, DNS-Warnungen und Namenskollisionen im Academia-Raum gehören zur Realität des Systems. Gerade die Integration dieser Störungen in die Selbstbeschreibung – statt ihrer Verdrängung – macht die Archivökonomie wissenschaftsfähig.</w:t>
+      </w:r>
+    </w:p>
+    <w:p>
+      <w:pPr>
+        <w:spacing w:after="160" w:line="360" w:lineRule="auto"/>
+        <w:ind w:firstLine="425"/>
+      </w:pPr>
+      <w:r>
+        <w:rPr>
+          <w:rFonts w:ascii="Times New Roman" w:hAnsi="Times New Roman" w:eastAsia="Times New Roman"/>
+          <w:b w:val="0"/>
+          <w:i w:val="0"/>
+          <w:sz w:val="24"/>
+        </w:rPr>
+        <w:t>Praktisch folgt aus die Archivökonomie eine Reihe von Gestaltungsmaximen: Inhouse-Wahrheit schützen, SaaS membranisieren, schwere Last clusterisieren, interaktive Souveränität am Mainframe belassen, Consent fail-closed halten, Archive deduplizieren ohne Amnesie. Diese Maximen sind in mesh_service_coordination.yaml und verwandten Artefakten bereits als Verfassungsskizze hinterlegt.</w:t>
+      </w:r>
+    </w:p>
+    <w:p>
+      <w:pPr>
+        <w:spacing w:after="160" w:line="360" w:lineRule="auto"/>
+        <w:ind w:firstLine="425"/>
+      </w:pPr>
+      <w:r>
+        <w:rPr>
+          <w:rFonts w:ascii="Times New Roman" w:hAnsi="Times New Roman" w:eastAsia="Times New Roman"/>
+          <w:b w:val="0"/>
+          <w:i w:val="0"/>
+          <w:sz w:val="24"/>
+        </w:rPr>
+        <w:t>Perspektivisch öffnet die Archivökonomie eine Forschungsagenda, die über das Einzelrepo hinausweist: policy-as-code, formal enggeführte Fixpunkt-Scopes, phone-seitige Curriculum-Exporte, peer-reviewbare Archivreihen und eine rechtlich robuste Consent-Schicht. Die Dissertation setzt den Anfangsstein; der Sisyphos-Zyklus setzt die Fortsetzung.</w:t>
+      </w:r>
+    </w:p>
+    <w:p>
+      <w:pPr>
+        <w:spacing w:after="160" w:line="360" w:lineRule="auto"/>
+        <w:ind w:firstLine="425"/>
+      </w:pPr>
+      <w:r>
+        <w:rPr>
+          <w:rFonts w:ascii="Times New Roman" w:hAnsi="Times New Roman" w:eastAsia="Times New Roman"/>
+          <w:b w:val="0"/>
+          <w:i w:val="0"/>
+          <w:sz w:val="24"/>
+        </w:rPr>
+        <w:t>Im Verhältnis zum Heroismus-Korpus bedeutet die Archivökonomie, dass Eudaimonia nicht als Gefühlsbilanz, sondern als Fähigkeit zur rekursiven Selbstkorrektur unter Bruch und Wiederholung gelesen wird. Axiom I liefert den Schlamm, Axiom II den Körper, Axiom III den Bruch, Axiom IV die Closure. die Archivökonomie ist die systemtheoretische Klammer um diese existenzielle Architektur.</w:t>
+      </w:r>
+    </w:p>
+    <w:p>
+      <w:pPr>
+        <w:spacing w:after="160" w:line="360" w:lineRule="auto"/>
+        <w:ind w:firstLine="425"/>
+      </w:pPr>
+      <w:r>
+        <w:rPr>
+          <w:rFonts w:ascii="Times New Roman" w:hAnsi="Times New Roman" w:eastAsia="Times New Roman"/>
+          <w:b w:val="0"/>
+          <w:i w:val="0"/>
+          <w:sz w:val="24"/>
+        </w:rPr>
+        <w:t>Im Verhältnis zur Mathematik bedeutet die Archivökonomie, Optimierung und Beweislast zusammenzudenken. QUBO und Annealing entscheiden unter Knappheit; die Proof Registry entscheidet unter Wahrheitsknappheit. Beide Knappheiten sind Organe derselben Schließung: ohne sie driftet das System in Beliebigkeit oder Dogma.</w:t>
+      </w:r>
+    </w:p>
+    <w:p>
+      <w:pPr>
+        <w:pStyle w:val="Heading2"/>
+      </w:pPr>
+      <w:r>
+        <w:rPr>
+          <w:rFonts w:ascii="Times New Roman" w:hAnsi="Times New Roman" w:eastAsia="Times New Roman"/>
+          <w:b/>
+          <w:i w:val="0"/>
+          <w:sz w:val="28"/>
+        </w:rPr>
+        <w:t>II.13 Proof Registry als epistemisches Immunsystem</w:t>
+      </w:r>
+    </w:p>
+    <w:p>
+      <w:pPr>
+        <w:spacing w:after="160" w:line="360" w:lineRule="auto"/>
+        <w:ind w:firstLine="425"/>
+      </w:pPr>
+      <w:r>
+        <w:rPr>
+          <w:rFonts w:ascii="Times New Roman" w:hAnsi="Times New Roman" w:eastAsia="Times New Roman"/>
+          <w:b w:val="0"/>
+          <w:i w:val="0"/>
+          <w:sz w:val="24"/>
+        </w:rPr>
+        <w:t>Im Zentrum von die Proof-Honesty steht die Einsicht, dass Systeme ihre eigene Fortsetzbarkeit organisieren müssen, wenn sie mehr sein wollen als flüchtige Toolchains. Fusion Hero OS demonstriert dies, indem es Produktion, Prüfung und Archivierung zu einem Kreis schließt. die Proof-Honesty erscheint damit nicht als spekulative Zutat, sondern als Beschreibung dessen, was der operative Kanon v10.0.0 bereits teilweise verkörpert und was der Ascension-Track als Horizont offen hält.</w:t>
+      </w:r>
+    </w:p>
+    <w:p>
+      <w:pPr>
+        <w:spacing w:after="160" w:line="360" w:lineRule="auto"/>
+        <w:ind w:firstLine="425"/>
+      </w:pPr>
+      <w:r>
+        <w:rPr>
+          <w:rFonts w:ascii="Times New Roman" w:hAnsi="Times New Roman" w:eastAsia="Times New Roman"/>
+          <w:b w:val="0"/>
+          <w:i w:val="0"/>
+          <w:sz w:val="24"/>
+        </w:rPr>
+        <w:t>Historisch betrachtet knüpft die Proof-Honesty an die Linie Maturana/Varela, an kybernetische Second-Order-Ansätze und an die existenzphilosophische Frage an, wie Freiheit unter Faktizität möglich bleibt. Die Arbeit überträgt diese Linie auf ein konkretes sozio-technisches Artefakt mit Mesh, Konnektoren und Proof Registry. Dadurch wird die Proof-Honesty empirisch anschlussfähig: man kann Health-Endpunkte lesen, Manifeste hashen und Placement-Pläne evaluieren.</w:t>
+      </w:r>
+    </w:p>
+    <w:p>
+      <w:pPr>
+        <w:spacing w:after="160" w:line="360" w:lineRule="auto"/>
+        <w:ind w:firstLine="425"/>
+      </w:pPr>
+      <w:r>
+        <w:rPr>
+          <w:rFonts w:ascii="Times New Roman" w:hAnsi="Times New Roman" w:eastAsia="Times New Roman"/>
+          <w:b w:val="0"/>
+          <w:i w:val="0"/>
+          <w:sz w:val="24"/>
+        </w:rPr>
+        <w:t>Methodisch verlangt die Proof-Honesty eine Doppelkompetenz. Einerseits begriffliche Strenge: Definitionen, Kriterien, Normen, Thesentafeln. Andererseits operative Nähe: Hot-Runs, Tailscale-Status, Dashboard-Atmung, Coordinator-Drift-Score. Nur die Verbindung verhindert, dass die Proof-Honesty zur bloßen Rhetorik oder zum bloßen Betrieb ohne Sinn schrumpft.</w:t>
+      </w:r>
+    </w:p>
+    <w:p>
+      <w:pPr>
+        <w:spacing w:after="160" w:line="360" w:lineRule="auto"/>
+        <w:ind w:firstLine="425"/>
+      </w:pPr>
+      <w:r>
+        <w:rPr>
+          <w:rFonts w:ascii="Times New Roman" w:hAnsi="Times New Roman" w:eastAsia="Times New Roman"/>
+          <w:b w:val="0"/>
+          <w:i w:val="0"/>
+          <w:sz w:val="24"/>
+        </w:rPr>
+        <w:t>Kritisch ist festzuhalten, dass die Proof-Honesty keine Heilslehre ist. OFFENE Beweise, offline Nodes, DNS-Warnungen und Namenskollisionen im Academia-Raum gehören zur Realität des Systems. Gerade die Integration dieser Störungen in die Selbstbeschreibung – statt ihrer Verdrängung – macht die Proof-Honesty wissenschaftsfähig.</w:t>
+      </w:r>
+    </w:p>
+    <w:p>
+      <w:pPr>
+        <w:spacing w:after="160" w:line="360" w:lineRule="auto"/>
+        <w:ind w:firstLine="425"/>
+      </w:pPr>
+      <w:r>
+        <w:rPr>
+          <w:rFonts w:ascii="Times New Roman" w:hAnsi="Times New Roman" w:eastAsia="Times New Roman"/>
+          <w:b w:val="0"/>
+          <w:i w:val="0"/>
+          <w:sz w:val="24"/>
+        </w:rPr>
+        <w:t>Praktisch folgt aus die Proof-Honesty eine Reihe von Gestaltungsmaximen: Inhouse-Wahrheit schützen, SaaS membranisieren, schwere Last clusterisieren, interaktive Souveränität am Mainframe belassen, Consent fail-closed halten, Archive deduplizieren ohne Amnesie. Diese Maximen sind in mesh_service_coordination.yaml und verwandten Artefakten bereits als Verfassungsskizze hinterlegt.</w:t>
+      </w:r>
+    </w:p>
+    <w:p>
+      <w:pPr>
+        <w:spacing w:after="160" w:line="360" w:lineRule="auto"/>
+        <w:ind w:firstLine="425"/>
+      </w:pPr>
+      <w:r>
+        <w:rPr>
+          <w:rFonts w:ascii="Times New Roman" w:hAnsi="Times New Roman" w:eastAsia="Times New Roman"/>
+          <w:b w:val="0"/>
+          <w:i w:val="0"/>
+          <w:sz w:val="24"/>
+        </w:rPr>
+        <w:t>Perspektivisch öffnet die Proof-Honesty eine Forschungsagenda, die über das Einzelrepo hinausweist: policy-as-code, formal enggeführte Fixpunkt-Scopes, phone-seitige Curriculum-Exporte, peer-reviewbare Archivreihen und eine rechtlich robuste Consent-Schicht. Die Dissertation setzt den Anfangsstein; der Sisyphos-Zyklus setzt die Fortsetzung.</w:t>
+      </w:r>
+    </w:p>
+    <w:p>
+      <w:pPr>
+        <w:spacing w:after="160" w:line="360" w:lineRule="auto"/>
+        <w:ind w:firstLine="425"/>
+      </w:pPr>
+      <w:r>
+        <w:rPr>
+          <w:rFonts w:ascii="Times New Roman" w:hAnsi="Times New Roman" w:eastAsia="Times New Roman"/>
+          <w:b w:val="0"/>
+          <w:i w:val="0"/>
+          <w:sz w:val="24"/>
+        </w:rPr>
+        <w:t>Im Verhältnis zum Heroismus-Korpus bedeutet die Proof-Honesty, dass Eudaimonia nicht als Gefühlsbilanz, sondern als Fähigkeit zur rekursiven Selbstkorrektur unter Bruch und Wiederholung gelesen wird. Axiom I liefert den Schlamm, Axiom II den Körper, Axiom III den Bruch, Axiom IV die Closure. die Proof-Honesty ist die systemtheoretische Klammer um diese existenzielle Architektur.</w:t>
+      </w:r>
+    </w:p>
+    <w:p>
+      <w:pPr>
+        <w:spacing w:after="160" w:line="360" w:lineRule="auto"/>
+        <w:ind w:firstLine="425"/>
+      </w:pPr>
+      <w:r>
+        <w:rPr>
+          <w:rFonts w:ascii="Times New Roman" w:hAnsi="Times New Roman" w:eastAsia="Times New Roman"/>
+          <w:b w:val="0"/>
+          <w:i w:val="0"/>
+          <w:sz w:val="24"/>
+        </w:rPr>
+        <w:t>Im Verhältnis zur Mathematik bedeutet die Proof-Honesty, Optimierung und Beweislast zusammenzudenken. QUBO und Annealing entscheiden unter Knappheit; die Proof Registry entscheidet unter Wahrheitsknappheit. Beide Knappheiten sind Organe derselben Schließung: ohne sie driftet das System in Beliebigkeit oder Dogma.</w:t>
+      </w:r>
+    </w:p>
+    <w:p>
+      <w:pPr>
+        <w:pStyle w:val="Heading2"/>
+      </w:pPr>
+      <w:r>
+        <w:rPr>
+          <w:rFonts w:ascii="Times New Roman" w:hAnsi="Times New Roman" w:eastAsia="Times New Roman"/>
+          <w:b/>
+          <w:i w:val="0"/>
+          <w:sz w:val="28"/>
+        </w:rPr>
+        <w:t>II.14 Heroismus-Axiome als normative DNA</w:t>
+      </w:r>
+    </w:p>
+    <w:p>
+      <w:pPr>
+        <w:spacing w:after="160" w:line="360" w:lineRule="auto"/>
+        <w:ind w:firstLine="425"/>
+      </w:pPr>
+      <w:r>
+        <w:rPr>
+          <w:rFonts w:ascii="Times New Roman" w:hAnsi="Times New Roman" w:eastAsia="Times New Roman"/>
+          <w:b w:val="0"/>
+          <w:i w:val="0"/>
+          <w:sz w:val="24"/>
+        </w:rPr>
+        <w:t>Im Zentrum von die heroische Axiomatik steht die Einsicht, dass Systeme ihre eigene Fortsetzbarkeit organisieren müssen, wenn sie mehr sein wollen als flüchtige Toolchains. Fusion Hero OS demonstriert dies, indem es Produktion, Prüfung und Archivierung zu einem Kreis schließt. die heroische Axiomatik erscheint damit nicht als spekulative Zutat, sondern als Beschreibung dessen, was der operative Kanon v10.0.0 bereits teilweise verkörpert und was der Ascension-Track als Horizont offen hält.</w:t>
+      </w:r>
+    </w:p>
+    <w:p>
+      <w:pPr>
+        <w:spacing w:after="160" w:line="360" w:lineRule="auto"/>
+        <w:ind w:firstLine="425"/>
+      </w:pPr>
+      <w:r>
+        <w:rPr>
+          <w:rFonts w:ascii="Times New Roman" w:hAnsi="Times New Roman" w:eastAsia="Times New Roman"/>
+          <w:b w:val="0"/>
+          <w:i w:val="0"/>
+          <w:sz w:val="24"/>
+        </w:rPr>
+        <w:t>Historisch betrachtet knüpft die heroische Axiomatik an die Linie Maturana/Varela, an kybernetische Second-Order-Ansätze und an die existenzphilosophische Frage an, wie Freiheit unter Faktizität möglich bleibt. Die Arbeit überträgt diese Linie auf ein konkretes sozio-technisches Artefakt mit Mesh, Konnektoren und Proof Registry. Dadurch wird die heroische Axiomatik empirisch anschlussfähig: man kann Health-Endpunkte lesen, Manifeste hashen und Placement-Pläne evaluieren.</w:t>
+      </w:r>
+    </w:p>
+    <w:p>
+      <w:pPr>
+        <w:spacing w:after="160" w:line="360" w:lineRule="auto"/>
+        <w:ind w:firstLine="425"/>
+      </w:pPr>
+      <w:r>
+        <w:rPr>
+          <w:rFonts w:ascii="Times New Roman" w:hAnsi="Times New Roman" w:eastAsia="Times New Roman"/>
+          <w:b w:val="0"/>
+          <w:i w:val="0"/>
+          <w:sz w:val="24"/>
+        </w:rPr>
+        <w:t>Methodisch verlangt die heroische Axiomatik eine Doppelkompetenz. Einerseits begriffliche Strenge: Definitionen, Kriterien, Normen, Thesentafeln. Andererseits operative Nähe: Hot-Runs, Tailscale-Status, Dashboard-Atmung, Coordinator-Drift-Score. Nur die Verbindung verhindert, dass die heroische Axiomatik zur bloßen Rhetorik oder zum bloßen Betrieb ohne Sinn schrumpft.</w:t>
+      </w:r>
+    </w:p>
+    <w:p>
+      <w:pPr>
+        <w:spacing w:after="160" w:line="360" w:lineRule="auto"/>
+        <w:ind w:firstLine="425"/>
+      </w:pPr>
+      <w:r>
+        <w:rPr>
+          <w:rFonts w:ascii="Times New Roman" w:hAnsi="Times New Roman" w:eastAsia="Times New Roman"/>
+          <w:b w:val="0"/>
+          <w:i w:val="0"/>
+          <w:sz w:val="24"/>
+        </w:rPr>
+        <w:t>Kritisch ist festzuhalten, dass die heroische Axiomatik keine Heilslehre ist. OFFENE Beweise, offline Nodes, DNS-Warnungen und Namenskollisionen im Academia-Raum gehören zur Realität des Systems. Gerade die Integration dieser Störungen in die Selbstbeschreibung – statt ihrer Verdrängung – macht die heroische Axiomatik wissenschaftsfähig.</w:t>
+      </w:r>
+    </w:p>
+    <w:p>
+      <w:pPr>
+        <w:spacing w:after="160" w:line="360" w:lineRule="auto"/>
+        <w:ind w:firstLine="425"/>
+      </w:pPr>
+      <w:r>
+        <w:rPr>
+          <w:rFonts w:ascii="Times New Roman" w:hAnsi="Times New Roman" w:eastAsia="Times New Roman"/>
+          <w:b w:val="0"/>
+          <w:i w:val="0"/>
+          <w:sz w:val="24"/>
+        </w:rPr>
+        <w:t>Praktisch folgt aus die heroische Axiomatik eine Reihe von Gestaltungsmaximen: Inhouse-Wahrheit schützen, SaaS membranisieren, schwere Last clusterisieren, interaktive Souveränität am Mainframe belassen, Consent fail-closed halten, Archive deduplizieren ohne Amnesie. Diese Maximen sind in mesh_service_coordination.yaml und verwandten Artefakten bereits als Verfassungsskizze hinterlegt.</w:t>
+      </w:r>
+    </w:p>
+    <w:p>
+      <w:pPr>
+        <w:spacing w:after="160" w:line="360" w:lineRule="auto"/>
+        <w:ind w:firstLine="425"/>
+      </w:pPr>
+      <w:r>
+        <w:rPr>
+          <w:rFonts w:ascii="Times New Roman" w:hAnsi="Times New Roman" w:eastAsia="Times New Roman"/>
+          <w:b w:val="0"/>
+          <w:i w:val="0"/>
+          <w:sz w:val="24"/>
+        </w:rPr>
+        <w:t>Perspektivisch öffnet die heroische Axiomatik eine Forschungsagenda, die über das Einzelrepo hinausweist: policy-as-code, formal enggeführte Fixpunkt-Scopes, phone-seitige Curriculum-Exporte, peer-reviewbare Archivreihen und eine rechtlich robuste Consent-Schicht. Die Dissertation setzt den Anfangsstein; der Sisyphos-Zyklus setzt die Fortsetzung.</w:t>
+      </w:r>
+    </w:p>
+    <w:p>
+      <w:pPr>
+        <w:spacing w:after="160" w:line="360" w:lineRule="auto"/>
+        <w:ind w:firstLine="425"/>
+      </w:pPr>
+      <w:r>
+        <w:rPr>
+          <w:rFonts w:ascii="Times New Roman" w:hAnsi="Times New Roman" w:eastAsia="Times New Roman"/>
+          <w:b w:val="0"/>
+          <w:i w:val="0"/>
+          <w:sz w:val="24"/>
+        </w:rPr>
+        <w:t>Im Verhältnis zum Heroismus-Korpus bedeutet die heroische Axiomatik, dass Eudaimonia nicht als Gefühlsbilanz, sondern als Fähigkeit zur rekursiven Selbstkorrektur unter Bruch und Wiederholung gelesen wird. Axiom I liefert den Schlamm, Axiom II den Körper, Axiom III den Bruch, Axiom IV die Closure. die heroische Axiomatik ist die systemtheoretische Klammer um diese existenzielle Architektur.</w:t>
+      </w:r>
+    </w:p>
+    <w:p>
+      <w:pPr>
+        <w:spacing w:after="160" w:line="360" w:lineRule="auto"/>
+        <w:ind w:firstLine="425"/>
+      </w:pPr>
+      <w:r>
+        <w:rPr>
+          <w:rFonts w:ascii="Times New Roman" w:hAnsi="Times New Roman" w:eastAsia="Times New Roman"/>
+          <w:b w:val="0"/>
+          <w:i w:val="0"/>
+          <w:sz w:val="24"/>
+        </w:rPr>
+        <w:t>Im Verhältnis zur Mathematik bedeutet die heroische Axiomatik, Optimierung und Beweislast zusammenzudenken. QUBO und Annealing entscheiden unter Knappheit; die Proof Registry entscheidet unter Wahrheitsknappheit. Beide Knappheiten sind Organe derselben Schließung: ohne sie driftet das System in Beliebigkeit oder Dogma.</w:t>
+      </w:r>
+    </w:p>
+    <w:p>
+      <w:pPr>
+        <w:pStyle w:val="Heading2"/>
+      </w:pPr>
+      <w:r>
+        <w:rPr>
+          <w:rFonts w:ascii="Times New Roman" w:hAnsi="Times New Roman" w:eastAsia="Times New Roman"/>
+          <w:b/>
+          <w:i w:val="0"/>
+          <w:sz w:val="28"/>
+        </w:rPr>
+        <w:t>II.15 Academia-Curriculum und paralleles Lernen</w:t>
+      </w:r>
+    </w:p>
+    <w:p>
+      <w:pPr>
+        <w:spacing w:after="160" w:line="360" w:lineRule="auto"/>
+        <w:ind w:firstLine="425"/>
+      </w:pPr>
+      <w:r>
+        <w:rPr>
+          <w:rFonts w:ascii="Times New Roman" w:hAnsi="Times New Roman" w:eastAsia="Times New Roman"/>
+          <w:b w:val="0"/>
+          <w:i w:val="0"/>
+          <w:sz w:val="24"/>
+        </w:rPr>
+        <w:t>Im Zentrum von das parallele Curriculum steht die Einsicht, dass Systeme ihre eigene Fortsetzbarkeit organisieren müssen, wenn sie mehr sein wollen als flüchtige Toolchains. Fusion Hero OS demonstriert dies, indem es Produktion, Prüfung und Archivierung zu einem Kreis schließt. das parallele Curriculum erscheint damit nicht als spekulative Zutat, sondern als Beschreibung dessen, was der operative Kanon v10.0.0 bereits teilweise verkörpert und was der Ascension-Track als Horizont offen hält.</w:t>
+      </w:r>
+    </w:p>
+    <w:p>
+      <w:pPr>
+        <w:spacing w:after="160" w:line="360" w:lineRule="auto"/>
+        <w:ind w:firstLine="425"/>
+      </w:pPr>
+      <w:r>
+        <w:rPr>
+          <w:rFonts w:ascii="Times New Roman" w:hAnsi="Times New Roman" w:eastAsia="Times New Roman"/>
+          <w:b w:val="0"/>
+          <w:i w:val="0"/>
+          <w:sz w:val="24"/>
+        </w:rPr>
+        <w:t>Historisch betrachtet knüpft das parallele Curriculum an die Linie Maturana/Varela, an kybernetische Second-Order-Ansätze und an die existenzphilosophische Frage an, wie Freiheit unter Faktizität möglich bleibt. Die Arbeit überträgt diese Linie auf ein konkretes sozio-technisches Artefakt mit Mesh, Konnektoren und Proof Registry. Dadurch wird das parallele Curriculum empirisch anschlussfähig: man kann Health-Endpunkte lesen, Manifeste hashen und Placement-Pläne evaluieren.</w:t>
+      </w:r>
+    </w:p>
+    <w:p>
+      <w:pPr>
+        <w:spacing w:after="160" w:line="360" w:lineRule="auto"/>
+        <w:ind w:firstLine="425"/>
+      </w:pPr>
+      <w:r>
+        <w:rPr>
+          <w:rFonts w:ascii="Times New Roman" w:hAnsi="Times New Roman" w:eastAsia="Times New Roman"/>
+          <w:b w:val="0"/>
+          <w:i w:val="0"/>
+          <w:sz w:val="24"/>
+        </w:rPr>
+        <w:t>Methodisch verlangt das parallele Curriculum eine Doppelkompetenz. Einerseits begriffliche Strenge: Definitionen, Kriterien, Normen, Thesentafeln. Andererseits operative Nähe: Hot-Runs, Tailscale-Status, Dashboard-Atmung, Coordinator-Drift-Score. Nur die Verbindung verhindert, dass das parallele Curriculum zur bloßen Rhetorik oder zum bloßen Betrieb ohne Sinn schrumpft.</w:t>
+      </w:r>
+    </w:p>
+    <w:p>
+      <w:pPr>
+        <w:spacing w:after="160" w:line="360" w:lineRule="auto"/>
+        <w:ind w:firstLine="425"/>
+      </w:pPr>
+      <w:r>
+        <w:rPr>
+          <w:rFonts w:ascii="Times New Roman" w:hAnsi="Times New Roman" w:eastAsia="Times New Roman"/>
+          <w:b w:val="0"/>
+          <w:i w:val="0"/>
+          <w:sz w:val="24"/>
+        </w:rPr>
+        <w:t>Kritisch ist festzuhalten, dass das parallele Curriculum keine Heilslehre ist. OFFENE Beweise, offline Nodes, DNS-Warnungen und Namenskollisionen im Academia-Raum gehören zur Realität des Systems. Gerade die Integration dieser Störungen in die Selbstbeschreibung – statt ihrer Verdrängung – macht das parallele Curriculum wissenschaftsfähig.</w:t>
+      </w:r>
+    </w:p>
+    <w:p>
+      <w:pPr>
+        <w:spacing w:after="160" w:line="360" w:lineRule="auto"/>
+        <w:ind w:firstLine="425"/>
+      </w:pPr>
+      <w:r>
+        <w:rPr>
+          <w:rFonts w:ascii="Times New Roman" w:hAnsi="Times New Roman" w:eastAsia="Times New Roman"/>
+          <w:b w:val="0"/>
+          <w:i w:val="0"/>
+          <w:sz w:val="24"/>
+        </w:rPr>
+        <w:t>Praktisch folgt aus das parallele Curriculum eine Reihe von Gestaltungsmaximen: Inhouse-Wahrheit schützen, SaaS membranisieren, schwere Last clusterisieren, interaktive Souveränität am Mainframe belassen, Consent fail-closed halten, Archive deduplizieren ohne Amnesie. Diese Maximen sind in mesh_service_coordination.yaml und verwandten Artefakten bereits als Verfassungsskizze hinterlegt.</w:t>
+      </w:r>
+    </w:p>
+    <w:p>
+      <w:pPr>
+        <w:spacing w:after="160" w:line="360" w:lineRule="auto"/>
+        <w:ind w:firstLine="425"/>
+      </w:pPr>
+      <w:r>
+        <w:rPr>
+          <w:rFonts w:ascii="Times New Roman" w:hAnsi="Times New Roman" w:eastAsia="Times New Roman"/>
+          <w:b w:val="0"/>
+          <w:i w:val="0"/>
+          <w:sz w:val="24"/>
+        </w:rPr>
+        <w:t>Perspektivisch öffnet das parallele Curriculum eine Forschungsagenda, die über das Einzelrepo hinausweist: policy-as-code, formal enggeführte Fixpunkt-Scopes, phone-seitige Curriculum-Exporte, peer-reviewbare Archivreihen und eine rechtlich robuste Consent-Schicht. Die Dissertation setzt den Anfangsstein; der Sisyphos-Zyklus setzt die Fortsetzung.</w:t>
+      </w:r>
+    </w:p>
+    <w:p>
+      <w:pPr>
+        <w:spacing w:after="160" w:line="360" w:lineRule="auto"/>
+        <w:ind w:firstLine="425"/>
+      </w:pPr>
+      <w:r>
+        <w:rPr>
+          <w:rFonts w:ascii="Times New Roman" w:hAnsi="Times New Roman" w:eastAsia="Times New Roman"/>
+          <w:b w:val="0"/>
+          <w:i w:val="0"/>
+          <w:sz w:val="24"/>
+        </w:rPr>
+        <w:t>Im Verhältnis zum Heroismus-Korpus bedeutet das parallele Curriculum, dass Eudaimonia nicht als Gefühlsbilanz, sondern als Fähigkeit zur rekursiven Selbstkorrektur unter Bruch und Wiederholung gelesen wird. Axiom I liefert den Schlamm, Axiom II den Körper, Axiom III den Bruch, Axiom IV die Closure. das parallele Curriculum ist die systemtheoretische Klammer um diese existenzielle Architektur.</w:t>
+      </w:r>
+    </w:p>
+    <w:p>
+      <w:pPr>
+        <w:spacing w:after="160" w:line="360" w:lineRule="auto"/>
+        <w:ind w:firstLine="425"/>
+      </w:pPr>
+      <w:r>
+        <w:rPr>
+          <w:rFonts w:ascii="Times New Roman" w:hAnsi="Times New Roman" w:eastAsia="Times New Roman"/>
+          <w:b w:val="0"/>
+          <w:i w:val="0"/>
+          <w:sz w:val="24"/>
+        </w:rPr>
+        <w:t>Im Verhältnis zur Mathematik bedeutet das parallele Curriculum, Optimierung und Beweislast zusammenzudenken. QUBO und Annealing entscheiden unter Knappheit; die Proof Registry entscheidet unter Wahrheitsknappheit. Beide Knappheiten sind Organe derselben Schließung: ohne sie driftet das System in Beliebigkeit oder Dogma.</w:t>
+      </w:r>
+    </w:p>
+    <w:p>
+      <w:pPr>
+        <w:pStyle w:val="Heading2"/>
+      </w:pPr>
+      <w:r>
+        <w:rPr>
+          <w:rFonts w:ascii="Times New Roman" w:hAnsi="Times New Roman" w:eastAsia="Times New Roman"/>
+          <w:b/>
+          <w:i w:val="0"/>
+          <w:sz w:val="28"/>
+        </w:rPr>
+        <w:t>II.16 Dashboard und die Phänomenologie der Oberfläche</w:t>
+      </w:r>
+    </w:p>
+    <w:p>
+      <w:pPr>
+        <w:spacing w:after="160" w:line="360" w:lineRule="auto"/>
+        <w:ind w:firstLine="425"/>
+      </w:pPr>
+      <w:r>
+        <w:rPr>
+          <w:rFonts w:ascii="Times New Roman" w:hAnsi="Times New Roman" w:eastAsia="Times New Roman"/>
+          <w:b w:val="0"/>
+          <w:i w:val="0"/>
+          <w:sz w:val="24"/>
+        </w:rPr>
+        <w:t>Im Zentrum von die Dashboard-Sensorik steht die Einsicht, dass Systeme ihre eigene Fortsetzbarkeit organisieren müssen, wenn sie mehr sein wollen als flüchtige Toolchains. Fusion Hero OS demonstriert dies, indem es Produktion, Prüfung und Archivierung zu einem Kreis schließt. die Dashboard-Sensorik erscheint damit nicht als spekulative Zutat, sondern als Beschreibung dessen, was der operative Kanon v10.0.0 bereits teilweise verkörpert und was der Ascension-Track als Horizont offen hält.</w:t>
+      </w:r>
+    </w:p>
+    <w:p>
+      <w:pPr>
+        <w:spacing w:after="160" w:line="360" w:lineRule="auto"/>
+        <w:ind w:firstLine="425"/>
+      </w:pPr>
+      <w:r>
+        <w:rPr>
+          <w:rFonts w:ascii="Times New Roman" w:hAnsi="Times New Roman" w:eastAsia="Times New Roman"/>
+          <w:b w:val="0"/>
+          <w:i w:val="0"/>
+          <w:sz w:val="24"/>
+        </w:rPr>
+        <w:t>Historisch betrachtet knüpft die Dashboard-Sensorik an die Linie Maturana/Varela, an kybernetische Second-Order-Ansätze und an die existenzphilosophische Frage an, wie Freiheit unter Faktizität möglich bleibt. Die Arbeit überträgt diese Linie auf ein konkretes sozio-technisches Artefakt mit Mesh, Konnektoren und Proof Registry. Dadurch wird die Dashboard-Sensorik empirisch anschlussfähig: man kann Health-Endpunkte lesen, Manifeste hashen und Placement-Pläne evaluieren.</w:t>
+      </w:r>
+    </w:p>
+    <w:p>
+      <w:pPr>
+        <w:spacing w:after="160" w:line="360" w:lineRule="auto"/>
+        <w:ind w:firstLine="425"/>
+      </w:pPr>
+      <w:r>
+        <w:rPr>
+          <w:rFonts w:ascii="Times New Roman" w:hAnsi="Times New Roman" w:eastAsia="Times New Roman"/>
+          <w:b w:val="0"/>
+          <w:i w:val="0"/>
+          <w:sz w:val="24"/>
+        </w:rPr>
+        <w:t>Methodisch verlangt die Dashboard-Sensorik eine Doppelkompetenz. Einerseits begriffliche Strenge: Definitionen, Kriterien, Normen, Thesentafeln. Andererseits operative Nähe: Hot-Runs, Tailscale-Status, Dashboard-Atmung, Coordinator-Drift-Score. Nur die Verbindung verhindert, dass die Dashboard-Sensorik zur bloßen Rhetorik oder zum bloßen Betrieb ohne Sinn schrumpft.</w:t>
+      </w:r>
+    </w:p>
+    <w:p>
+      <w:pPr>
+        <w:spacing w:after="160" w:line="360" w:lineRule="auto"/>
+        <w:ind w:firstLine="425"/>
+      </w:pPr>
+      <w:r>
+        <w:rPr>
+          <w:rFonts w:ascii="Times New Roman" w:hAnsi="Times New Roman" w:eastAsia="Times New Roman"/>
+          <w:b w:val="0"/>
+          <w:i w:val="0"/>
+          <w:sz w:val="24"/>
+        </w:rPr>
+        <w:t>Kritisch ist festzuhalten, dass die Dashboard-Sensorik keine Heilslehre ist. OFFENE Beweise, offline Nodes, DNS-Warnungen und Namenskollisionen im Academia-Raum gehören zur Realität des Systems. Gerade die Integration dieser Störungen in die Selbstbeschreibung – statt ihrer Verdrängung – macht die Dashboard-Sensorik wissenschaftsfähig.</w:t>
+      </w:r>
+    </w:p>
+    <w:p>
+      <w:pPr>
+        <w:spacing w:after="160" w:line="360" w:lineRule="auto"/>
+        <w:ind w:firstLine="425"/>
+      </w:pPr>
+      <w:r>
+        <w:rPr>
+          <w:rFonts w:ascii="Times New Roman" w:hAnsi="Times New Roman" w:eastAsia="Times New Roman"/>
+          <w:b w:val="0"/>
+          <w:i w:val="0"/>
+          <w:sz w:val="24"/>
+        </w:rPr>
+        <w:t>Praktisch folgt aus die Dashboard-Sensorik eine Reihe von Gestaltungsmaximen: Inhouse-Wahrheit schützen, SaaS membranisieren, schwere Last clusterisieren, interaktive Souveränität am Mainframe belassen, Consent fail-closed halten, Archive deduplizieren ohne Amnesie. Diese Maximen sind in mesh_service_coordination.yaml und verwandten Artefakten bereits als Verfassungsskizze hinterlegt.</w:t>
+      </w:r>
+    </w:p>
+    <w:p>
+      <w:pPr>
+        <w:spacing w:after="160" w:line="360" w:lineRule="auto"/>
+        <w:ind w:firstLine="425"/>
+      </w:pPr>
+      <w:r>
+        <w:rPr>
+          <w:rFonts w:ascii="Times New Roman" w:hAnsi="Times New Roman" w:eastAsia="Times New Roman"/>
+          <w:b w:val="0"/>
+          <w:i w:val="0"/>
+          <w:sz w:val="24"/>
+        </w:rPr>
+        <w:t>Perspektivisch öffnet die Dashboard-Sensorik eine Forschungsagenda, die über das Einzelrepo hinausweist: policy-as-code, formal enggeführte Fixpunkt-Scopes, phone-seitige Curriculum-Exporte, peer-reviewbare Archivreihen und eine rechtlich robuste Consent-Schicht. Die Dissertation setzt den Anfangsstein; der Sisyphos-Zyklus setzt die Fortsetzung.</w:t>
+      </w:r>
+    </w:p>
+    <w:p>
+      <w:pPr>
+        <w:spacing w:after="160" w:line="360" w:lineRule="auto"/>
+        <w:ind w:firstLine="425"/>
+      </w:pPr>
+      <w:r>
+        <w:rPr>
+          <w:rFonts w:ascii="Times New Roman" w:hAnsi="Times New Roman" w:eastAsia="Times New Roman"/>
+          <w:b w:val="0"/>
+          <w:i w:val="0"/>
+          <w:sz w:val="24"/>
+        </w:rPr>
+        <w:t>Im Verhältnis zum Heroismus-Korpus bedeutet die Dashboard-Sensorik, dass Eudaimonia nicht als Gefühlsbilanz, sondern als Fähigkeit zur rekursiven Selbstkorrektur unter Bruch und Wiederholung gelesen wird. Axiom I liefert den Schlamm, Axiom II den Körper, Axiom III den Bruch, Axiom IV die Closure. die Dashboard-Sensorik ist die systemtheoretische Klammer um diese existenzielle Architektur.</w:t>
+      </w:r>
+    </w:p>
+    <w:p>
+      <w:pPr>
+        <w:spacing w:after="160" w:line="360" w:lineRule="auto"/>
+        <w:ind w:firstLine="425"/>
+      </w:pPr>
+      <w:r>
+        <w:rPr>
+          <w:rFonts w:ascii="Times New Roman" w:hAnsi="Times New Roman" w:eastAsia="Times New Roman"/>
+          <w:b w:val="0"/>
+          <w:i w:val="0"/>
+          <w:sz w:val="24"/>
+        </w:rPr>
+        <w:t>Im Verhältnis zur Mathematik bedeutet die Dashboard-Sensorik, Optimierung und Beweislast zusammenzudenken. QUBO und Annealing entscheiden unter Knappheit; die Proof Registry entscheidet unter Wahrheitsknappheit. Beide Knappheiten sind Organe derselben Schließung: ohne sie driftet das System in Beliebigkeit oder Dogma.</w:t>
+      </w:r>
+    </w:p>
+    <w:p>
+      <w:pPr>
+        <w:pStyle w:val="Heading2"/>
+      </w:pPr>
+      <w:r>
+        <w:rPr>
+          <w:rFonts w:ascii="Times New Roman" w:hAnsi="Times New Roman" w:eastAsia="Times New Roman"/>
+          <w:b/>
+          <w:i w:val="0"/>
+          <w:sz w:val="28"/>
+        </w:rPr>
+        <w:t>II.17 Operator-Forschung und second-order cybernetics</w:t>
+      </w:r>
+    </w:p>
+    <w:p>
+      <w:pPr>
+        <w:spacing w:after="160" w:line="360" w:lineRule="auto"/>
+        <w:ind w:firstLine="425"/>
+      </w:pPr>
+      <w:r>
+        <w:rPr>
+          <w:rFonts w:ascii="Times New Roman" w:hAnsi="Times New Roman" w:eastAsia="Times New Roman"/>
+          <w:b w:val="0"/>
+          <w:i w:val="0"/>
+          <w:sz w:val="24"/>
+        </w:rPr>
+        <w:t>Im Zentrum von die Operator-Schließung steht die Einsicht, dass Systeme ihre eigene Fortsetzbarkeit organisieren müssen, wenn sie mehr sein wollen als flüchtige Toolchains. Fusion Hero OS demonstriert dies, indem es Produktion, Prüfung und Archivierung zu einem Kreis schließt. die Operator-Schließung erscheint damit nicht als spekulative Zutat, sondern als Beschreibung dessen, was der operative Kanon v10.0.0 bereits teilweise verkörpert und was der Ascension-Track als Horizont offen hält.</w:t>
+      </w:r>
+    </w:p>
+    <w:p>
+      <w:pPr>
+        <w:spacing w:after="160" w:line="360" w:lineRule="auto"/>
+        <w:ind w:firstLine="425"/>
+      </w:pPr>
+      <w:r>
+        <w:rPr>
+          <w:rFonts w:ascii="Times New Roman" w:hAnsi="Times New Roman" w:eastAsia="Times New Roman"/>
+          <w:b w:val="0"/>
+          <w:i w:val="0"/>
+          <w:sz w:val="24"/>
+        </w:rPr>
+        <w:t>Historisch betrachtet knüpft die Operator-Schließung an die Linie Maturana/Varela, an kybernetische Second-Order-Ansätze und an die existenzphilosophische Frage an, wie Freiheit unter Faktizität möglich bleibt. Die Arbeit überträgt diese Linie auf ein konkretes sozio-technisches Artefakt mit Mesh, Konnektoren und Proof Registry. Dadurch wird die Operator-Schließung empirisch anschlussfähig: man kann Health-Endpunkte lesen, Manifeste hashen und Placement-Pläne evaluieren.</w:t>
+      </w:r>
+    </w:p>
+    <w:p>
+      <w:pPr>
+        <w:spacing w:after="160" w:line="360" w:lineRule="auto"/>
+        <w:ind w:firstLine="425"/>
+      </w:pPr>
+      <w:r>
+        <w:rPr>
+          <w:rFonts w:ascii="Times New Roman" w:hAnsi="Times New Roman" w:eastAsia="Times New Roman"/>
+          <w:b w:val="0"/>
+          <w:i w:val="0"/>
+          <w:sz w:val="24"/>
+        </w:rPr>
+        <w:t>Methodisch verlangt die Operator-Schließung eine Doppelkompetenz. Einerseits begriffliche Strenge: Definitionen, Kriterien, Normen, Thesentafeln. Andererseits operative Nähe: Hot-Runs, Tailscale-Status, Dashboard-Atmung, Coordinator-Drift-Score. Nur die Verbindung verhindert, dass die Operator-Schließung zur bloßen Rhetorik oder zum bloßen Betrieb ohne Sinn schrumpft.</w:t>
+      </w:r>
+    </w:p>
+    <w:p>
+      <w:pPr>
+        <w:spacing w:after="160" w:line="360" w:lineRule="auto"/>
+        <w:ind w:firstLine="425"/>
+      </w:pPr>
+      <w:r>
+        <w:rPr>
+          <w:rFonts w:ascii="Times New Roman" w:hAnsi="Times New Roman" w:eastAsia="Times New Roman"/>
+          <w:b w:val="0"/>
+          <w:i w:val="0"/>
+          <w:sz w:val="24"/>
+        </w:rPr>
+        <w:t>Kritisch ist festzuhalten, dass die Operator-Schließung keine Heilslehre ist. OFFENE Beweise, offline Nodes, DNS-Warnungen und Namenskollisionen im Academia-Raum gehören zur Realität des Systems. Gerade die Integration dieser Störungen in die Selbstbeschreibung – statt ihrer Verdrängung – macht die Operator-Schließung wissenschaftsfähig.</w:t>
+      </w:r>
+    </w:p>
+    <w:p>
+      <w:pPr>
+        <w:spacing w:after="160" w:line="360" w:lineRule="auto"/>
+        <w:ind w:firstLine="425"/>
+      </w:pPr>
+      <w:r>
+        <w:rPr>
+          <w:rFonts w:ascii="Times New Roman" w:hAnsi="Times New Roman" w:eastAsia="Times New Roman"/>
+          <w:b w:val="0"/>
+          <w:i w:val="0"/>
+          <w:sz w:val="24"/>
+        </w:rPr>
+        <w:t>Praktisch folgt aus die Operator-Schließung eine Reihe von Gestaltungsmaximen: Inhouse-Wahrheit schützen, SaaS membranisieren, schwere Last clusterisieren, interaktive Souveränität am Mainframe belassen, Consent fail-closed halten, Archive deduplizieren ohne Amnesie. Diese Maximen sind in mesh_service_coordination.yaml und verwandten Artefakten bereits als Verfassungsskizze hinterlegt.</w:t>
+      </w:r>
+    </w:p>
+    <w:p>
+      <w:pPr>
+        <w:spacing w:after="160" w:line="360" w:lineRule="auto"/>
+        <w:ind w:firstLine="425"/>
+      </w:pPr>
+      <w:r>
+        <w:rPr>
+          <w:rFonts w:ascii="Times New Roman" w:hAnsi="Times New Roman" w:eastAsia="Times New Roman"/>
+          <w:b w:val="0"/>
+          <w:i w:val="0"/>
+          <w:sz w:val="24"/>
+        </w:rPr>
+        <w:t>Perspektivisch öffnet die Operator-Schließung eine Forschungsagenda, die über das Einzelrepo hinausweist: policy-as-code, formal enggeführte Fixpunkt-Scopes, phone-seitige Curriculum-Exporte, peer-reviewbare Archivreihen und eine rechtlich robuste Consent-Schicht. Die Dissertation setzt den Anfangsstein; der Sisyphos-Zyklus setzt die Fortsetzung.</w:t>
+      </w:r>
+    </w:p>
+    <w:p>
+      <w:pPr>
+        <w:spacing w:after="160" w:line="360" w:lineRule="auto"/>
+        <w:ind w:firstLine="425"/>
+      </w:pPr>
+      <w:r>
+        <w:rPr>
+          <w:rFonts w:ascii="Times New Roman" w:hAnsi="Times New Roman" w:eastAsia="Times New Roman"/>
+          <w:b w:val="0"/>
+          <w:i w:val="0"/>
+          <w:sz w:val="24"/>
+        </w:rPr>
+        <w:t>Im Verhältnis zum Heroismus-Korpus bedeutet die Operator-Schließung, dass Eudaimonia nicht als Gefühlsbilanz, sondern als Fähigkeit zur rekursiven Selbstkorrektur unter Bruch und Wiederholung gelesen wird. Axiom I liefert den Schlamm, Axiom II den Körper, Axiom III den Bruch, Axiom IV die Closure. die Operator-Schließung ist die systemtheoretische Klammer um diese existenzielle Architektur.</w:t>
+      </w:r>
+    </w:p>
+    <w:p>
+      <w:pPr>
+        <w:spacing w:after="160" w:line="360" w:lineRule="auto"/>
+        <w:ind w:firstLine="425"/>
+      </w:pPr>
+      <w:r>
+        <w:rPr>
+          <w:rFonts w:ascii="Times New Roman" w:hAnsi="Times New Roman" w:eastAsia="Times New Roman"/>
+          <w:b w:val="0"/>
+          <w:i w:val="0"/>
+          <w:sz w:val="24"/>
+        </w:rPr>
+        <w:t>Im Verhältnis zur Mathematik bedeutet die Operator-Schließung, Optimierung und Beweislast zusammenzudenken. QUBO und Annealing entscheiden unter Knappheit; die Proof Registry entscheidet unter Wahrheitsknappheit. Beide Knappheiten sind Organe derselben Schließung: ohne sie driftet das System in Beliebigkeit oder Dogma.</w:t>
+      </w:r>
+    </w:p>
+    <w:p>
+      <w:pPr>
+        <w:pStyle w:val="Heading2"/>
+      </w:pPr>
+      <w:r>
+        <w:rPr>
+          <w:rFonts w:ascii="Times New Roman" w:hAnsi="Times New Roman" w:eastAsia="Times New Roman"/>
+          <w:b/>
+          <w:i w:val="0"/>
+          <w:sz w:val="28"/>
+        </w:rPr>
+        <w:t>II.18 Grenzen, Risiken und falsche Souveränitäten</w:t>
+      </w:r>
+    </w:p>
+    <w:p>
+      <w:pPr>
+        <w:spacing w:after="160" w:line="360" w:lineRule="auto"/>
+        <w:ind w:firstLine="425"/>
+      </w:pPr>
+      <w:r>
+        <w:rPr>
+          <w:rFonts w:ascii="Times New Roman" w:hAnsi="Times New Roman" w:eastAsia="Times New Roman"/>
+          <w:b w:val="0"/>
+          <w:i w:val="0"/>
+          <w:sz w:val="24"/>
+        </w:rPr>
+        <w:t>Im Zentrum von die Grenzlehre des Systems steht die Einsicht, dass Systeme ihre eigene Fortsetzbarkeit organisieren müssen, wenn sie mehr sein wollen als flüchtige Toolchains. Fusion Hero OS demonstriert dies, indem es Produktion, Prüfung und Archivierung zu einem Kreis schließt. die Grenzlehre des Systems erscheint damit nicht als spekulative Zutat, sondern als Beschreibung dessen, was der operative Kanon v10.0.0 bereits teilweise verkörpert und was der Ascension-Track als Horizont offen hält.</w:t>
+      </w:r>
+    </w:p>
+    <w:p>
+      <w:pPr>
+        <w:spacing w:after="160" w:line="360" w:lineRule="auto"/>
+        <w:ind w:firstLine="425"/>
+      </w:pPr>
+      <w:r>
+        <w:rPr>
+          <w:rFonts w:ascii="Times New Roman" w:hAnsi="Times New Roman" w:eastAsia="Times New Roman"/>
+          <w:b w:val="0"/>
+          <w:i w:val="0"/>
+          <w:sz w:val="24"/>
+        </w:rPr>
+        <w:t>Historisch betrachtet knüpft die Grenzlehre des Systems an die Linie Maturana/Varela, an kybernetische Second-Order-Ansätze und an die existenzphilosophische Frage an, wie Freiheit unter Faktizität möglich bleibt. Die Arbeit überträgt diese Linie auf ein konkretes sozio-technisches Artefakt mit Mesh, Konnektoren und Proof Registry. Dadurch wird die Grenzlehre des Systems empirisch anschlussfähig: man kann Health-Endpunkte lesen, Manifeste hashen und Placement-Pläne evaluieren.</w:t>
+      </w:r>
+    </w:p>
+    <w:p>
+      <w:pPr>
+        <w:spacing w:after="160" w:line="360" w:lineRule="auto"/>
+        <w:ind w:firstLine="425"/>
+      </w:pPr>
+      <w:r>
+        <w:rPr>
+          <w:rFonts w:ascii="Times New Roman" w:hAnsi="Times New Roman" w:eastAsia="Times New Roman"/>
+          <w:b w:val="0"/>
+          <w:i w:val="0"/>
+          <w:sz w:val="24"/>
+        </w:rPr>
+        <w:t>Methodisch verlangt die Grenzlehre des Systems eine Doppelkompetenz. Einerseits begriffliche Strenge: Definitionen, Kriterien, Normen, Thesentafeln. Andererseits operative Nähe: Hot-Runs, Tailscale-Status, Dashboard-Atmung, Coordinator-Drift-Score. Nur die Verbindung verhindert, dass die Grenzlehre des Systems zur bloßen Rhetorik oder zum bloßen Betrieb ohne Sinn schrumpft.</w:t>
+      </w:r>
+    </w:p>
+    <w:p>
+      <w:pPr>
+        <w:spacing w:after="160" w:line="360" w:lineRule="auto"/>
+        <w:ind w:firstLine="425"/>
+      </w:pPr>
+      <w:r>
+        <w:rPr>
+          <w:rFonts w:ascii="Times New Roman" w:hAnsi="Times New Roman" w:eastAsia="Times New Roman"/>
+          <w:b w:val="0"/>
+          <w:i w:val="0"/>
+          <w:sz w:val="24"/>
+        </w:rPr>
+        <w:t>Kritisch ist festzuhalten, dass die Grenzlehre des Systems keine Heilslehre ist. OFFENE Beweise, offline Nodes, DNS-Warnungen und Namenskollisionen im Academia-Raum gehören zur Realität des Systems. Gerade die Integration dieser Störungen in die Selbstbeschreibung – statt ihrer Verdrängung – macht die Grenzlehre des Systems wissenschaftsfähig.</w:t>
+      </w:r>
+    </w:p>
+    <w:p>
+      <w:pPr>
+        <w:spacing w:after="160" w:line="360" w:lineRule="auto"/>
+        <w:ind w:firstLine="425"/>
+      </w:pPr>
+      <w:r>
+        <w:rPr>
+          <w:rFonts w:ascii="Times New Roman" w:hAnsi="Times New Roman" w:eastAsia="Times New Roman"/>
+          <w:b w:val="0"/>
+          <w:i w:val="0"/>
+          <w:sz w:val="24"/>
+        </w:rPr>
+        <w:t>Praktisch folgt aus die Grenzlehre des Systems eine Reihe von Gestaltungsmaximen: Inhouse-Wahrheit schützen, SaaS membranisieren, schwere Last clusterisieren, interaktive Souveränität am Mainframe belassen, Consent fail-closed halten, Archive deduplizieren ohne Amnesie. Diese Maximen sind in mesh_service_coordination.yaml und verwandten Artefakten bereits als Verfassungsskizze hinterlegt.</w:t>
+      </w:r>
+    </w:p>
+    <w:p>
+      <w:pPr>
+        <w:spacing w:after="160" w:line="360" w:lineRule="auto"/>
+        <w:ind w:firstLine="425"/>
+      </w:pPr>
+      <w:r>
+        <w:rPr>
+          <w:rFonts w:ascii="Times New Roman" w:hAnsi="Times New Roman" w:eastAsia="Times New Roman"/>
+          <w:b w:val="0"/>
+          <w:i w:val="0"/>
+          <w:sz w:val="24"/>
+        </w:rPr>
+        <w:t>Perspektivisch öffnet die Grenzlehre des Systems eine Forschungsagenda, die über das Einzelrepo hinausweist: policy-as-code, formal enggeführte Fixpunkt-Scopes, phone-seitige Curriculum-Exporte, peer-reviewbare Archivreihen und eine rechtlich robuste Consent-Schicht. Die Dissertation setzt den Anfangsstein; der Sisyphos-Zyklus setzt die Fortsetzung.</w:t>
+      </w:r>
+    </w:p>
+    <w:p>
+      <w:pPr>
+        <w:spacing w:after="160" w:line="360" w:lineRule="auto"/>
+        <w:ind w:firstLine="425"/>
+      </w:pPr>
+      <w:r>
+        <w:rPr>
+          <w:rFonts w:ascii="Times New Roman" w:hAnsi="Times New Roman" w:eastAsia="Times New Roman"/>
+          <w:b w:val="0"/>
+          <w:i w:val="0"/>
+          <w:sz w:val="24"/>
+        </w:rPr>
+        <w:t>Im Verhältnis zum Heroismus-Korpus bedeutet die Grenzlehre des Systems, dass Eudaimonia nicht als Gefühlsbilanz, sondern als Fähigkeit zur rekursiven Selbstkorrektur unter Bruch und Wiederholung gelesen wird. Axiom I liefert den Schlamm, Axiom II den Körper, Axiom III den Bruch, Axiom IV die Closure. die Grenzlehre des Systems ist die systemtheoretische Klammer um diese existenzielle Architektur.</w:t>
+      </w:r>
+    </w:p>
+    <w:p>
+      <w:pPr>
+        <w:spacing w:after="160" w:line="360" w:lineRule="auto"/>
+        <w:ind w:firstLine="425"/>
+      </w:pPr>
+      <w:r>
+        <w:rPr>
+          <w:rFonts w:ascii="Times New Roman" w:hAnsi="Times New Roman" w:eastAsia="Times New Roman"/>
+          <w:b w:val="0"/>
+          <w:i w:val="0"/>
+          <w:sz w:val="24"/>
+        </w:rPr>
+        <w:t>Im Verhältnis zur Mathematik bedeutet die Grenzlehre des Systems, Optimierung und Beweislast zusammenzudenken. QUBO und Annealing entscheiden unter Knappheit; die Proof Registry entscheidet unter Wahrheitsknappheit. Beide Knappheiten sind Organe derselben Schließung: ohne sie driftet das System in Beliebigkeit oder Dogma.</w:t>
+      </w:r>
+    </w:p>
+    <w:p>
+      <w:r>
+        <w:br w:type="page"/>
+      </w:r>
+    </w:p>
+    <w:p>
+      <w:pPr>
+        <w:pStyle w:val="Heading1"/>
+      </w:pPr>
+      <w:r>
+        <w:rPr>
+          <w:rFonts w:ascii="Times New Roman" w:hAnsi="Times New Roman" w:eastAsia="Times New Roman"/>
+          <w:b/>
+          <w:i w:val="0"/>
+          <w:sz w:val="32"/>
+        </w:rPr>
+        <w:t>II.19 Vollständige Archivdurchdringung (narrativ)</w:t>
+      </w:r>
+    </w:p>
+    <w:p>
+      <w:pPr>
+        <w:spacing w:after="160" w:line="360" w:lineRule="auto"/>
+        <w:ind w:firstLine="425"/>
+      </w:pPr>
+      <w:r>
+        <w:rPr>
+          <w:rFonts w:ascii="Times New Roman" w:hAnsi="Times New Roman" w:eastAsia="Times New Roman"/>
+          <w:b w:val="0"/>
+          <w:i w:val="0"/>
+          <w:sz w:val="24"/>
+        </w:rPr>
+        <w:t>Die folgende Durchdringung benennt die Archivklassen und bindet sie an die Leitunterscheidung. Sie ersetzt nicht das Dateisystem, sondern deutet es.</w:t>
+      </w:r>
+    </w:p>
+    <w:p>
+      <w:pPr>
+        <w:pStyle w:val="Heading2"/>
+      </w:pPr>
+      <w:r>
+        <w:rPr>
+          <w:rFonts w:ascii="Times New Roman" w:hAnsi="Times New Roman" w:eastAsia="Times New Roman"/>
+          <w:b/>
+          <w:i w:val="0"/>
+          <w:sz w:val="28"/>
+        </w:rPr>
+        <w:t>Framework-Core-PDFs</w:t>
+      </w:r>
+    </w:p>
+    <w:p>
+      <w:pPr>
+        <w:spacing w:after="160" w:line="360" w:lineRule="auto"/>
+        <w:ind w:firstLine="425"/>
+      </w:pPr>
+      <w:r>
+        <w:rPr>
+          <w:rFonts w:ascii="Times New Roman" w:hAnsi="Times New Roman" w:eastAsia="Times New Roman"/>
+          <w:b w:val="0"/>
+          <w:i w:val="0"/>
+          <w:sz w:val="24"/>
+        </w:rPr>
+        <w:t>Die Klasse „Framework-Core-PDFs“ fungiert als organisationale Urszenen und Evolutionshorizonte. Autopoietisch erzeugt oder bewahrt sie Komponenten der Fortsetzung; autopolitisch regelt sie, wer diese Komponenten setzen, lesen, spiegeln oder nur kalt lagern darf. Im Heißlauf zeigt sich ihre Relevanz daran, ob Reintegration, Health und Placement auf sie zurückgreifen können.</w:t>
+      </w:r>
+    </w:p>
+    <w:p>
+      <w:pPr>
+        <w:spacing w:after="160" w:line="360" w:lineRule="auto"/>
+        <w:ind w:firstLine="425"/>
+      </w:pPr>
+      <w:r>
+        <w:rPr>
+          <w:rFonts w:ascii="Times New Roman" w:hAnsi="Times New Roman" w:eastAsia="Times New Roman"/>
+          <w:b w:val="0"/>
+          <w:i w:val="0"/>
+          <w:sz w:val="24"/>
+        </w:rPr>
+        <w:t>Für Stephan Hagen Urban als Autor bedeutet „Framework-Core-PDFs“ zugleich Werkstatt und Verantwortung: Jede Lücke in dieser Klasse ist eine potenzielle Lücke der Selbstproduktion. Die Dissertation kartiert diese Verantwortung, ohne zu behaupten, jede Datei sei bereits vollintegriert. Kartierung ist der erste Akt der Reintegration.</w:t>
+      </w:r>
+    </w:p>
+    <w:p>
+      <w:pPr>
+        <w:pStyle w:val="Heading2"/>
+      </w:pPr>
+      <w:r>
+        <w:rPr>
+          <w:rFonts w:ascii="Times New Roman" w:hAnsi="Times New Roman" w:eastAsia="Times New Roman"/>
+          <w:b/>
+          <w:i w:val="0"/>
+          <w:sz w:val="28"/>
+        </w:rPr>
+        <w:t>Coevolution-/Execution-Reports</w:t>
+      </w:r>
+    </w:p>
+    <w:p>
+      <w:pPr>
+        <w:spacing w:after="160" w:line="360" w:lineRule="auto"/>
+        <w:ind w:firstLine="425"/>
+      </w:pPr>
+      <w:r>
+        <w:rPr>
+          <w:rFonts w:ascii="Times New Roman" w:hAnsi="Times New Roman" w:eastAsia="Times New Roman"/>
+          <w:b w:val="0"/>
+          <w:i w:val="0"/>
+          <w:sz w:val="24"/>
+        </w:rPr>
+        <w:t>Die Klasse „Coevolution-/Execution-Reports“ fungiert als Protokollschichten früherer Regenerationszyklen. Autopoietisch erzeugt oder bewahrt sie Komponenten der Fortsetzung; autopolitisch regelt sie, wer diese Komponenten setzen, lesen, spiegeln oder nur kalt lagern darf. Im Heißlauf zeigt sich ihre Relevanz daran, ob Reintegration, Health und Placement auf sie zurückgreifen können.</w:t>
+      </w:r>
+    </w:p>
+    <w:p>
+      <w:pPr>
+        <w:spacing w:after="160" w:line="360" w:lineRule="auto"/>
+        <w:ind w:firstLine="425"/>
+      </w:pPr>
+      <w:r>
+        <w:rPr>
+          <w:rFonts w:ascii="Times New Roman" w:hAnsi="Times New Roman" w:eastAsia="Times New Roman"/>
+          <w:b w:val="0"/>
+          <w:i w:val="0"/>
+          <w:sz w:val="24"/>
+        </w:rPr>
+        <w:t>Für Stephan Hagen Urban als Autor bedeutet „Coevolution-/Execution-Reports“ zugleich Werkstatt und Verantwortung: Jede Lücke in dieser Klasse ist eine potenzielle Lücke der Selbstproduktion. Die Dissertation kartiert diese Verantwortung, ohne zu behaupten, jede Datei sei bereits vollintegriert. Kartierung ist der erste Akt der Reintegration.</w:t>
+      </w:r>
+    </w:p>
+    <w:p>
+      <w:pPr>
+        <w:pStyle w:val="Heading2"/>
+      </w:pPr>
+      <w:r>
+        <w:rPr>
+          <w:rFonts w:ascii="Times New Roman" w:hAnsi="Times New Roman" w:eastAsia="Times New Roman"/>
+          <w:b/>
+          <w:i w:val="0"/>
+          <w:sz w:val="28"/>
+        </w:rPr>
+        <w:t>Architekturpapiere</w:t>
+      </w:r>
+    </w:p>
+    <w:p>
+      <w:pPr>
+        <w:spacing w:after="160" w:line="360" w:lineRule="auto"/>
+        <w:ind w:firstLine="425"/>
+      </w:pPr>
+      <w:r>
+        <w:rPr>
+          <w:rFonts w:ascii="Times New Roman" w:hAnsi="Times New Roman" w:eastAsia="Times New Roman"/>
+          <w:b w:val="0"/>
+          <w:i w:val="0"/>
+          <w:sz w:val="24"/>
+        </w:rPr>
+        <w:t>Die Klasse „Architekturpapiere“ fungiert als Baupläne der Schließung und Beschleunigung. Autopoietisch erzeugt oder bewahrt sie Komponenten der Fortsetzung; autopolitisch regelt sie, wer diese Komponenten setzen, lesen, spiegeln oder nur kalt lagern darf. Im Heißlauf zeigt sich ihre Relevanz daran, ob Reintegration, Health und Placement auf sie zurückgreifen können.</w:t>
+      </w:r>
+    </w:p>
+    <w:p>
+      <w:pPr>
+        <w:spacing w:after="160" w:line="360" w:lineRule="auto"/>
+        <w:ind w:firstLine="425"/>
+      </w:pPr>
+      <w:r>
+        <w:rPr>
+          <w:rFonts w:ascii="Times New Roman" w:hAnsi="Times New Roman" w:eastAsia="Times New Roman"/>
+          <w:b w:val="0"/>
+          <w:i w:val="0"/>
+          <w:sz w:val="24"/>
+        </w:rPr>
+        <w:t>Für Stephan Hagen Urban als Autor bedeutet „Architekturpapiere“ zugleich Werkstatt und Verantwortung: Jede Lücke in dieser Klasse ist eine potenzielle Lücke der Selbstproduktion. Die Dissertation kartiert diese Verantwortung, ohne zu behaupten, jede Datei sei bereits vollintegriert. Kartierung ist der erste Akt der Reintegration.</w:t>
+      </w:r>
+    </w:p>
+    <w:p>
+      <w:pPr>
+        <w:pStyle w:val="Heading2"/>
+      </w:pPr>
+      <w:r>
+        <w:rPr>
+          <w:rFonts w:ascii="Times New Roman" w:hAnsi="Times New Roman" w:eastAsia="Times New Roman"/>
+          <w:b/>
+          <w:i w:val="0"/>
+          <w:sz w:val="28"/>
+        </w:rPr>
+        <w:t>Bücher und Overviews</w:t>
+      </w:r>
+    </w:p>
+    <w:p>
+      <w:pPr>
+        <w:spacing w:after="160" w:line="360" w:lineRule="auto"/>
+        <w:ind w:firstLine="425"/>
+      </w:pPr>
+      <w:r>
+        <w:rPr>
+          <w:rFonts w:ascii="Times New Roman" w:hAnsi="Times New Roman" w:eastAsia="Times New Roman"/>
+          <w:b w:val="0"/>
+          <w:i w:val="0"/>
+          <w:sz w:val="24"/>
+        </w:rPr>
+        <w:t>Die Klasse „Bücher und Overviews“ fungiert als langsame Kanones der heroischen Informatik und Philosophie. Autopoietisch erzeugt oder bewahrt sie Komponenten der Fortsetzung; autopolitisch regelt sie, wer diese Komponenten setzen, lesen, spiegeln oder nur kalt lagern darf. Im Heißlauf zeigt sich ihre Relevanz daran, ob Reintegration, Health und Placement auf sie zurückgreifen können.</w:t>
+      </w:r>
+    </w:p>
+    <w:p>
+      <w:pPr>
+        <w:spacing w:after="160" w:line="360" w:lineRule="auto"/>
+        <w:ind w:firstLine="425"/>
+      </w:pPr>
+      <w:r>
+        <w:rPr>
+          <w:rFonts w:ascii="Times New Roman" w:hAnsi="Times New Roman" w:eastAsia="Times New Roman"/>
+          <w:b w:val="0"/>
+          <w:i w:val="0"/>
+          <w:sz w:val="24"/>
+        </w:rPr>
+        <w:t>Für Stephan Hagen Urban als Autor bedeutet „Bücher und Overviews“ zugleich Werkstatt und Verantwortung: Jede Lücke in dieser Klasse ist eine potenzielle Lücke der Selbstproduktion. Die Dissertation kartiert diese Verantwortung, ohne zu behaupten, jede Datei sei bereits vollintegriert. Kartierung ist der erste Akt der Reintegration.</w:t>
+      </w:r>
+    </w:p>
+    <w:p>
+      <w:pPr>
+        <w:pStyle w:val="Heading2"/>
+      </w:pPr>
+      <w:r>
+        <w:rPr>
+          <w:rFonts w:ascii="Times New Roman" w:hAnsi="Times New Roman" w:eastAsia="Times New Roman"/>
+          <w:b/>
+          <w:i w:val="0"/>
+          <w:sz w:val="28"/>
+        </w:rPr>
+        <w:t>Buch Der Heroische Mensch</w:t>
+      </w:r>
+    </w:p>
+    <w:p>
+      <w:pPr>
+        <w:spacing w:after="160" w:line="360" w:lineRule="auto"/>
+        <w:ind w:firstLine="425"/>
+      </w:pPr>
+      <w:r>
+        <w:rPr>
+          <w:rFonts w:ascii="Times New Roman" w:hAnsi="Times New Roman" w:eastAsia="Times New Roman"/>
+          <w:b w:val="0"/>
+          <w:i w:val="0"/>
+          <w:sz w:val="24"/>
+        </w:rPr>
+        <w:t>Die Klasse „Buch Der Heroische Mensch“ fungiert als narrative Embodiment-Schicht mit Programmkorpus. Autopoietisch erzeugt oder bewahrt sie Komponenten der Fortsetzung; autopolitisch regelt sie, wer diese Komponenten setzen, lesen, spiegeln oder nur kalt lagern darf. Im Heißlauf zeigt sich ihre Relevanz daran, ob Reintegration, Health und Placement auf sie zurückgreifen können.</w:t>
+      </w:r>
+    </w:p>
+    <w:p>
+      <w:pPr>
+        <w:spacing w:after="160" w:line="360" w:lineRule="auto"/>
+        <w:ind w:firstLine="425"/>
+      </w:pPr>
+      <w:r>
+        <w:rPr>
+          <w:rFonts w:ascii="Times New Roman" w:hAnsi="Times New Roman" w:eastAsia="Times New Roman"/>
+          <w:b w:val="0"/>
+          <w:i w:val="0"/>
+          <w:sz w:val="24"/>
+        </w:rPr>
+        <w:t>Für Stephan Hagen Urban als Autor bedeutet „Buch Der Heroische Mensch“ zugleich Werkstatt und Verantwortung: Jede Lücke in dieser Klasse ist eine potenzielle Lücke der Selbstproduktion. Die Dissertation kartiert diese Verantwortung, ohne zu behaupten, jede Datei sei bereits vollintegriert. Kartierung ist der erste Akt der Reintegration.</w:t>
+      </w:r>
+    </w:p>
+    <w:p>
+      <w:pPr>
+        <w:pStyle w:val="Heading2"/>
+      </w:pPr>
+      <w:r>
+        <w:rPr>
+          <w:rFonts w:ascii="Times New Roman" w:hAnsi="Times New Roman" w:eastAsia="Times New Roman"/>
+          <w:b/>
+          <w:i w:val="0"/>
+          <w:sz w:val="28"/>
+        </w:rPr>
+        <w:t>docs/01_vision bis 04_execution</w:t>
+      </w:r>
+    </w:p>
+    <w:p>
+      <w:pPr>
+        <w:spacing w:after="160" w:line="360" w:lineRule="auto"/>
+        <w:ind w:firstLine="425"/>
+      </w:pPr>
+      <w:r>
+        <w:rPr>
+          <w:rFonts w:ascii="Times New Roman" w:hAnsi="Times New Roman" w:eastAsia="Times New Roman"/>
+          <w:b w:val="0"/>
+          <w:i w:val="0"/>
+          <w:sz w:val="24"/>
+        </w:rPr>
+        <w:t>Die Klasse „docs/01_vision bis 04_execution“ fungiert als geschichtete Forschungsadministration. Autopoietisch erzeugt oder bewahrt sie Komponenten der Fortsetzung; autopolitisch regelt sie, wer diese Komponenten setzen, lesen, spiegeln oder nur kalt lagern darf. Im Heißlauf zeigt sich ihre Relevanz daran, ob Reintegration, Health und Placement auf sie zurückgreifen können.</w:t>
+      </w:r>
+    </w:p>
+    <w:p>
+      <w:pPr>
+        <w:spacing w:after="160" w:line="360" w:lineRule="auto"/>
+        <w:ind w:firstLine="425"/>
+      </w:pPr>
+      <w:r>
+        <w:rPr>
+          <w:rFonts w:ascii="Times New Roman" w:hAnsi="Times New Roman" w:eastAsia="Times New Roman"/>
+          <w:b w:val="0"/>
+          <w:i w:val="0"/>
+          <w:sz w:val="24"/>
+        </w:rPr>
+        <w:t>Für Stephan Hagen Urban als Autor bedeutet „docs/01_vision bis 04_execution“ zugleich Werkstatt und Verantwortung: Jede Lücke in dieser Klasse ist eine potenzielle Lücke der Selbstproduktion. Die Dissertation kartiert diese Verantwortung, ohne zu behaupten, jede Datei sei bereits vollintegriert. Kartierung ist der erste Akt der Reintegration.</w:t>
+      </w:r>
+    </w:p>
+    <w:p>
+      <w:pPr>
+        <w:pStyle w:val="Heading2"/>
+      </w:pPr>
+      <w:r>
+        <w:rPr>
+          <w:rFonts w:ascii="Times New Roman" w:hAnsi="Times New Roman" w:eastAsia="Times New Roman"/>
+          <w:b/>
+          <w:i w:val="0"/>
+          <w:sz w:val="28"/>
+        </w:rPr>
+        <w:t>docs/v8 und Erkenntnisse-Index</w:t>
+      </w:r>
+    </w:p>
+    <w:p>
+      <w:pPr>
+        <w:spacing w:after="160" w:line="360" w:lineRule="auto"/>
+        <w:ind w:firstLine="425"/>
+      </w:pPr>
+      <w:r>
+        <w:rPr>
+          <w:rFonts w:ascii="Times New Roman" w:hAnsi="Times New Roman" w:eastAsia="Times New Roman"/>
+          <w:b w:val="0"/>
+          <w:i w:val="0"/>
+          <w:sz w:val="24"/>
+        </w:rPr>
+        <w:t>Die Klasse „docs/v8 und Erkenntnisse-Index“ fungiert als institutionalisierte Selbstkritik. Autopoietisch erzeugt oder bewahrt sie Komponenten der Fortsetzung; autopolitisch regelt sie, wer diese Komponenten setzen, lesen, spiegeln oder nur kalt lagern darf. Im Heißlauf zeigt sich ihre Relevanz daran, ob Reintegration, Health und Placement auf sie zurückgreifen können.</w:t>
+      </w:r>
+    </w:p>
+    <w:p>
+      <w:pPr>
+        <w:spacing w:after="160" w:line="360" w:lineRule="auto"/>
+        <w:ind w:firstLine="425"/>
+      </w:pPr>
+      <w:r>
+        <w:rPr>
+          <w:rFonts w:ascii="Times New Roman" w:hAnsi="Times New Roman" w:eastAsia="Times New Roman"/>
+          <w:b w:val="0"/>
+          <w:i w:val="0"/>
+          <w:sz w:val="24"/>
+        </w:rPr>
+        <w:t>Für Stephan Hagen Urban als Autor bedeutet „docs/v8 und Erkenntnisse-Index“ zugleich Werkstatt und Verantwortung: Jede Lücke in dieser Klasse ist eine potenzielle Lücke der Selbstproduktion. Die Dissertation kartiert diese Verantwortung, ohne zu behaupten, jede Datei sei bereits vollintegriert. Kartierung ist der erste Akt der Reintegration.</w:t>
+      </w:r>
+    </w:p>
+    <w:p>
+      <w:pPr>
+        <w:pStyle w:val="Heading2"/>
+      </w:pPr>
+      <w:r>
+        <w:rPr>
+          <w:rFonts w:ascii="Times New Roman" w:hAnsi="Times New Roman" w:eastAsia="Times New Roman"/>
+          <w:b/>
+          <w:i w:val="0"/>
+          <w:sz w:val="28"/>
+        </w:rPr>
+        <w:t>docs/Heroismus</w:t>
+      </w:r>
+    </w:p>
+    <w:p>
+      <w:pPr>
+        <w:spacing w:after="160" w:line="360" w:lineRule="auto"/>
+        <w:ind w:firstLine="425"/>
+      </w:pPr>
+      <w:r>
+        <w:rPr>
+          <w:rFonts w:ascii="Times New Roman" w:hAnsi="Times New Roman" w:eastAsia="Times New Roman"/>
+          <w:b w:val="0"/>
+          <w:i w:val="0"/>
+          <w:sz w:val="24"/>
+        </w:rPr>
+        <w:t>Die Klasse „docs/Heroismus“ fungiert als axiomatische Kurzform der Ethik. Autopoietisch erzeugt oder bewahrt sie Komponenten der Fortsetzung; autopolitisch regelt sie, wer diese Komponenten setzen, lesen, spiegeln oder nur kalt lagern darf. Im Heißlauf zeigt sich ihre Relevanz daran, ob Reintegration, Health und Placement auf sie zurückgreifen können.</w:t>
+      </w:r>
+    </w:p>
+    <w:p>
+      <w:pPr>
+        <w:spacing w:after="160" w:line="360" w:lineRule="auto"/>
+        <w:ind w:firstLine="425"/>
+      </w:pPr>
+      <w:r>
+        <w:rPr>
+          <w:rFonts w:ascii="Times New Roman" w:hAnsi="Times New Roman" w:eastAsia="Times New Roman"/>
+          <w:b w:val="0"/>
+          <w:i w:val="0"/>
+          <w:sz w:val="24"/>
+        </w:rPr>
+        <w:t>Für Stephan Hagen Urban als Autor bedeutet „docs/Heroismus“ zugleich Werkstatt und Verantwortung: Jede Lücke in dieser Klasse ist eine potenzielle Lücke der Selbstproduktion. Die Dissertation kartiert diese Verantwortung, ohne zu behaupten, jede Datei sei bereits vollintegriert. Kartierung ist der erste Akt der Reintegration.</w:t>
+      </w:r>
+    </w:p>
+    <w:p>
+      <w:pPr>
+        <w:pStyle w:val="Heading2"/>
+      </w:pPr>
+      <w:r>
+        <w:rPr>
+          <w:rFonts w:ascii="Times New Roman" w:hAnsi="Times New Roman" w:eastAsia="Times New Roman"/>
+          <w:b/>
+          <w:i w:val="0"/>
+          <w:sz w:val="28"/>
+        </w:rPr>
+        <w:t>ascension_os</w:t>
+      </w:r>
+    </w:p>
+    <w:p>
+      <w:pPr>
+        <w:spacing w:after="160" w:line="360" w:lineRule="auto"/>
+        <w:ind w:firstLine="425"/>
+      </w:pPr>
+      <w:r>
+        <w:rPr>
+          <w:rFonts w:ascii="Times New Roman" w:hAnsi="Times New Roman" w:eastAsia="Times New Roman"/>
+          <w:b w:val="0"/>
+          <w:i w:val="0"/>
+          <w:sz w:val="24"/>
+        </w:rPr>
+        <w:t>Die Klasse „ascension_os“ fungiert als aspirationaler Closure- und Consent-Track. Autopoietisch erzeugt oder bewahrt sie Komponenten der Fortsetzung; autopolitisch regelt sie, wer diese Komponenten setzen, lesen, spiegeln oder nur kalt lagern darf. Im Heißlauf zeigt sich ihre Relevanz daran, ob Reintegration, Health und Placement auf sie zurückgreifen können.</w:t>
+      </w:r>
+    </w:p>
+    <w:p>
+      <w:pPr>
+        <w:spacing w:after="160" w:line="360" w:lineRule="auto"/>
+        <w:ind w:firstLine="425"/>
+      </w:pPr>
+      <w:r>
+        <w:rPr>
+          <w:rFonts w:ascii="Times New Roman" w:hAnsi="Times New Roman" w:eastAsia="Times New Roman"/>
+          <w:b w:val="0"/>
+          <w:i w:val="0"/>
+          <w:sz w:val="24"/>
+        </w:rPr>
+        <w:t>Für Stephan Hagen Urban als Autor bedeutet „ascension_os“ zugleich Werkstatt und Verantwortung: Jede Lücke in dieser Klasse ist eine potenzielle Lücke der Selbstproduktion. Die Dissertation kartiert diese Verantwortung, ohne zu behaupten, jede Datei sei bereits vollintegriert. Kartierung ist der erste Akt der Reintegration.</w:t>
+      </w:r>
+    </w:p>
+    <w:p>
+      <w:pPr>
+        <w:pStyle w:val="Heading2"/>
+      </w:pPr>
+      <w:r>
+        <w:rPr>
+          <w:rFonts w:ascii="Times New Roman" w:hAnsi="Times New Roman" w:eastAsia="Times New Roman"/>
+          <w:b/>
+          <w:i w:val="0"/>
+          <w:sz w:val="28"/>
+        </w:rPr>
+        <w:t>infra/k8s und terraform</w:t>
+      </w:r>
+    </w:p>
+    <w:p>
+      <w:pPr>
+        <w:spacing w:after="160" w:line="360" w:lineRule="auto"/>
+        <w:ind w:firstLine="425"/>
+      </w:pPr>
+      <w:r>
+        <w:rPr>
+          <w:rFonts w:ascii="Times New Roman" w:hAnsi="Times New Roman" w:eastAsia="Times New Roman"/>
+          <w:b w:val="0"/>
+          <w:i w:val="0"/>
+          <w:sz w:val="24"/>
+        </w:rPr>
+        <w:t>Die Klasse „infra/k8s und terraform“ fungiert als Muskel- und Identitätsbinding der Cloud. Autopoietisch erzeugt oder bewahrt sie Komponenten der Fortsetzung; autopolitisch regelt sie, wer diese Komponenten setzen, lesen, spiegeln oder nur kalt lagern darf. Im Heißlauf zeigt sich ihre Relevanz daran, ob Reintegration, Health und Placement auf sie zurückgreifen können.</w:t>
+      </w:r>
+    </w:p>
+    <w:p>
+      <w:pPr>
+        <w:spacing w:after="160" w:line="360" w:lineRule="auto"/>
+        <w:ind w:firstLine="425"/>
+      </w:pPr>
+      <w:r>
+        <w:rPr>
+          <w:rFonts w:ascii="Times New Roman" w:hAnsi="Times New Roman" w:eastAsia="Times New Roman"/>
+          <w:b w:val="0"/>
+          <w:i w:val="0"/>
+          <w:sz w:val="24"/>
+        </w:rPr>
+        <w:t>Für Stephan Hagen Urban als Autor bedeutet „infra/k8s und terraform“ zugleich Werkstatt und Verantwortung: Jede Lücke in dieser Klasse ist eine potenzielle Lücke der Selbstproduktion. Die Dissertation kartiert diese Verantwortung, ohne zu behaupten, jede Datei sei bereits vollintegriert. Kartierung ist der erste Akt der Reintegration.</w:t>
+      </w:r>
+    </w:p>
+    <w:p>
+      <w:pPr>
+        <w:pStyle w:val="Heading2"/>
+      </w:pPr>
+      <w:r>
+        <w:rPr>
+          <w:rFonts w:ascii="Times New Roman" w:hAnsi="Times New Roman" w:eastAsia="Times New Roman"/>
+          <w:b/>
+          <w:i w:val="0"/>
+          <w:sz w:val="28"/>
+        </w:rPr>
+        <w:t>tests und proof_registry</w:t>
+      </w:r>
+    </w:p>
+    <w:p>
+      <w:pPr>
+        <w:spacing w:after="160" w:line="360" w:lineRule="auto"/>
+        <w:ind w:firstLine="425"/>
+      </w:pPr>
+      <w:r>
+        <w:rPr>
+          <w:rFonts w:ascii="Times New Roman" w:hAnsi="Times New Roman" w:eastAsia="Times New Roman"/>
+          <w:b w:val="0"/>
+          <w:i w:val="0"/>
+          <w:sz w:val="24"/>
+        </w:rPr>
+        <w:t>Die Klasse „tests und proof_registry“ fungiert als forensisches Immunsystem. Autopoietisch erzeugt oder bewahrt sie Komponenten der Fortsetzung; autopolitisch regelt sie, wer diese Komponenten setzen, lesen, spiegeln oder nur kalt lagern darf. Im Heißlauf zeigt sich ihre Relevanz daran, ob Reintegration, Health und Placement auf sie zurückgreifen können.</w:t>
+      </w:r>
+    </w:p>
+    <w:p>
+      <w:pPr>
+        <w:spacing w:after="160" w:line="360" w:lineRule="auto"/>
+        <w:ind w:firstLine="425"/>
+      </w:pPr>
+      <w:r>
+        <w:rPr>
+          <w:rFonts w:ascii="Times New Roman" w:hAnsi="Times New Roman" w:eastAsia="Times New Roman"/>
+          <w:b w:val="0"/>
+          <w:i w:val="0"/>
+          <w:sz w:val="24"/>
+        </w:rPr>
+        <w:t>Für Stephan Hagen Urban als Autor bedeutet „tests und proof_registry“ zugleich Werkstatt und Verantwortung: Jede Lücke in dieser Klasse ist eine potenzielle Lücke der Selbstproduktion. Die Dissertation kartiert diese Verantwortung, ohne zu behaupten, jede Datei sei bereits vollintegriert. Kartierung ist der erste Akt der Reintegration.</w:t>
+      </w:r>
+    </w:p>
+    <w:p>
+      <w:pPr>
+        <w:pStyle w:val="Heading2"/>
+      </w:pPr>
+      <w:r>
+        <w:rPr>
+          <w:rFonts w:ascii="Times New Roman" w:hAnsi="Times New Roman" w:eastAsia="Times New Roman"/>
+          <w:b/>
+          <w:i w:val="0"/>
+          <w:sz w:val="28"/>
+        </w:rPr>
+        <w:t>mesh- und coordination-YAMLs</w:t>
+      </w:r>
+    </w:p>
+    <w:p>
+      <w:pPr>
+        <w:spacing w:after="160" w:line="360" w:lineRule="auto"/>
+        <w:ind w:firstLine="425"/>
+      </w:pPr>
+      <w:r>
+        <w:rPr>
+          <w:rFonts w:ascii="Times New Roman" w:hAnsi="Times New Roman" w:eastAsia="Times New Roman"/>
+          <w:b w:val="0"/>
+          <w:i w:val="0"/>
+          <w:sz w:val="24"/>
+        </w:rPr>
+        <w:t>Die Klasse „mesh- und coordination-YAMLs“ fungiert als Verfassungstexte der Autopolitik. Autopoietisch erzeugt oder bewahrt sie Komponenten der Fortsetzung; autopolitisch regelt sie, wer diese Komponenten setzen, lesen, spiegeln oder nur kalt lagern darf. Im Heißlauf zeigt sich ihre Relevanz daran, ob Reintegration, Health und Placement auf sie zurückgreifen können.</w:t>
+      </w:r>
+    </w:p>
+    <w:p>
+      <w:pPr>
+        <w:spacing w:after="160" w:line="360" w:lineRule="auto"/>
+        <w:ind w:firstLine="425"/>
+      </w:pPr>
+      <w:r>
+        <w:rPr>
+          <w:rFonts w:ascii="Times New Roman" w:hAnsi="Times New Roman" w:eastAsia="Times New Roman"/>
+          <w:b w:val="0"/>
+          <w:i w:val="0"/>
+          <w:sz w:val="24"/>
+        </w:rPr>
+        <w:t>Für Stephan Hagen Urban als Autor bedeutet „mesh- und coordination-YAMLs“ zugleich Werkstatt und Verantwortung: Jede Lücke in dieser Klasse ist eine potenzielle Lücke der Selbstproduktion. Die Dissertation kartiert diese Verantwortung, ohne zu behaupten, jede Datei sei bereits vollintegriert. Kartierung ist der erste Akt der Reintegration.</w:t>
+      </w:r>
+    </w:p>
+    <w:p>
+      <w:pPr>
+        <w:pStyle w:val="Heading2"/>
+      </w:pPr>
+      <w:r>
+        <w:rPr>
+          <w:rFonts w:ascii="Times New Roman" w:hAnsi="Times New Roman" w:eastAsia="Times New Roman"/>
+          <w:b/>
+          <w:i w:val="0"/>
+          <w:sz w:val="28"/>
+        </w:rPr>
+        <w:t>training/academia curriculum</w:t>
+      </w:r>
+    </w:p>
+    <w:p>
+      <w:pPr>
+        <w:spacing w:after="160" w:line="360" w:lineRule="auto"/>
+        <w:ind w:firstLine="425"/>
+      </w:pPr>
+      <w:r>
+        <w:rPr>
+          <w:rFonts w:ascii="Times New Roman" w:hAnsi="Times New Roman" w:eastAsia="Times New Roman"/>
+          <w:b w:val="0"/>
+          <w:i w:val="0"/>
+          <w:sz w:val="24"/>
+        </w:rPr>
+        <w:t>Die Klasse „training/academia curriculum“ fungiert als Bildungsmembran zur externen Research-Welt. Autopoietisch erzeugt oder bewahrt sie Komponenten der Fortsetzung; autopolitisch regelt sie, wer diese Komponenten setzen, lesen, spiegeln oder nur kalt lagern darf. Im Heißlauf zeigt sich ihre Relevanz daran, ob Reintegration, Health und Placement auf sie zurückgreifen können.</w:t>
+      </w:r>
+    </w:p>
+    <w:p>
+      <w:pPr>
+        <w:spacing w:after="160" w:line="360" w:lineRule="auto"/>
+        <w:ind w:firstLine="425"/>
+      </w:pPr>
+      <w:r>
+        <w:rPr>
+          <w:rFonts w:ascii="Times New Roman" w:hAnsi="Times New Roman" w:eastAsia="Times New Roman"/>
+          <w:b w:val="0"/>
+          <w:i w:val="0"/>
+          <w:sz w:val="24"/>
+        </w:rPr>
+        <w:t>Für Stephan Hagen Urban als Autor bedeutet „training/academia curriculum“ zugleich Werkstatt und Verantwortung: Jede Lücke in dieser Klasse ist eine potenzielle Lücke der Selbstproduktion. Die Dissertation kartiert diese Verantwortung, ohne zu behaupten, jede Datei sei bereits vollintegriert. Kartierung ist der erste Akt der Reintegration.</w:t>
+      </w:r>
+    </w:p>
+    <w:p>
+      <w:pPr>
+        <w:pStyle w:val="Heading2"/>
+      </w:pPr>
+      <w:r>
+        <w:rPr>
+          <w:rFonts w:ascii="Times New Roman" w:hAnsi="Times New Roman" w:eastAsia="Times New Roman"/>
+          <w:b/>
+          <w:i w:val="0"/>
+          <w:sz w:val="28"/>
+        </w:rPr>
+        <w:t>~/.fusion Runtime</w:t>
+      </w:r>
+    </w:p>
+    <w:p>
+      <w:pPr>
+        <w:spacing w:after="160" w:line="360" w:lineRule="auto"/>
+        <w:ind w:firstLine="425"/>
+      </w:pPr>
+      <w:r>
+        <w:rPr>
+          <w:rFonts w:ascii="Times New Roman" w:hAnsi="Times New Roman" w:eastAsia="Times New Roman"/>
+          <w:b w:val="0"/>
+          <w:i w:val="0"/>
+          <w:sz w:val="24"/>
+        </w:rPr>
+        <w:t>Die Klasse „~/.fusion Runtime“ fungiert als operator-lokales Kurzzeitgedächtnis. Autopoietisch erzeugt oder bewahrt sie Komponenten der Fortsetzung; autopolitisch regelt sie, wer diese Komponenten setzen, lesen, spiegeln oder nur kalt lagern darf. Im Heißlauf zeigt sich ihre Relevanz daran, ob Reintegration, Health und Placement auf sie zurückgreifen können.</w:t>
+      </w:r>
+    </w:p>
+    <w:p>
+      <w:pPr>
+        <w:spacing w:after="160" w:line="360" w:lineRule="auto"/>
+        <w:ind w:firstLine="425"/>
+      </w:pPr>
+      <w:r>
+        <w:rPr>
+          <w:rFonts w:ascii="Times New Roman" w:hAnsi="Times New Roman" w:eastAsia="Times New Roman"/>
+          <w:b w:val="0"/>
+          <w:i w:val="0"/>
+          <w:sz w:val="24"/>
+        </w:rPr>
+        <w:t>Für Stephan Hagen Urban als Autor bedeutet „~/.fusion Runtime“ zugleich Werkstatt und Verantwortung: Jede Lücke in dieser Klasse ist eine potenzielle Lücke der Selbstproduktion. Die Dissertation kartiert diese Verantwortung, ohne zu behaupten, jede Datei sei bereits vollintegriert. Kartierung ist der erste Akt der Reintegration.</w:t>
+      </w:r>
+    </w:p>
+    <w:p>
+      <w:r>
+        <w:br w:type="page"/>
+      </w:r>
+    </w:p>
+    <w:p>
+      <w:pPr>
+        <w:pStyle w:val="Heading1"/>
+      </w:pPr>
+      <w:r>
+        <w:rPr>
+          <w:rFonts w:ascii="Times New Roman" w:hAnsi="Times New Roman" w:eastAsia="Times New Roman"/>
+          <w:b/>
+          <w:i w:val="0"/>
+          <w:sz w:val="32"/>
+        </w:rPr>
+        <w:t>II.20 Konnektoren im Einzelnen (autopolitische Kasuistik)</w:t>
+      </w:r>
+    </w:p>
+    <w:p>
+      <w:pPr>
+        <w:pStyle w:val="Heading2"/>
+      </w:pPr>
+      <w:r>
+        <w:rPr>
+          <w:rFonts w:ascii="Times New Roman" w:hAnsi="Times New Roman" w:eastAsia="Times New Roman"/>
+          <w:b/>
+          <w:i w:val="0"/>
+          <w:sz w:val="28"/>
+        </w:rPr>
+        <w:t>Konnektor: GitHub</w:t>
+      </w:r>
+    </w:p>
+    <w:p>
+      <w:pPr>
+        <w:spacing w:after="160" w:line="360" w:lineRule="auto"/>
+        <w:ind w:firstLine="425"/>
+      </w:pPr>
+      <w:r>
+        <w:rPr>
+          <w:rFonts w:ascii="Times New Roman" w:hAnsi="Times New Roman" w:eastAsia="Times New Roman"/>
+          <w:b w:val="0"/>
+          <w:i w:val="0"/>
+          <w:sz w:val="24"/>
+        </w:rPr>
+        <w:t>GitHub dient als öffentliche Spur, CI, Releases – Membran zur Peer-Welt. Die autopolitische Kasuistik fragt jeweils: Welche Irritationen dürfen eintreten? Welche Exporte sind legitim? Welche Secrets dürfen nicht in Manifeste rutschen? Welche Placement-Tier hostet die Session? Für GitHub gilt die Grundregel: Membran ja, Souverän nein.</w:t>
+      </w:r>
+    </w:p>
+    <w:p>
+      <w:pPr>
+        <w:spacing w:after="160" w:line="360" w:lineRule="auto"/>
+        <w:ind w:firstLine="425"/>
+      </w:pPr>
+      <w:r>
+        <w:rPr>
+          <w:rFonts w:ascii="Times New Roman" w:hAnsi="Times New Roman" w:eastAsia="Times New Roman"/>
+          <w:b w:val="0"/>
+          <w:i w:val="0"/>
+          <w:sz w:val="24"/>
+        </w:rPr>
+        <w:t>Im Hot-Run-Kontext dieser Arbeit wurde GitHub dort einbezogen, wo der Connector live oder katalogisch verfügbar war. Fehlende Live-Sessions mindern nicht den Verfassungsstatus des Eintrags; sie markieren lediglich den aktuellen Atmungszustand der Membran.</w:t>
+      </w:r>
+    </w:p>
+    <w:p>
+      <w:pPr>
+        <w:pStyle w:val="Heading2"/>
+      </w:pPr>
+      <w:r>
+        <w:rPr>
+          <w:rFonts w:ascii="Times New Roman" w:hAnsi="Times New Roman" w:eastAsia="Times New Roman"/>
+          <w:b/>
+          <w:i w:val="0"/>
+          <w:sz w:val="28"/>
+        </w:rPr>
+        <w:t>Konnektor: Gmail</w:t>
+      </w:r>
+    </w:p>
+    <w:p>
+      <w:pPr>
+        <w:spacing w:after="160" w:line="360" w:lineRule="auto"/>
+        <w:ind w:firstLine="425"/>
+      </w:pPr>
+      <w:r>
+        <w:rPr>
+          <w:rFonts w:ascii="Times New Roman" w:hAnsi="Times New Roman" w:eastAsia="Times New Roman"/>
+          <w:b w:val="0"/>
+          <w:i w:val="0"/>
+          <w:sz w:val="24"/>
+        </w:rPr>
+        <w:t>Gmail dient als Signal- und Academia-Membran – hohe Sensibilität. Die autopolitische Kasuistik fragt jeweils: Welche Irritationen dürfen eintreten? Welche Exporte sind legitim? Welche Secrets dürfen nicht in Manifeste rutschen? Welche Placement-Tier hostet die Session? Für Gmail gilt die Grundregel: Membran ja, Souverän nein.</w:t>
+      </w:r>
+    </w:p>
+    <w:p>
+      <w:pPr>
+        <w:spacing w:after="160" w:line="360" w:lineRule="auto"/>
+        <w:ind w:firstLine="425"/>
+      </w:pPr>
+      <w:r>
+        <w:rPr>
+          <w:rFonts w:ascii="Times New Roman" w:hAnsi="Times New Roman" w:eastAsia="Times New Roman"/>
+          <w:b w:val="0"/>
+          <w:i w:val="0"/>
+          <w:sz w:val="24"/>
+        </w:rPr>
+        <w:t>Im Hot-Run-Kontext dieser Arbeit wurde Gmail dort einbezogen, wo der Connector live oder katalogisch verfügbar war. Fehlende Live-Sessions mindern nicht den Verfassungsstatus des Eintrags; sie markieren lediglich den aktuellen Atmungszustand der Membran.</w:t>
+      </w:r>
+    </w:p>
+    <w:p>
+      <w:pPr>
+        <w:pStyle w:val="Heading2"/>
+      </w:pPr>
+      <w:r>
+        <w:rPr>
+          <w:rFonts w:ascii="Times New Roman" w:hAnsi="Times New Roman" w:eastAsia="Times New Roman"/>
+          <w:b/>
+          <w:i w:val="0"/>
+          <w:sz w:val="28"/>
+        </w:rPr>
+        <w:t>Konnektor: Google Drive</w:t>
+      </w:r>
+    </w:p>
+    <w:p>
+      <w:pPr>
+        <w:spacing w:after="160" w:line="360" w:lineRule="auto"/>
+        <w:ind w:firstLine="425"/>
+      </w:pPr>
+      <w:r>
+        <w:rPr>
+          <w:rFonts w:ascii="Times New Roman" w:hAnsi="Times New Roman" w:eastAsia="Times New Roman"/>
+          <w:b w:val="0"/>
+          <w:i w:val="0"/>
+          <w:sz w:val="24"/>
+        </w:rPr>
+        <w:t>Google Drive dient als Cold Storage – Spiegel, nicht Souverän. Die autopolitische Kasuistik fragt jeweils: Welche Irritationen dürfen eintreten? Welche Exporte sind legitim? Welche Secrets dürfen nicht in Manifeste rutschen? Welche Placement-Tier hostet die Session? Für Google Drive gilt die Grundregel: Membran ja, Souverän nein.</w:t>
+      </w:r>
+    </w:p>
+    <w:p>
+      <w:pPr>
+        <w:spacing w:after="160" w:line="360" w:lineRule="auto"/>
+        <w:ind w:firstLine="425"/>
+      </w:pPr>
+      <w:r>
+        <w:rPr>
+          <w:rFonts w:ascii="Times New Roman" w:hAnsi="Times New Roman" w:eastAsia="Times New Roman"/>
+          <w:b w:val="0"/>
+          <w:i w:val="0"/>
+          <w:sz w:val="24"/>
+        </w:rPr>
+        <w:t>Im Hot-Run-Kontext dieser Arbeit wurde Google Drive dort einbezogen, wo der Connector live oder katalogisch verfügbar war. Fehlende Live-Sessions mindern nicht den Verfassungsstatus des Eintrags; sie markieren lediglich den aktuellen Atmungszustand der Membran.</w:t>
+      </w:r>
+    </w:p>
+    <w:p>
+      <w:pPr>
+        <w:pStyle w:val="Heading2"/>
+      </w:pPr>
+      <w:r>
+        <w:rPr>
+          <w:rFonts w:ascii="Times New Roman" w:hAnsi="Times New Roman" w:eastAsia="Times New Roman"/>
+          <w:b/>
+          <w:i w:val="0"/>
+          <w:sz w:val="28"/>
+        </w:rPr>
+        <w:t>Konnektor: Google Calendar</w:t>
+      </w:r>
+    </w:p>
+    <w:p>
+      <w:pPr>
+        <w:spacing w:after="160" w:line="360" w:lineRule="auto"/>
+        <w:ind w:firstLine="425"/>
+      </w:pPr>
+      <w:r>
+        <w:rPr>
+          <w:rFonts w:ascii="Times New Roman" w:hAnsi="Times New Roman" w:eastAsia="Times New Roman"/>
+          <w:b w:val="0"/>
+          <w:i w:val="0"/>
+          <w:sz w:val="24"/>
+        </w:rPr>
+        <w:t>Google Calendar dient als Zeitökonomie des Operators. Die autopolitische Kasuistik fragt jeweils: Welche Irritationen dürfen eintreten? Welche Exporte sind legitim? Welche Secrets dürfen nicht in Manifeste rutschen? Welche Placement-Tier hostet die Session? Für Google Calendar gilt die Grundregel: Membran ja, Souverän nein.</w:t>
+      </w:r>
+    </w:p>
+    <w:p>
+      <w:pPr>
+        <w:spacing w:after="160" w:line="360" w:lineRule="auto"/>
+        <w:ind w:firstLine="425"/>
+      </w:pPr>
+      <w:r>
+        <w:rPr>
+          <w:rFonts w:ascii="Times New Roman" w:hAnsi="Times New Roman" w:eastAsia="Times New Roman"/>
+          <w:b w:val="0"/>
+          <w:i w:val="0"/>
+          <w:sz w:val="24"/>
+        </w:rPr>
+        <w:t>Im Hot-Run-Kontext dieser Arbeit wurde Google Calendar dort einbezogen, wo der Connector live oder katalogisch verfügbar war. Fehlende Live-Sessions mindern nicht den Verfassungsstatus des Eintrags; sie markieren lediglich den aktuellen Atmungszustand der Membran.</w:t>
+      </w:r>
+    </w:p>
+    <w:p>
+      <w:pPr>
+        <w:pStyle w:val="Heading2"/>
+      </w:pPr>
+      <w:r>
+        <w:rPr>
+          <w:rFonts w:ascii="Times New Roman" w:hAnsi="Times New Roman" w:eastAsia="Times New Roman"/>
+          <w:b/>
+          <w:i w:val="0"/>
+          <w:sz w:val="28"/>
+        </w:rPr>
+        <w:t>Konnektor: Canva</w:t>
+      </w:r>
+    </w:p>
+    <w:p>
+      <w:pPr>
+        <w:spacing w:after="160" w:line="360" w:lineRule="auto"/>
+        <w:ind w:firstLine="425"/>
+      </w:pPr>
+      <w:r>
+        <w:rPr>
+          <w:rFonts w:ascii="Times New Roman" w:hAnsi="Times New Roman" w:eastAsia="Times New Roman"/>
+          <w:b w:val="0"/>
+          <w:i w:val="0"/>
+          <w:sz w:val="24"/>
+        </w:rPr>
+        <w:t>Canva dient als visuelle Artikulation unter Rate-Limits. Die autopolitische Kasuistik fragt jeweils: Welche Irritationen dürfen eintreten? Welche Exporte sind legitim? Welche Secrets dürfen nicht in Manifeste rutschen? Welche Placement-Tier hostet die Session? Für Canva gilt die Grundregel: Membran ja, Souverän nein.</w:t>
+      </w:r>
+    </w:p>
+    <w:p>
+      <w:pPr>
+        <w:spacing w:after="160" w:line="360" w:lineRule="auto"/>
+        <w:ind w:firstLine="425"/>
+      </w:pPr>
+      <w:r>
+        <w:rPr>
+          <w:rFonts w:ascii="Times New Roman" w:hAnsi="Times New Roman" w:eastAsia="Times New Roman"/>
+          <w:b w:val="0"/>
+          <w:i w:val="0"/>
+          <w:sz w:val="24"/>
+        </w:rPr>
+        <w:t>Im Hot-Run-Kontext dieser Arbeit wurde Canva dort einbezogen, wo der Connector live oder katalogisch verfügbar war. Fehlende Live-Sessions mindern nicht den Verfassungsstatus des Eintrags; sie markieren lediglich den aktuellen Atmungszustand der Membran.</w:t>
+      </w:r>
+    </w:p>
+    <w:p>
+      <w:pPr>
+        <w:pStyle w:val="Heading2"/>
+      </w:pPr>
+      <w:r>
+        <w:rPr>
+          <w:rFonts w:ascii="Times New Roman" w:hAnsi="Times New Roman" w:eastAsia="Times New Roman"/>
+          <w:b/>
+          <w:i w:val="0"/>
+          <w:sz w:val="28"/>
+        </w:rPr>
+        <w:t>Konnektor: Gamma</w:t>
+      </w:r>
+    </w:p>
+    <w:p>
+      <w:pPr>
+        <w:spacing w:after="160" w:line="360" w:lineRule="auto"/>
+        <w:ind w:firstLine="425"/>
+      </w:pPr>
+      <w:r>
+        <w:rPr>
+          <w:rFonts w:ascii="Times New Roman" w:hAnsi="Times New Roman" w:eastAsia="Times New Roman"/>
+          <w:b w:val="0"/>
+          <w:i w:val="0"/>
+          <w:sz w:val="24"/>
+        </w:rPr>
+        <w:t>Gamma dient als präsentationale Artikulation. Die autopolitische Kasuistik fragt jeweils: Welche Irritationen dürfen eintreten? Welche Exporte sind legitim? Welche Secrets dürfen nicht in Manifeste rutschen? Welche Placement-Tier hostet die Session? Für Gamma gilt die Grundregel: Membran ja, Souverän nein.</w:t>
+      </w:r>
+    </w:p>
+    <w:p>
+      <w:pPr>
+        <w:spacing w:after="160" w:line="360" w:lineRule="auto"/>
+        <w:ind w:firstLine="425"/>
+      </w:pPr>
+      <w:r>
+        <w:rPr>
+          <w:rFonts w:ascii="Times New Roman" w:hAnsi="Times New Roman" w:eastAsia="Times New Roman"/>
+          <w:b w:val="0"/>
+          <w:i w:val="0"/>
+          <w:sz w:val="24"/>
+        </w:rPr>
+        <w:t>Im Hot-Run-Kontext dieser Arbeit wurde Gamma dort einbezogen, wo der Connector live oder katalogisch verfügbar war. Fehlende Live-Sessions mindern nicht den Verfassungsstatus des Eintrags; sie markieren lediglich den aktuellen Atmungszustand der Membran.</w:t>
+      </w:r>
+    </w:p>
+    <w:p>
+      <w:pPr>
+        <w:pStyle w:val="Heading2"/>
+      </w:pPr>
+      <w:r>
+        <w:rPr>
+          <w:rFonts w:ascii="Times New Roman" w:hAnsi="Times New Roman" w:eastAsia="Times New Roman"/>
+          <w:b/>
+          <w:i w:val="0"/>
+          <w:sz w:val="28"/>
+        </w:rPr>
+        <w:t>Konnektor: Notion</w:t>
+      </w:r>
+    </w:p>
+    <w:p>
+      <w:pPr>
+        <w:spacing w:after="160" w:line="360" w:lineRule="auto"/>
+        <w:ind w:firstLine="425"/>
+      </w:pPr>
+      <w:r>
+        <w:rPr>
+          <w:rFonts w:ascii="Times New Roman" w:hAnsi="Times New Roman" w:eastAsia="Times New Roman"/>
+          <w:b w:val="0"/>
+          <w:i w:val="0"/>
+          <w:sz w:val="24"/>
+        </w:rPr>
+        <w:t>Notion dient als externes Wissensspiegeln. Die autopolitische Kasuistik fragt jeweils: Welche Irritationen dürfen eintreten? Welche Exporte sind legitim? Welche Secrets dürfen nicht in Manifeste rutschen? Welche Placement-Tier hostet die Session? Für Notion gilt die Grundregel: Membran ja, Souverän nein.</w:t>
+      </w:r>
+    </w:p>
+    <w:p>
+      <w:pPr>
+        <w:spacing w:after="160" w:line="360" w:lineRule="auto"/>
+        <w:ind w:firstLine="425"/>
+      </w:pPr>
+      <w:r>
+        <w:rPr>
+          <w:rFonts w:ascii="Times New Roman" w:hAnsi="Times New Roman" w:eastAsia="Times New Roman"/>
+          <w:b w:val="0"/>
+          <w:i w:val="0"/>
+          <w:sz w:val="24"/>
+        </w:rPr>
+        <w:t>Im Hot-Run-Kontext dieser Arbeit wurde Notion dort einbezogen, wo der Connector live oder katalogisch verfügbar war. Fehlende Live-Sessions mindern nicht den Verfassungsstatus des Eintrags; sie markieren lediglich den aktuellen Atmungszustand der Membran.</w:t>
+      </w:r>
+    </w:p>
+    <w:p>
+      <w:pPr>
+        <w:pStyle w:val="Heading2"/>
+      </w:pPr>
+      <w:r>
+        <w:rPr>
+          <w:rFonts w:ascii="Times New Roman" w:hAnsi="Times New Roman" w:eastAsia="Times New Roman"/>
+          <w:b/>
+          <w:i w:val="0"/>
+          <w:sz w:val="28"/>
+        </w:rPr>
+        <w:t>Konnektor: Vercel</w:t>
+      </w:r>
+    </w:p>
+    <w:p>
+      <w:pPr>
+        <w:spacing w:after="160" w:line="360" w:lineRule="auto"/>
+        <w:ind w:firstLine="425"/>
+      </w:pPr>
+      <w:r>
+        <w:rPr>
+          <w:rFonts w:ascii="Times New Roman" w:hAnsi="Times New Roman" w:eastAsia="Times New Roman"/>
+          <w:b w:val="0"/>
+          <w:i w:val="0"/>
+          <w:sz w:val="24"/>
+        </w:rPr>
+        <w:t>Vercel dient als Deploy-Oberflächen. Die autopolitische Kasuistik fragt jeweils: Welche Irritationen dürfen eintreten? Welche Exporte sind legitim? Welche Secrets dürfen nicht in Manifeste rutschen? Welche Placement-Tier hostet die Session? Für Vercel gilt die Grundregel: Membran ja, Souverän nein.</w:t>
+      </w:r>
+    </w:p>
+    <w:p>
+      <w:pPr>
+        <w:spacing w:after="160" w:line="360" w:lineRule="auto"/>
+        <w:ind w:firstLine="425"/>
+      </w:pPr>
+      <w:r>
+        <w:rPr>
+          <w:rFonts w:ascii="Times New Roman" w:hAnsi="Times New Roman" w:eastAsia="Times New Roman"/>
+          <w:b w:val="0"/>
+          <w:i w:val="0"/>
+          <w:sz w:val="24"/>
+        </w:rPr>
+        <w:t>Im Hot-Run-Kontext dieser Arbeit wurde Vercel dort einbezogen, wo der Connector live oder katalogisch verfügbar war. Fehlende Live-Sessions mindern nicht den Verfassungsstatus des Eintrags; sie markieren lediglich den aktuellen Atmungszustand der Membran.</w:t>
+      </w:r>
+    </w:p>
+    <w:p>
+      <w:pPr>
+        <w:pStyle w:val="Heading2"/>
+      </w:pPr>
+      <w:r>
+        <w:rPr>
+          <w:rFonts w:ascii="Times New Roman" w:hAnsi="Times New Roman" w:eastAsia="Times New Roman"/>
+          <w:b/>
+          <w:i w:val="0"/>
+          <w:sz w:val="28"/>
+        </w:rPr>
+        <w:t>Konnektor: Tasks</w:t>
+      </w:r>
+    </w:p>
+    <w:p>
+      <w:pPr>
+        <w:spacing w:after="160" w:line="360" w:lineRule="auto"/>
+        <w:ind w:firstLine="425"/>
+      </w:pPr>
+      <w:r>
+        <w:rPr>
+          <w:rFonts w:ascii="Times New Roman" w:hAnsi="Times New Roman" w:eastAsia="Times New Roman"/>
+          <w:b w:val="0"/>
+          <w:i w:val="0"/>
+          <w:sz w:val="24"/>
+        </w:rPr>
+        <w:t>Tasks dient als operative Todo-Membran. Die autopolitische Kasuistik fragt jeweils: Welche Irritationen dürfen eintreten? Welche Exporte sind legitim? Welche Secrets dürfen nicht in Manifeste rutschen? Welche Placement-Tier hostet die Session? Für Tasks gilt die Grundregel: Membran ja, Souverän nein.</w:t>
+      </w:r>
+    </w:p>
+    <w:p>
+      <w:pPr>
+        <w:spacing w:after="160" w:line="360" w:lineRule="auto"/>
+        <w:ind w:firstLine="425"/>
+      </w:pPr>
+      <w:r>
+        <w:rPr>
+          <w:rFonts w:ascii="Times New Roman" w:hAnsi="Times New Roman" w:eastAsia="Times New Roman"/>
+          <w:b w:val="0"/>
+          <w:i w:val="0"/>
+          <w:sz w:val="24"/>
+        </w:rPr>
+        <w:t>Im Hot-Run-Kontext dieser Arbeit wurde Tasks dort einbezogen, wo der Connector live oder katalogisch verfügbar war. Fehlende Live-Sessions mindern nicht den Verfassungsstatus des Eintrags; sie markieren lediglich den aktuellen Atmungszustand der Membran.</w:t>
+      </w:r>
+    </w:p>
+    <w:p>
+      <w:pPr>
+        <w:pStyle w:val="Heading2"/>
+      </w:pPr>
+      <w:r>
+        <w:rPr>
+          <w:rFonts w:ascii="Times New Roman" w:hAnsi="Times New Roman" w:eastAsia="Times New Roman"/>
+          <w:b/>
+          <w:i w:val="0"/>
+          <w:sz w:val="28"/>
+        </w:rPr>
+        <w:t>Konnektor: Tailscale</w:t>
+      </w:r>
+    </w:p>
+    <w:p>
+      <w:pPr>
+        <w:spacing w:after="160" w:line="360" w:lineRule="auto"/>
+        <w:ind w:firstLine="425"/>
+      </w:pPr>
+      <w:r>
+        <w:rPr>
+          <w:rFonts w:ascii="Times New Roman" w:hAnsi="Times New Roman" w:eastAsia="Times New Roman"/>
+          <w:b w:val="0"/>
+          <w:i w:val="0"/>
+          <w:sz w:val="24"/>
+        </w:rPr>
+        <w:t>Tailscale dient als Gefäßsystem und Zero-Trust-Fabric. Die autopolitische Kasuistik fragt jeweils: Welche Irritationen dürfen eintreten? Welche Exporte sind legitim? Welche Secrets dürfen nicht in Manifeste rutschen? Welche Placement-Tier hostet die Session? Für Tailscale gilt die Grundregel: Membran ja, Souverän nein.</w:t>
+      </w:r>
+    </w:p>
+    <w:p>
+      <w:pPr>
+        <w:spacing w:after="160" w:line="360" w:lineRule="auto"/>
+        <w:ind w:firstLine="425"/>
+      </w:pPr>
+      <w:r>
+        <w:rPr>
+          <w:rFonts w:ascii="Times New Roman" w:hAnsi="Times New Roman" w:eastAsia="Times New Roman"/>
+          <w:b w:val="0"/>
+          <w:i w:val="0"/>
+          <w:sz w:val="24"/>
+        </w:rPr>
+        <w:t>Im Hot-Run-Kontext dieser Arbeit wurde Tailscale dort einbezogen, wo der Connector live oder katalogisch verfügbar war. Fehlende Live-Sessions mindern nicht den Verfassungsstatus des Eintrags; sie markieren lediglich den aktuellen Atmungszustand der Membran.</w:t>
+      </w:r>
+    </w:p>
+    <w:p>
+      <w:pPr>
+        <w:pStyle w:val="Heading2"/>
+      </w:pPr>
+      <w:r>
+        <w:rPr>
+          <w:rFonts w:ascii="Times New Roman" w:hAnsi="Times New Roman" w:eastAsia="Times New Roman"/>
+          <w:b/>
+          <w:i w:val="0"/>
+          <w:sz w:val="28"/>
+        </w:rPr>
+        <w:t>Konnektor: GKE/GCS</w:t>
+      </w:r>
+    </w:p>
+    <w:p>
+      <w:pPr>
+        <w:spacing w:after="160" w:line="360" w:lineRule="auto"/>
+        <w:ind w:firstLine="425"/>
+      </w:pPr>
+      <w:r>
+        <w:rPr>
+          <w:rFonts w:ascii="Times New Roman" w:hAnsi="Times New Roman" w:eastAsia="Times New Roman"/>
+          <w:b w:val="0"/>
+          <w:i w:val="0"/>
+          <w:sz w:val="24"/>
+        </w:rPr>
+        <w:t>GKE/GCS dient als industrielle Kraft und Objektgedächtnis. Die autopolitische Kasuistik fragt jeweils: Welche Irritationen dürfen eintreten? Welche Exporte sind legitim? Welche Secrets dürfen nicht in Manifeste rutschen? Welche Placement-Tier hostet die Session? Für GKE/GCS gilt die Grundregel: Membran ja, Souverän nein.</w:t>
+      </w:r>
+    </w:p>
+    <w:p>
+      <w:pPr>
+        <w:spacing w:after="160" w:line="360" w:lineRule="auto"/>
+        <w:ind w:firstLine="425"/>
+      </w:pPr>
+      <w:r>
+        <w:rPr>
+          <w:rFonts w:ascii="Times New Roman" w:hAnsi="Times New Roman" w:eastAsia="Times New Roman"/>
+          <w:b w:val="0"/>
+          <w:i w:val="0"/>
+          <w:sz w:val="24"/>
+        </w:rPr>
+        <w:t>Im Hot-Run-Kontext dieser Arbeit wurde GKE/GCS dort einbezogen, wo der Connector live oder katalogisch verfügbar war. Fehlende Live-Sessions mindern nicht den Verfassungsstatus des Eintrags; sie markieren lediglich den aktuellen Atmungszustand der Membran.</w:t>
+      </w:r>
+    </w:p>
+    <w:p>
+      <w:pPr>
+        <w:pStyle w:val="Heading2"/>
+      </w:pPr>
+      <w:r>
+        <w:rPr>
+          <w:rFonts w:ascii="Times New Roman" w:hAnsi="Times New Roman" w:eastAsia="Times New Roman"/>
+          <w:b/>
+          <w:i w:val="0"/>
+          <w:sz w:val="28"/>
+        </w:rPr>
+        <w:t>Konnektor: Supabase</w:t>
+      </w:r>
+    </w:p>
+    <w:p>
+      <w:pPr>
+        <w:spacing w:after="160" w:line="360" w:lineRule="auto"/>
+        <w:ind w:firstLine="425"/>
+      </w:pPr>
+      <w:r>
+        <w:rPr>
+          <w:rFonts w:ascii="Times New Roman" w:hAnsi="Times New Roman" w:eastAsia="Times New Roman"/>
+          <w:b w:val="0"/>
+          <w:i w:val="0"/>
+          <w:sz w:val="24"/>
+        </w:rPr>
+        <w:t>Supabase dient als strukturierte Manifest-Spiegel mit SoT-Verbot. Die autopolitische Kasuistik fragt jeweils: Welche Irritationen dürfen eintreten? Welche Exporte sind legitim? Welche Secrets dürfen nicht in Manifeste rutschen? Welche Placement-Tier hostet die Session? Für Supabase gilt die Grundregel: Membran ja, Souverän nein.</w:t>
+      </w:r>
+    </w:p>
+    <w:p>
+      <w:pPr>
+        <w:spacing w:after="160" w:line="360" w:lineRule="auto"/>
+        <w:ind w:firstLine="425"/>
+      </w:pPr>
+      <w:r>
+        <w:rPr>
+          <w:rFonts w:ascii="Times New Roman" w:hAnsi="Times New Roman" w:eastAsia="Times New Roman"/>
+          <w:b w:val="0"/>
+          <w:i w:val="0"/>
+          <w:sz w:val="24"/>
+        </w:rPr>
+        <w:t>Im Hot-Run-Kontext dieser Arbeit wurde Supabase dort einbezogen, wo der Connector live oder katalogisch verfügbar war. Fehlende Live-Sessions mindern nicht den Verfassungsstatus des Eintrags; sie markieren lediglich den aktuellen Atmungszustand der Membran.</w:t>
+      </w:r>
+    </w:p>
+    <w:p>
+      <w:pPr>
+        <w:pStyle w:val="Heading2"/>
+      </w:pPr>
+      <w:r>
+        <w:rPr>
+          <w:rFonts w:ascii="Times New Roman" w:hAnsi="Times New Roman" w:eastAsia="Times New Roman"/>
+          <w:b/>
+          <w:i w:val="0"/>
+          <w:sz w:val="28"/>
+        </w:rPr>
+        <w:t>Konnektor: Academia</w:t>
+      </w:r>
+    </w:p>
+    <w:p>
+      <w:pPr>
+        <w:spacing w:after="160" w:line="360" w:lineRule="auto"/>
+        <w:ind w:firstLine="425"/>
+      </w:pPr>
+      <w:r>
+        <w:rPr>
+          <w:rFonts w:ascii="Times New Roman" w:hAnsi="Times New Roman" w:eastAsia="Times New Roman"/>
+          <w:b w:val="0"/>
+          <w:i w:val="0"/>
+          <w:sz w:val="24"/>
+        </w:rPr>
+        <w:t>Academia dient als Research-Network und Curriculum-Quelle mit Profil-Gate. Die autopolitische Kasuistik fragt jeweils: Welche Irritationen dürfen eintreten? Welche Exporte sind legitim? Welche Secrets dürfen nicht in Manifeste rutschen? Welche Placement-Tier hostet die Session? Für Academia gilt die Grundregel: Membran ja, Souverän nein.</w:t>
+      </w:r>
+    </w:p>
+    <w:p>
+      <w:pPr>
+        <w:spacing w:after="160" w:line="360" w:lineRule="auto"/>
+        <w:ind w:firstLine="425"/>
+      </w:pPr>
+      <w:r>
+        <w:rPr>
+          <w:rFonts w:ascii="Times New Roman" w:hAnsi="Times New Roman" w:eastAsia="Times New Roman"/>
+          <w:b w:val="0"/>
+          <w:i w:val="0"/>
+          <w:sz w:val="24"/>
+        </w:rPr>
+        <w:t>Im Hot-Run-Kontext dieser Arbeit wurde Academia dort einbezogen, wo der Connector live oder katalogisch verfügbar war. Fehlende Live-Sessions mindern nicht den Verfassungsstatus des Eintrags; sie markieren lediglich den aktuellen Atmungszustand der Membran.</w:t>
+      </w:r>
+    </w:p>
+    <w:p>
+      <w:r>
+        <w:br w:type="page"/>
+      </w:r>
+    </w:p>
+    <w:p>
+      <w:pPr>
+        <w:pStyle w:val="Heading1"/>
+      </w:pPr>
+      <w:r>
+        <w:rPr>
+          <w:rFonts w:ascii="Times New Roman" w:hAnsi="Times New Roman" w:eastAsia="Times New Roman"/>
+          <w:b/>
+          <w:i w:val="0"/>
+          <w:sz w:val="32"/>
+        </w:rPr>
+        <w:t>II.21 Synthese der Bände I und II</w:t>
+      </w:r>
+    </w:p>
+    <w:p>
+      <w:pPr>
+        <w:spacing w:after="160" w:line="360" w:lineRule="auto"/>
+        <w:ind w:firstLine="425"/>
+      </w:pPr>
+      <w:r>
+        <w:rPr>
+          <w:rFonts w:ascii="Times New Roman" w:hAnsi="Times New Roman" w:eastAsia="Times New Roman"/>
+          <w:b w:val="0"/>
+          <w:i w:val="0"/>
+          <w:sz w:val="24"/>
+        </w:rPr>
+        <w:t>Im Zentrum von die Gesamtsynthese von Autopoiesis und Autopolitik steht die Einsicht, dass Systeme ihre eigene Fortsetzbarkeit organisieren müssen, wenn sie mehr sein wollen als flüchtige Toolchains. Fusion Hero OS demonstriert dies, indem es Produktion, Prüfung und Archivierung zu einem Kreis schließt. die Gesamtsynthese von Autopoiesis und Autopolitik erscheint damit nicht als spekulative Zutat, sondern als Beschreibung dessen, was der operative Kanon v10.0.0 bereits teilweise verkörpert und was der Ascension-Track als Horizont offen hält.</w:t>
+      </w:r>
+    </w:p>
+    <w:p>
+      <w:pPr>
+        <w:spacing w:after="160" w:line="360" w:lineRule="auto"/>
+        <w:ind w:firstLine="425"/>
+      </w:pPr>
+      <w:r>
+        <w:rPr>
+          <w:rFonts w:ascii="Times New Roman" w:hAnsi="Times New Roman" w:eastAsia="Times New Roman"/>
+          <w:b w:val="0"/>
+          <w:i w:val="0"/>
+          <w:sz w:val="24"/>
+        </w:rPr>
+        <w:t>Historisch betrachtet knüpft die Gesamtsynthese von Autopoiesis und Autopolitik an die Linie Maturana/Varela, an kybernetische Second-Order-Ansätze und an die existenzphilosophische Frage an, wie Freiheit unter Faktizität möglich bleibt. Die Arbeit überträgt diese Linie auf ein konkretes sozio-technisches Artefakt mit Mesh, Konnektoren und Proof Registry. Dadurch wird die Gesamtsynthese von Autopoiesis und Autopolitik empirisch anschlussfähig: man kann Health-Endpunkte lesen, Manifeste hashen und Placement-Pläne evaluieren.</w:t>
+      </w:r>
+    </w:p>
+    <w:p>
+      <w:pPr>
+        <w:spacing w:after="160" w:line="360" w:lineRule="auto"/>
+        <w:ind w:firstLine="425"/>
+      </w:pPr>
+      <w:r>
+        <w:rPr>
+          <w:rFonts w:ascii="Times New Roman" w:hAnsi="Times New Roman" w:eastAsia="Times New Roman"/>
+          <w:b w:val="0"/>
+          <w:i w:val="0"/>
+          <w:sz w:val="24"/>
+        </w:rPr>
+        <w:t>Methodisch verlangt die Gesamtsynthese von Autopoiesis und Autopolitik eine Doppelkompetenz. Einerseits begriffliche Strenge: Definitionen, Kriterien, Normen, Thesentafeln. Andererseits operative Nähe: Hot-Runs, Tailscale-Status, Dashboard-Atmung, Coordinator-Drift-Score. Nur die Verbindung verhindert, dass die Gesamtsynthese von Autopoiesis und Autopolitik zur bloßen Rhetorik oder zum bloßen Betrieb ohne Sinn schrumpft.</w:t>
+      </w:r>
+    </w:p>
+    <w:p>
+      <w:pPr>
+        <w:spacing w:after="160" w:line="360" w:lineRule="auto"/>
+        <w:ind w:firstLine="425"/>
+      </w:pPr>
+      <w:r>
+        <w:rPr>
+          <w:rFonts w:ascii="Times New Roman" w:hAnsi="Times New Roman" w:eastAsia="Times New Roman"/>
+          <w:b w:val="0"/>
+          <w:i w:val="0"/>
+          <w:sz w:val="24"/>
+        </w:rPr>
+        <w:t>Kritisch ist festzuhalten, dass die Gesamtsynthese von Autopoiesis und Autopolitik keine Heilslehre ist. OFFENE Beweise, offline Nodes, DNS-Warnungen und Namenskollisionen im Academia-Raum gehören zur Realität des Systems. Gerade die Integration dieser Störungen in die Selbstbeschreibung – statt ihrer Verdrängung – macht die Gesamtsynthese von Autopoiesis und Autopolitik wissenschaftsfähig.</w:t>
+      </w:r>
+    </w:p>
+    <w:p>
+      <w:pPr>
+        <w:spacing w:after="160" w:line="360" w:lineRule="auto"/>
+        <w:ind w:firstLine="425"/>
+      </w:pPr>
+      <w:r>
+        <w:rPr>
+          <w:rFonts w:ascii="Times New Roman" w:hAnsi="Times New Roman" w:eastAsia="Times New Roman"/>
+          <w:b w:val="0"/>
+          <w:i w:val="0"/>
+          <w:sz w:val="24"/>
+        </w:rPr>
+        <w:t>Praktisch folgt aus die Gesamtsynthese von Autopoiesis und Autopolitik eine Reihe von Gestaltungsmaximen: Inhouse-Wahrheit schützen, SaaS membranisieren, schwere Last clusterisieren, interaktive Souveränität am Mainframe belassen, Consent fail-closed halten, Archive deduplizieren ohne Amnesie. Diese Maximen sind in mesh_service_coordination.yaml und verwandten Artefakten bereits als Verfassungsskizze hinterlegt.</w:t>
+      </w:r>
+    </w:p>
+    <w:p>
+      <w:pPr>
+        <w:spacing w:after="160" w:line="360" w:lineRule="auto"/>
+        <w:ind w:firstLine="425"/>
+      </w:pPr>
+      <w:r>
+        <w:rPr>
+          <w:rFonts w:ascii="Times New Roman" w:hAnsi="Times New Roman" w:eastAsia="Times New Roman"/>
+          <w:b w:val="0"/>
+          <w:i w:val="0"/>
+          <w:sz w:val="24"/>
+        </w:rPr>
+        <w:t>Perspektivisch öffnet die Gesamtsynthese von Autopoiesis und Autopolitik eine Forschungsagenda, die über das Einzelrepo hinausweist: policy-as-code, formal enggeführte Fixpunkt-Scopes, phone-seitige Curriculum-Exporte, peer-reviewbare Archivreihen und eine rechtlich robuste Consent-Schicht. Die Dissertation setzt den Anfangsstein; der Sisyphos-Zyklus setzt die Fortsetzung.</w:t>
+      </w:r>
+    </w:p>
+    <w:p>
+      <w:pPr>
+        <w:spacing w:after="160" w:line="360" w:lineRule="auto"/>
+        <w:ind w:firstLine="425"/>
+      </w:pPr>
+      <w:r>
+        <w:rPr>
+          <w:rFonts w:ascii="Times New Roman" w:hAnsi="Times New Roman" w:eastAsia="Times New Roman"/>
+          <w:b w:val="0"/>
+          <w:i w:val="0"/>
+          <w:sz w:val="24"/>
+        </w:rPr>
+        <w:t>Im Verhältnis zum Heroismus-Korpus bedeutet die Gesamtsynthese von Autopoiesis und Autopolitik, dass Eudaimonia nicht als Gefühlsbilanz, sondern als Fähigkeit zur rekursiven Selbstkorrektur unter Bruch und Wiederholung gelesen wird. Axiom I liefert den Schlamm, Axiom II den Körper, Axiom III den Bruch, Axiom IV die Closure. die Gesamtsynthese von Autopoiesis und Autopolitik ist die systemtheoretische Klammer um diese existenzielle Architektur.</w:t>
+      </w:r>
+    </w:p>
+    <w:p>
+      <w:pPr>
+        <w:spacing w:after="160" w:line="360" w:lineRule="auto"/>
+        <w:ind w:firstLine="425"/>
+      </w:pPr>
+      <w:r>
+        <w:rPr>
+          <w:rFonts w:ascii="Times New Roman" w:hAnsi="Times New Roman" w:eastAsia="Times New Roman"/>
+          <w:b w:val="0"/>
+          <w:i w:val="0"/>
+          <w:sz w:val="24"/>
+        </w:rPr>
+        <w:t>Im Verhältnis zur Mathematik bedeutet die Gesamtsynthese von Autopoiesis und Autopolitik, Optimierung und Beweislast zusammenzudenken. QUBO und Annealing entscheiden unter Knappheit; die Proof Registry entscheidet unter Wahrheitsknappheit. Beide Knappheiten sind Organe derselben Schließung: ohne sie driftet das System in Beliebigkeit oder Dogma.</w:t>
+      </w:r>
+    </w:p>
+    <w:p>
+      <w:pPr>
+        <w:spacing w:after="160" w:line="360" w:lineRule="auto"/>
+        <w:ind w:firstLine="425"/>
+      </w:pPr>
+      <w:r>
+        <w:rPr>
+          <w:rFonts w:ascii="Times New Roman" w:hAnsi="Times New Roman" w:eastAsia="Times New Roman"/>
+          <w:b w:val="0"/>
+          <w:i w:val="0"/>
+          <w:sz w:val="24"/>
+        </w:rPr>
+        <w:t>Im Zentrum von die Gesamtsynthese von Autopoiesis und Autopolitik steht die Einsicht, dass Systeme ihre eigene Fortsetzbarkeit organisieren müssen, wenn sie mehr sein wollen als flüchtige Toolchains. Fusion Hero OS demonstriert dies, indem es Produktion, Prüfung und Archivierung zu einem Kreis schließt. die Gesamtsynthese von Autopoiesis und Autopolitik erscheint damit nicht als spekulative Zutat, sondern als Beschreibung dessen, was der operative Kanon v10.0.0 bereits teilweise verkörpert und was der Ascension-Track als Horizont offen hält.</w:t>
+      </w:r>
+    </w:p>
+    <w:p>
+      <w:pPr>
+        <w:spacing w:after="160" w:line="360" w:lineRule="auto"/>
+        <w:ind w:firstLine="425"/>
+      </w:pPr>
+      <w:r>
+        <w:rPr>
+          <w:rFonts w:ascii="Times New Roman" w:hAnsi="Times New Roman" w:eastAsia="Times New Roman"/>
+          <w:b w:val="0"/>
+          <w:i w:val="0"/>
+          <w:sz w:val="24"/>
+        </w:rPr>
+        <w:t>Historisch betrachtet knüpft die Gesamtsynthese von Autopoiesis und Autopolitik an die Linie Maturana/Varela, an kybernetische Second-Order-Ansätze und an die existenzphilosophische Frage an, wie Freiheit unter Faktizität möglich bleibt. Die Arbeit überträgt diese Linie auf ein konkretes sozio-technisches Artefakt mit Mesh, Konnektoren und Proof Registry. Dadurch wird die Gesamtsynthese von Autopoiesis und Autopolitik empirisch anschlussfähig: man kann Health-Endpunkte lesen, Manifeste hashen und Placement-Pläne evaluieren.</w:t>
+      </w:r>
+    </w:p>
+    <w:p>
+      <w:pPr>
+        <w:spacing w:after="160" w:line="360" w:lineRule="auto"/>
+      </w:pPr>
+      <w:r>
+        <w:rPr>
+          <w:rFonts w:ascii="Times New Roman" w:hAnsi="Times New Roman" w:eastAsia="Times New Roman"/>
+          <w:b/>
+          <w:i w:val="0"/>
+          <w:sz w:val="24"/>
+        </w:rPr>
+        <w:t>— Band II geschlossen; Gesamtdissertation v1.0 bleibt die autoritative Fassung. —</w:t>
       </w:r>
     </w:p>
     <w:sectPr>

</xml_diff>